<commit_message>
feat: add hierarchical mineral recognition study
</commit_message>
<xml_diff>
--- a/结题/基于深度学习的钒钛矿相关矿物图像识别方法研究_技术报告（初稿）.docx
+++ b/结题/基于深度学习的钒钛矿相关矿物图像识别方法研究_技术报告（初稿）.docx
@@ -330,7 +330,7 @@
           <w:b w:val="0"/>
           <w:sz w:val="24"/>
         </w:rPr>
-        <w:t>在 8,529 张图像上，采用 ImageNet 预训练的 ResNet50 和 EfficientNet-B0 进行三随机种子重复训练。实验表明，EfficientNet-B0 的平均 Macro F1 为 72.87%±1.21%，ResNet50 为 72.06%±0.92%。脉石/废石类别最易识别，金属光泽干扰和含钛干扰是主要难点。三随机种子 Focal Loss 消融的平均 Macro F1 为 73.22%±0.83%，但其目标代理 F1 与金属光泽干扰误入目标指标未同时改善。进一步提出角色感知困难负样本学习：其平均 Macro F1 为 73.02%±1.09%，可降低含钛干扰和金属光泽干扰误入目标的比例，但伴随目标类漏选上升。研究构建了可复现的公开标本图像源域验证流程，为后续采集真实钒钛矿颗粒图像、结合 XRF 或化验标签开展多模态识别与工业场景迁移奠定了基础。</w:t>
+        <w:t>在 8,529 张图像上，采用 ImageNet 预训练的 ResNet50 和 EfficientNet-B0 进行三随机种子重复训练。实验表明，EfficientNet-B0 的平均 Macro F1 为 72.87%±1.21%，ResNet50 为 72.06%±0.92%。脉石/废石类别最易识别，金属光泽干扰和含钛干扰是主要难点。三随机种子 Focal Loss 消融的平均 Macro F1 为 73.22%±0.83%，但其目标代理 F1 与金属光泽干扰误入目标指标未同时改善。进一步提出角色感知困难负样本学习：其平均 Macro F1 为 73.02%±1.09%，可降低含钛干扰和金属光泽干扰误入目标的比例，但伴随目标类漏选上升。基于已有 17 种细粒度矿物标签与四类选矿角色标签，进一步构建矿物种类—选矿角色分层一致性模型；其平均 Macro F1 为 73.41%±2.40%，目标代理召回率提高到 77.56%±2.19%，但两类困难干扰误入目标的比例同时上升，表明分层监督存在明确的召回—风险取舍，尚不能宣称其稳定优于基线。研究构建了可复现的公开标本图像源域验证流程，为后续采集真实钒钛矿颗粒图像、结合 XRF 或化验标签开展多模态识别与工业场景迁移奠定了基础。</w:t>
       </w:r>
     </w:p>
     <w:p>
@@ -351,7 +351,7 @@
           <w:b w:val="0"/>
           <w:sz w:val="24"/>
         </w:rPr>
-        <w:t>钒钛矿；矿物图像识别；深度学习；数据集构建；困难负样本；EfficientNet-B0</w:t>
+        <w:t>钒钛矿；矿物图像识别；深度学习；数据集构建；困难负样本；分层一致性学习</w:t>
       </w:r>
     </w:p>
     <w:p>
@@ -3141,6 +3141,90 @@
     </w:p>
     <w:p>
       <w:pPr>
+        <w:spacing w:before="240" w:after="120" w:line="288" w:lineRule="auto"/>
+        <w:keepNext/>
+      </w:pPr>
+      <w:r>
+        <w:rPr>
+          <w:rFonts w:ascii="黑体" w:hAnsi="黑体" w:eastAsia="黑体"/>
+          <w:b/>
+          <w:color w:val="1F4E78"/>
+          <w:sz w:val="28"/>
+        </w:rPr>
+        <w:t>4.5 矿物种类—选矿角色分层一致性模型</w:t>
+      </w:r>
+    </w:p>
+    <w:p>
+      <w:pPr>
+        <w:spacing w:before="0" w:after="100" w:line="360" w:lineRule="auto"/>
+        <w:ind w:firstLine="420"/>
+        <w:jc w:val="both"/>
+      </w:pPr>
+      <w:r>
+        <w:rPr>
+          <w:rFonts w:ascii="宋体" w:hAnsi="宋体" w:eastAsia="宋体"/>
+          <w:b w:val="0"/>
+          <w:sz w:val="24"/>
+        </w:rPr>
+        <w:t>在现有四分类角色标签之外，数据清单还保留了 17 类细粒度 mineral_label。基于这一已有事实标签，构建共享 EfficientNet-B0 主干的分层模型：一条分支输出四类选矿角色，另一条分支输出 17 类矿物种类，同时设置目标代理/非目标代理辅助头。将种类概率按预先定义的“种类—角色”映射聚合为角色概率，并以 Kullback-Leibler 散度约束其与角色头输出保持一致。训练总损失由角色加权交叉熵、种类交叉熵、目标代理二分类损失、分层一致性损失和困难负样本表示分离项构成。该模型研究的是公开图像标签层级能否改善视觉表征，不将其解释为矿物化学成分或实际分选动作预测。</w:t>
+      </w:r>
+    </w:p>
+    <w:p>
+      <w:pPr>
+        <w:spacing w:before="80" w:after="40" w:line="240" w:lineRule="auto"/>
+        <w:jc w:val="center"/>
+      </w:pPr>
+      <w:r>
+        <w:drawing>
+          <wp:inline xmlns:a="http://schemas.openxmlformats.org/drawingml/2006/main" xmlns:pic="http://schemas.openxmlformats.org/drawingml/2006/picture">
+            <wp:extent cx="5544000" cy="2740224"/>
+            <wp:docPr id="2" name="Picture 2"/>
+            <wp:cNvGraphicFramePr>
+              <a:graphicFrameLocks noChangeAspect="1"/>
+            </wp:cNvGraphicFramePr>
+            <a:graphic>
+              <a:graphicData uri="http://schemas.openxmlformats.org/drawingml/2006/picture">
+                <pic:pic>
+                  <pic:nvPicPr>
+                    <pic:cNvPr id="0" name="fig8_hierarchical_architecture.png"/>
+                    <pic:cNvPicPr/>
+                  </pic:nvPicPr>
+                  <pic:blipFill>
+                    <a:blip r:embed="rId12"/>
+                    <a:stretch>
+                      <a:fillRect/>
+                    </a:stretch>
+                  </pic:blipFill>
+                  <pic:spPr>
+                    <a:xfrm>
+                      <a:off x="0" y="0"/>
+                      <a:ext cx="5544000" cy="2740224"/>
+                    </a:xfrm>
+                    <a:prstGeom prst="rect"/>
+                  </pic:spPr>
+                </pic:pic>
+              </a:graphicData>
+            </a:graphic>
+          </wp:inline>
+        </w:drawing>
+      </w:r>
+    </w:p>
+    <w:p>
+      <w:pPr>
+        <w:spacing w:before="80" w:after="160" w:line="276" w:lineRule="auto"/>
+        <w:jc w:val="center"/>
+      </w:pPr>
+      <w:r>
+        <w:rPr>
+          <w:rFonts w:ascii="宋体" w:hAnsi="宋体" w:eastAsia="宋体"/>
+          <w:b w:val="0"/>
+          <w:sz w:val="21"/>
+        </w:rPr>
+        <w:t>图 2 矿物种类—选矿角色分层一致性模型结构</w:t>
+      </w:r>
+    </w:p>
+    <w:p>
+      <w:pPr>
         <w:spacing w:before="320" w:after="160" w:line="288" w:lineRule="auto"/>
         <w:keepNext/>
       </w:pPr>
@@ -3724,6 +3808,138 @@
           </w:p>
         </w:tc>
       </w:tr>
+      <w:tr>
+        <w:tc>
+          <w:tcPr>
+            <w:tcW w:type="dxa" w:w="1587"/>
+            <w:tcMar>
+              <w:top w:w="100" w:type="dxa"/>
+              <w:start w:w="120" w:type="dxa"/>
+              <w:bottom w:w="100" w:type="dxa"/>
+              <w:end w:w="120" w:type="dxa"/>
+            </w:tcMar>
+            <w:vAlign w:val="center"/>
+          </w:tcPr>
+          <w:p>
+            <w:pPr>
+              <w:spacing w:before="0" w:after="0" w:line="276" w:lineRule="auto"/>
+              <w:jc w:val="center"/>
+            </w:pPr>
+            <w:r>
+              <w:rPr>
+                <w:rFonts w:ascii="宋体" w:hAnsi="宋体" w:eastAsia="宋体"/>
+                <w:b w:val="0"/>
+                <w:sz w:val="20"/>
+              </w:rPr>
+              <w:t>分层一致性 EfficientNet-B0</w:t>
+            </w:r>
+          </w:p>
+        </w:tc>
+        <w:tc>
+          <w:tcPr>
+            <w:tcW w:type="dxa" w:w="1757"/>
+            <w:tcMar>
+              <w:top w:w="100" w:type="dxa"/>
+              <w:start w:w="120" w:type="dxa"/>
+              <w:bottom w:w="100" w:type="dxa"/>
+              <w:end w:w="120" w:type="dxa"/>
+            </w:tcMar>
+            <w:vAlign w:val="center"/>
+          </w:tcPr>
+          <w:p>
+            <w:pPr>
+              <w:spacing w:before="0" w:after="0" w:line="276" w:lineRule="auto"/>
+              <w:jc w:val="left"/>
+            </w:pPr>
+            <w:r>
+              <w:rPr>
+                <w:rFonts w:ascii="宋体" w:hAnsi="宋体" w:eastAsia="宋体"/>
+                <w:b w:val="0"/>
+                <w:sz w:val="20"/>
+              </w:rPr>
+              <w:t>75.42 ± 2.59</w:t>
+            </w:r>
+          </w:p>
+        </w:tc>
+        <w:tc>
+          <w:tcPr>
+            <w:tcW w:type="dxa" w:w="2041"/>
+            <w:tcMar>
+              <w:top w:w="100" w:type="dxa"/>
+              <w:start w:w="120" w:type="dxa"/>
+              <w:bottom w:w="100" w:type="dxa"/>
+              <w:end w:w="120" w:type="dxa"/>
+            </w:tcMar>
+            <w:vAlign w:val="center"/>
+          </w:tcPr>
+          <w:p>
+            <w:pPr>
+              <w:spacing w:before="0" w:after="0" w:line="276" w:lineRule="auto"/>
+              <w:jc w:val="left"/>
+            </w:pPr>
+            <w:r>
+              <w:rPr>
+                <w:rFonts w:ascii="宋体" w:hAnsi="宋体" w:eastAsia="宋体"/>
+                <w:b w:val="0"/>
+                <w:sz w:val="20"/>
+              </w:rPr>
+              <w:t>73.71 ± 2.85</w:t>
+            </w:r>
+          </w:p>
+        </w:tc>
+        <w:tc>
+          <w:tcPr>
+            <w:tcW w:type="dxa" w:w="1927"/>
+            <w:tcMar>
+              <w:top w:w="100" w:type="dxa"/>
+              <w:start w:w="120" w:type="dxa"/>
+              <w:bottom w:w="100" w:type="dxa"/>
+              <w:end w:w="120" w:type="dxa"/>
+            </w:tcMar>
+            <w:vAlign w:val="center"/>
+          </w:tcPr>
+          <w:p>
+            <w:pPr>
+              <w:spacing w:before="0" w:after="0" w:line="276" w:lineRule="auto"/>
+              <w:jc w:val="left"/>
+            </w:pPr>
+            <w:r>
+              <w:rPr>
+                <w:rFonts w:ascii="宋体" w:hAnsi="宋体" w:eastAsia="宋体"/>
+                <w:b w:val="0"/>
+                <w:sz w:val="20"/>
+              </w:rPr>
+              <w:t>73.61 ± 1.78</w:t>
+            </w:r>
+          </w:p>
+        </w:tc>
+        <w:tc>
+          <w:tcPr>
+            <w:tcW w:type="dxa" w:w="1530"/>
+            <w:tcMar>
+              <w:top w:w="100" w:type="dxa"/>
+              <w:start w:w="120" w:type="dxa"/>
+              <w:bottom w:w="100" w:type="dxa"/>
+              <w:end w:w="120" w:type="dxa"/>
+            </w:tcMar>
+            <w:vAlign w:val="center"/>
+          </w:tcPr>
+          <w:p>
+            <w:pPr>
+              <w:spacing w:before="0" w:after="0" w:line="276" w:lineRule="auto"/>
+              <w:jc w:val="left"/>
+            </w:pPr>
+            <w:r>
+              <w:rPr>
+                <w:rFonts w:ascii="宋体" w:hAnsi="宋体" w:eastAsia="宋体"/>
+                <w:b w:val="0"/>
+                <w:sz w:val="20"/>
+              </w:rPr>
+              <w:t>73.41 ± 2.40</w:t>
+            </w:r>
+          </w:p>
+        </w:tc>
+      </w:tr>
     </w:tbl>
     <w:p>
       <w:pPr>
@@ -3742,7 +3958,7 @@
           <w:b w:val="0"/>
           <w:sz w:val="24"/>
         </w:rPr>
-        <w:t>三随机种子结果显示，EfficientNet-B0 的平均 Macro F1 比 ResNet50 高 0.67 个百分点，平均 Accuracy 基本相当。角色感知模型的平均 Macro F1 较普通 EfficientNet-B0 高 0.15 个百分点，但差异远小于种子间波动，因此不能宣称其在总体四分类上稳定优于基线。后续风险指标分析用于说明其面向关键混淆方向的取舍。</w:t>
+        <w:t>三随机种子结果显示，EfficientNet-B0 的平均 Macro F1 比 ResNet50 高 0.67 个百分点，平均 Accuracy 基本相当。角色感知模型的平均 Macro F1 较普通 EfficientNet-B0 高 0.15 个百分点；分层一致性模型提高 0.54 个百分点，但标准差为 2.40 个百分点。两种改进的均值差均小于或接近种子间波动，因此均不应表述为在总体四分类上稳定优于基线。后续类别与风险指标用于说明不同机制带来的实际取舍。</w:t>
       </w:r>
     </w:p>
     <w:p>
@@ -3754,7 +3970,7 @@
         <w:drawing>
           <wp:inline xmlns:a="http://schemas.openxmlformats.org/drawingml/2006/main" xmlns:pic="http://schemas.openxmlformats.org/drawingml/2006/picture">
             <wp:extent cx="5544000" cy="2056451"/>
-            <wp:docPr id="2" name="Picture 2"/>
+            <wp:docPr id="3" name="Picture 3"/>
             <wp:cNvGraphicFramePr>
               <a:graphicFrameLocks noChangeAspect="1"/>
             </wp:cNvGraphicFramePr>
@@ -3766,7 +3982,7 @@
                     <pic:cNvPicPr/>
                   </pic:nvPicPr>
                   <pic:blipFill>
-                    <a:blip r:embed="rId12"/>
+                    <a:blip r:embed="rId13"/>
                     <a:stretch>
                       <a:fillRect/>
                     </a:stretch>
@@ -3796,7 +4012,7 @@
           <w:b w:val="0"/>
           <w:sz w:val="21"/>
         </w:rPr>
-        <w:t>图 2 三种模型的总体性能对比（均值±样本标准差，n=3）</w:t>
+        <w:t>图 3 四种模型的总体性能对比（均值±样本标准差，n=3）</w:t>
       </w:r>
     </w:p>
     <w:p>
@@ -4369,6 +4585,138 @@
           </w:p>
         </w:tc>
       </w:tr>
+      <w:tr>
+        <w:tc>
+          <w:tcPr>
+            <w:tcW w:type="dxa" w:w="1530"/>
+            <w:tcMar>
+              <w:top w:w="100" w:type="dxa"/>
+              <w:start w:w="120" w:type="dxa"/>
+              <w:bottom w:w="100" w:type="dxa"/>
+              <w:end w:w="120" w:type="dxa"/>
+            </w:tcMar>
+            <w:vAlign w:val="center"/>
+          </w:tcPr>
+          <w:p>
+            <w:pPr>
+              <w:spacing w:before="0" w:after="0" w:line="276" w:lineRule="auto"/>
+              <w:jc w:val="center"/>
+            </w:pPr>
+            <w:r>
+              <w:rPr>
+                <w:rFonts w:ascii="宋体" w:hAnsi="宋体" w:eastAsia="宋体"/>
+                <w:b w:val="0"/>
+                <w:sz w:val="19"/>
+              </w:rPr>
+              <w:t>分层一致性 EfficientNet-B0</w:t>
+            </w:r>
+          </w:p>
+        </w:tc>
+        <w:tc>
+          <w:tcPr>
+            <w:tcW w:type="dxa" w:w="1871"/>
+            <w:tcMar>
+              <w:top w:w="100" w:type="dxa"/>
+              <w:start w:w="120" w:type="dxa"/>
+              <w:bottom w:w="100" w:type="dxa"/>
+              <w:end w:w="120" w:type="dxa"/>
+            </w:tcMar>
+            <w:vAlign w:val="center"/>
+          </w:tcPr>
+          <w:p>
+            <w:pPr>
+              <w:spacing w:before="0" w:after="0" w:line="276" w:lineRule="auto"/>
+              <w:jc w:val="left"/>
+            </w:pPr>
+            <w:r>
+              <w:rPr>
+                <w:rFonts w:ascii="宋体" w:hAnsi="宋体" w:eastAsia="宋体"/>
+                <w:b w:val="0"/>
+                <w:sz w:val="19"/>
+              </w:rPr>
+              <w:t>77.56 ± 2.19</w:t>
+            </w:r>
+          </w:p>
+        </w:tc>
+        <w:tc>
+          <w:tcPr>
+            <w:tcW w:type="dxa" w:w="1871"/>
+            <w:tcMar>
+              <w:top w:w="100" w:type="dxa"/>
+              <w:start w:w="120" w:type="dxa"/>
+              <w:bottom w:w="100" w:type="dxa"/>
+              <w:end w:w="120" w:type="dxa"/>
+            </w:tcMar>
+            <w:vAlign w:val="center"/>
+          </w:tcPr>
+          <w:p>
+            <w:pPr>
+              <w:spacing w:before="0" w:after="0" w:line="276" w:lineRule="auto"/>
+              <w:jc w:val="left"/>
+            </w:pPr>
+            <w:r>
+              <w:rPr>
+                <w:rFonts w:ascii="宋体" w:hAnsi="宋体" w:eastAsia="宋体"/>
+                <w:b w:val="0"/>
+                <w:sz w:val="19"/>
+              </w:rPr>
+              <w:t>75.15 ± 5.54</w:t>
+            </w:r>
+          </w:p>
+        </w:tc>
+        <w:tc>
+          <w:tcPr>
+            <w:tcW w:type="dxa" w:w="1871"/>
+            <w:tcMar>
+              <w:top w:w="100" w:type="dxa"/>
+              <w:start w:w="120" w:type="dxa"/>
+              <w:bottom w:w="100" w:type="dxa"/>
+              <w:end w:w="120" w:type="dxa"/>
+            </w:tcMar>
+            <w:vAlign w:val="center"/>
+          </w:tcPr>
+          <w:p>
+            <w:pPr>
+              <w:spacing w:before="0" w:after="0" w:line="276" w:lineRule="auto"/>
+              <w:jc w:val="left"/>
+            </w:pPr>
+            <w:r>
+              <w:rPr>
+                <w:rFonts w:ascii="宋体" w:hAnsi="宋体" w:eastAsia="宋体"/>
+                <w:b w:val="0"/>
+                <w:sz w:val="19"/>
+              </w:rPr>
+              <w:t>81.69 ± 2.84</w:t>
+            </w:r>
+          </w:p>
+        </w:tc>
+        <w:tc>
+          <w:tcPr>
+            <w:tcW w:type="dxa" w:w="2154"/>
+            <w:tcMar>
+              <w:top w:w="100" w:type="dxa"/>
+              <w:start w:w="120" w:type="dxa"/>
+              <w:bottom w:w="100" w:type="dxa"/>
+              <w:end w:w="120" w:type="dxa"/>
+            </w:tcMar>
+            <w:vAlign w:val="center"/>
+          </w:tcPr>
+          <w:p>
+            <w:pPr>
+              <w:spacing w:before="0" w:after="0" w:line="276" w:lineRule="auto"/>
+              <w:jc w:val="left"/>
+            </w:pPr>
+            <w:r>
+              <w:rPr>
+                <w:rFonts w:ascii="宋体" w:hAnsi="宋体" w:eastAsia="宋体"/>
+                <w:b w:val="0"/>
+                <w:sz w:val="19"/>
+              </w:rPr>
+              <w:t>60.04 ± 2.15</w:t>
+            </w:r>
+          </w:p>
+        </w:tc>
+      </w:tr>
     </w:tbl>
     <w:p>
       <w:pPr>
@@ -4387,7 +4735,7 @@
           <w:b w:val="0"/>
           <w:sz w:val="24"/>
         </w:rPr>
-        <w:t>脉石/废石类别在各模型中均具有较高召回率，说明该类在颜色、透明度和形貌上与目标组分存在较明显差异。金属光泽干扰是更具挑战的类别：黄铁矿、赤铁矿、针铁矿和黄铜矿等可能呈现暗色、反光或块状外观，与目标矿物形成视觉混淆。角色感知模型将含钛干扰和金属光泽干扰的平均召回率分别提高到 76.71% 和 65.15%，但目标类平均召回率降至 68.39%，体现出更保守的目标判定倾向。</w:t>
+        <w:t>脉石/废石类别在各模型中均具有较高召回率，说明该类在颜色、透明度和形貌上与目标组分存在较明显差异。金属光泽干扰是更具挑战的类别：黄铁矿、赤铁矿、针铁矿和黄铜矿等可能呈现暗色、反光或块状外观，与目标矿物形成视觉混淆。角色感知模型提高了两类困难干扰的召回，但降低目标召回，体现为保守目标判定；分层一致性模型将目标类召回提升至 77.56%，但金属光泽干扰召回降至 60.04%，显示细粒度种类监督会改变类别边界而非统一改善全部类别。</w:t>
       </w:r>
     </w:p>
     <w:p>
@@ -4399,7 +4747,7 @@
         <w:drawing>
           <wp:inline xmlns:a="http://schemas.openxmlformats.org/drawingml/2006/main" xmlns:pic="http://schemas.openxmlformats.org/drawingml/2006/picture">
             <wp:extent cx="5544000" cy="2577579"/>
-            <wp:docPr id="3" name="Picture 3"/>
+            <wp:docPr id="4" name="Picture 4"/>
             <wp:cNvGraphicFramePr>
               <a:graphicFrameLocks noChangeAspect="1"/>
             </wp:cNvGraphicFramePr>
@@ -4411,7 +4759,7 @@
                     <pic:cNvPicPr/>
                   </pic:nvPicPr>
                   <pic:blipFill>
-                    <a:blip r:embed="rId13"/>
+                    <a:blip r:embed="rId14"/>
                     <a:stretch>
                       <a:fillRect/>
                     </a:stretch>
@@ -4441,7 +4789,7 @@
           <w:b w:val="0"/>
           <w:sz w:val="21"/>
         </w:rPr>
-        <w:t>图 3 四类矿物在三种模型上的测试集召回率（均值±样本标准差，n=3）</w:t>
+        <w:t>图 4 四类矿物在四种模型上的测试集召回率（均值±样本标准差，n=3）</w:t>
       </w:r>
     </w:p>
     <w:p>
@@ -5044,7 +5392,7 @@
         <w:drawing>
           <wp:inline xmlns:a="http://schemas.openxmlformats.org/drawingml/2006/main" xmlns:pic="http://schemas.openxmlformats.org/drawingml/2006/picture">
             <wp:extent cx="5544000" cy="3459488"/>
-            <wp:docPr id="4" name="Picture 4"/>
+            <wp:docPr id="5" name="Picture 5"/>
             <wp:cNvGraphicFramePr>
               <a:graphicFrameLocks noChangeAspect="1"/>
             </wp:cNvGraphicFramePr>
@@ -5056,7 +5404,7 @@
                     <pic:cNvPicPr/>
                   </pic:nvPicPr>
                   <pic:blipFill>
-                    <a:blip r:embed="rId14"/>
+                    <a:blip r:embed="rId15"/>
                     <a:stretch>
                       <a:fillRect/>
                     </a:stretch>
@@ -5086,7 +5434,7 @@
           <w:b w:val="0"/>
           <w:sz w:val="21"/>
         </w:rPr>
-        <w:t>图 4 三种损失/训练策略的目标代理风险指标（均值±样本标准差，n=3）</w:t>
+        <w:t>图 5 四种训练策略的目标代理风险指标（均值±样本标准差，n=3）</w:t>
       </w:r>
     </w:p>
     <w:p>
@@ -5128,7 +5476,7 @@
         <w:drawing>
           <wp:inline xmlns:a="http://schemas.openxmlformats.org/drawingml/2006/main" xmlns:pic="http://schemas.openxmlformats.org/drawingml/2006/picture">
             <wp:extent cx="4860000" cy="4166454"/>
-            <wp:docPr id="5" name="Picture 5"/>
+            <wp:docPr id="6" name="Picture 6"/>
             <wp:cNvGraphicFramePr>
               <a:graphicFrameLocks noChangeAspect="1"/>
             </wp:cNvGraphicFramePr>
@@ -5140,7 +5488,7 @@
                     <pic:cNvPicPr/>
                   </pic:nvPicPr>
                   <pic:blipFill>
-                    <a:blip r:embed="rId15"/>
+                    <a:blip r:embed="rId16"/>
                     <a:stretch>
                       <a:fillRect/>
                     </a:stretch>
@@ -5170,7 +5518,7 @@
           <w:b w:val="0"/>
           <w:sz w:val="21"/>
         </w:rPr>
-        <w:t>图 5 EfficientNet-B0（随机种子 20260728）在固定测试集上的混淆矩阵</w:t>
+        <w:t>图 6 EfficientNet-B0（随机种子 20260728）在固定测试集上的混淆矩阵</w:t>
       </w:r>
     </w:p>
     <w:p>
@@ -5182,7 +5530,7 @@
         <w:drawing>
           <wp:inline xmlns:a="http://schemas.openxmlformats.org/drawingml/2006/main" xmlns:pic="http://schemas.openxmlformats.org/drawingml/2006/picture">
             <wp:extent cx="5400000" cy="2432538"/>
-            <wp:docPr id="6" name="Picture 6"/>
+            <wp:docPr id="7" name="Picture 7"/>
             <wp:cNvGraphicFramePr>
               <a:graphicFrameLocks noChangeAspect="1"/>
             </wp:cNvGraphicFramePr>
@@ -5194,7 +5542,7 @@
                     <pic:cNvPicPr/>
                   </pic:nvPicPr>
                   <pic:blipFill>
-                    <a:blip r:embed="rId16"/>
+                    <a:blip r:embed="rId17"/>
                     <a:stretch>
                       <a:fillRect/>
                     </a:stretch>
@@ -5224,7 +5572,7 @@
           <w:b w:val="0"/>
           <w:sz w:val="21"/>
         </w:rPr>
-        <w:t>图 6 EfficientNet-B0（随机种子 20260728）的主要错分方向</w:t>
+        <w:t>图 7 EfficientNet-B0（随机种子 20260728）的主要错分方向</w:t>
       </w:r>
     </w:p>
     <w:p>
@@ -5775,7 +6123,7 @@
         <w:drawing>
           <wp:inline xmlns:a="http://schemas.openxmlformats.org/drawingml/2006/main" xmlns:pic="http://schemas.openxmlformats.org/drawingml/2006/picture">
             <wp:extent cx="5400000" cy="2471584"/>
-            <wp:docPr id="7" name="Picture 7"/>
+            <wp:docPr id="8" name="Picture 8"/>
             <wp:cNvGraphicFramePr>
               <a:graphicFrameLocks noChangeAspect="1"/>
             </wp:cNvGraphicFramePr>
@@ -5787,7 +6135,7 @@
                     <pic:cNvPicPr/>
                   </pic:nvPicPr>
                   <pic:blipFill>
-                    <a:blip r:embed="rId17"/>
+                    <a:blip r:embed="rId18"/>
                     <a:stretch>
                       <a:fillRect/>
                     </a:stretch>
@@ -5817,7 +6165,7 @@
           <w:b w:val="0"/>
           <w:sz w:val="21"/>
         </w:rPr>
-        <w:t>图 7 加权交叉熵与加权 Focal Loss 的三随机种子消融结果</w:t>
+        <w:t>图 8 加权交叉熵与加权 Focal Loss 的三随机种子消融结果</w:t>
       </w:r>
     </w:p>
     <w:p>
@@ -5848,6 +6196,465 @@
           <w:sz w:val="24"/>
         </w:rPr>
         <w:t>角色感知模型的四分类 Macro F1 为 73.02%±1.09%，相较普通 EfficientNet-B0 的提升仅为 0.15 个百分点，不能据此主张总体识别性能显著提高。其更有意义的变化发生在风险方向：将含钛干扰和金属光泽干扰误入目标的比例分别降至 7.74%±0.35% 和 9.66%±0.98%，同时目标类召回由 71.98% 降至 68.39%。因此，该模型体现为针对高风险误入错误的保守策略原型。后续可通过调节辅助损失权重、增加真实矿石样本及结合分选专家定义的可接受漏选阈值，确定更适宜的运行点。</w:t>
+      </w:r>
+    </w:p>
+    <w:p>
+      <w:pPr>
+        <w:spacing w:before="240" w:after="120" w:line="288" w:lineRule="auto"/>
+        <w:keepNext/>
+      </w:pPr>
+      <w:r>
+        <w:rPr>
+          <w:rFonts w:ascii="黑体" w:hAnsi="黑体" w:eastAsia="黑体"/>
+          <w:b/>
+          <w:color w:val="1F4E78"/>
+          <w:sz w:val="28"/>
+        </w:rPr>
+        <w:t>5.7 分层一致性模型讨论</w:t>
+      </w:r>
+    </w:p>
+    <w:tbl>
+      <w:tblPr>
+        <w:tblW w:type="auto" w:w="0"/>
+        <w:jc w:val="center"/>
+        <w:tblLook w:firstColumn="1" w:firstRow="1" w:lastColumn="0" w:lastRow="0" w:noHBand="0" w:noVBand="1" w:val="04A0"/>
+        <w:tblLayout w:type="fixed"/>
+        <w:tblBorders>
+          <w:top w:val="single" w:sz="6" w:space="0" w:color="808080"/>
+          <w:left w:val="single" w:sz="6" w:space="0" w:color="808080"/>
+          <w:bottom w:val="single" w:sz="6" w:space="0" w:color="808080"/>
+          <w:right w:val="single" w:sz="6" w:space="0" w:color="808080"/>
+          <w:insideH w:val="single" w:sz="6" w:space="0" w:color="808080"/>
+          <w:insideV w:val="single" w:sz="6" w:space="0" w:color="808080"/>
+        </w:tblBorders>
+      </w:tblPr>
+      <w:tblGrid>
+        <w:gridCol w:w="1769"/>
+        <w:gridCol w:w="1769"/>
+        <w:gridCol w:w="1769"/>
+        <w:gridCol w:w="1769"/>
+        <w:gridCol w:w="1769"/>
+      </w:tblGrid>
+      <w:tr>
+        <w:tc>
+          <w:tcPr>
+            <w:tcW w:type="dxa" w:w="2097"/>
+            <w:tcMar>
+              <w:top w:w="100" w:type="dxa"/>
+              <w:start w:w="120" w:type="dxa"/>
+              <w:bottom w:w="100" w:type="dxa"/>
+              <w:end w:w="120" w:type="dxa"/>
+            </w:tcMar>
+            <w:shd w:fill="E8EEF5"/>
+            <w:vAlign w:val="center"/>
+          </w:tcPr>
+          <w:p>
+            <w:pPr>
+              <w:spacing w:before="0" w:after="0" w:line="276" w:lineRule="auto"/>
+              <w:jc w:val="center"/>
+            </w:pPr>
+            <w:r>
+              <w:rPr>
+                <w:rFonts w:ascii="黑体" w:hAnsi="黑体" w:eastAsia="黑体"/>
+                <w:b/>
+                <w:sz w:val="18"/>
+              </w:rPr>
+              <w:t>设置</w:t>
+            </w:r>
+          </w:p>
+        </w:tc>
+        <w:tc>
+          <w:tcPr>
+            <w:tcW w:type="dxa" w:w="1530"/>
+            <w:tcMar>
+              <w:top w:w="100" w:type="dxa"/>
+              <w:start w:w="120" w:type="dxa"/>
+              <w:bottom w:w="100" w:type="dxa"/>
+              <w:end w:w="120" w:type="dxa"/>
+            </w:tcMar>
+            <w:shd w:fill="E8EEF5"/>
+            <w:vAlign w:val="center"/>
+          </w:tcPr>
+          <w:p>
+            <w:pPr>
+              <w:spacing w:before="0" w:after="0" w:line="276" w:lineRule="auto"/>
+              <w:jc w:val="center"/>
+            </w:pPr>
+            <w:r>
+              <w:rPr>
+                <w:rFonts w:ascii="黑体" w:hAnsi="黑体" w:eastAsia="黑体"/>
+                <w:b/>
+                <w:sz w:val="18"/>
+              </w:rPr>
+              <w:t>目标代理 F1（%）</w:t>
+            </w:r>
+          </w:p>
+        </w:tc>
+        <w:tc>
+          <w:tcPr>
+            <w:tcW w:type="dxa" w:w="1701"/>
+            <w:tcMar>
+              <w:top w:w="100" w:type="dxa"/>
+              <w:start w:w="120" w:type="dxa"/>
+              <w:bottom w:w="100" w:type="dxa"/>
+              <w:end w:w="120" w:type="dxa"/>
+            </w:tcMar>
+            <w:shd w:fill="E8EEF5"/>
+            <w:vAlign w:val="center"/>
+          </w:tcPr>
+          <w:p>
+            <w:pPr>
+              <w:spacing w:before="0" w:after="0" w:line="276" w:lineRule="auto"/>
+              <w:jc w:val="center"/>
+            </w:pPr>
+            <w:r>
+              <w:rPr>
+                <w:rFonts w:ascii="黑体" w:hAnsi="黑体" w:eastAsia="黑体"/>
+                <w:b/>
+                <w:sz w:val="18"/>
+              </w:rPr>
+              <w:t>目标漏选率（%）</w:t>
+            </w:r>
+          </w:p>
+        </w:tc>
+        <w:tc>
+          <w:tcPr>
+            <w:tcW w:type="dxa" w:w="2154"/>
+            <w:tcMar>
+              <w:top w:w="100" w:type="dxa"/>
+              <w:start w:w="120" w:type="dxa"/>
+              <w:bottom w:w="100" w:type="dxa"/>
+              <w:end w:w="120" w:type="dxa"/>
+            </w:tcMar>
+            <w:shd w:fill="E8EEF5"/>
+            <w:vAlign w:val="center"/>
+          </w:tcPr>
+          <w:p>
+            <w:pPr>
+              <w:spacing w:before="0" w:after="0" w:line="276" w:lineRule="auto"/>
+              <w:jc w:val="center"/>
+            </w:pPr>
+            <w:r>
+              <w:rPr>
+                <w:rFonts w:ascii="黑体" w:hAnsi="黑体" w:eastAsia="黑体"/>
+                <w:b/>
+                <w:sz w:val="18"/>
+              </w:rPr>
+              <w:t>含钛干扰误入目标（%）</w:t>
+            </w:r>
+          </w:p>
+        </w:tc>
+        <w:tc>
+          <w:tcPr>
+            <w:tcW w:type="dxa" w:w="2381"/>
+            <w:tcMar>
+              <w:top w:w="100" w:type="dxa"/>
+              <w:start w:w="120" w:type="dxa"/>
+              <w:bottom w:w="100" w:type="dxa"/>
+              <w:end w:w="120" w:type="dxa"/>
+            </w:tcMar>
+            <w:shd w:fill="E8EEF5"/>
+            <w:vAlign w:val="center"/>
+          </w:tcPr>
+          <w:p>
+            <w:pPr>
+              <w:spacing w:before="0" w:after="0" w:line="276" w:lineRule="auto"/>
+              <w:jc w:val="center"/>
+            </w:pPr>
+            <w:r>
+              <w:rPr>
+                <w:rFonts w:ascii="黑体" w:hAnsi="黑体" w:eastAsia="黑体"/>
+                <w:b/>
+                <w:sz w:val="18"/>
+              </w:rPr>
+              <w:t>金属光泽干扰误入目标（%）</w:t>
+            </w:r>
+          </w:p>
+        </w:tc>
+      </w:tr>
+      <w:tr>
+        <w:tc>
+          <w:tcPr>
+            <w:tcW w:type="dxa" w:w="2097"/>
+            <w:tcMar>
+              <w:top w:w="100" w:type="dxa"/>
+              <w:start w:w="120" w:type="dxa"/>
+              <w:bottom w:w="100" w:type="dxa"/>
+              <w:end w:w="120" w:type="dxa"/>
+            </w:tcMar>
+            <w:vAlign w:val="center"/>
+          </w:tcPr>
+          <w:p>
+            <w:pPr>
+              <w:spacing w:before="0" w:after="0" w:line="276" w:lineRule="auto"/>
+              <w:jc w:val="center"/>
+            </w:pPr>
+            <w:r>
+              <w:rPr>
+                <w:rFonts w:ascii="宋体" w:hAnsi="宋体" w:eastAsia="宋体"/>
+                <w:b w:val="0"/>
+                <w:sz w:val="18"/>
+              </w:rPr>
+              <w:t>普通 EfficientNet-B0</w:t>
+            </w:r>
+          </w:p>
+        </w:tc>
+        <w:tc>
+          <w:tcPr>
+            <w:tcW w:type="dxa" w:w="1530"/>
+            <w:tcMar>
+              <w:top w:w="100" w:type="dxa"/>
+              <w:start w:w="120" w:type="dxa"/>
+              <w:bottom w:w="100" w:type="dxa"/>
+              <w:end w:w="120" w:type="dxa"/>
+            </w:tcMar>
+            <w:vAlign w:val="center"/>
+          </w:tcPr>
+          <w:p>
+            <w:pPr>
+              <w:spacing w:before="0" w:after="0" w:line="276" w:lineRule="auto"/>
+              <w:jc w:val="left"/>
+            </w:pPr>
+            <w:r>
+              <w:rPr>
+                <w:rFonts w:ascii="宋体" w:hAnsi="宋体" w:eastAsia="宋体"/>
+                <w:b w:val="0"/>
+                <w:sz w:val="18"/>
+              </w:rPr>
+              <w:t>70.45 ± 1.34</w:t>
+            </w:r>
+          </w:p>
+        </w:tc>
+        <w:tc>
+          <w:tcPr>
+            <w:tcW w:type="dxa" w:w="1701"/>
+            <w:tcMar>
+              <w:top w:w="100" w:type="dxa"/>
+              <w:start w:w="120" w:type="dxa"/>
+              <w:bottom w:w="100" w:type="dxa"/>
+              <w:end w:w="120" w:type="dxa"/>
+            </w:tcMar>
+            <w:vAlign w:val="center"/>
+          </w:tcPr>
+          <w:p>
+            <w:pPr>
+              <w:spacing w:before="0" w:after="0" w:line="276" w:lineRule="auto"/>
+              <w:jc w:val="left"/>
+            </w:pPr>
+            <w:r>
+              <w:rPr>
+                <w:rFonts w:ascii="宋体" w:hAnsi="宋体" w:eastAsia="宋体"/>
+                <w:b w:val="0"/>
+                <w:sz w:val="18"/>
+              </w:rPr>
+              <w:t>28.02 ± 0.46</w:t>
+            </w:r>
+          </w:p>
+        </w:tc>
+        <w:tc>
+          <w:tcPr>
+            <w:tcW w:type="dxa" w:w="2154"/>
+            <w:tcMar>
+              <w:top w:w="100" w:type="dxa"/>
+              <w:start w:w="120" w:type="dxa"/>
+              <w:bottom w:w="100" w:type="dxa"/>
+              <w:end w:w="120" w:type="dxa"/>
+            </w:tcMar>
+            <w:vAlign w:val="center"/>
+          </w:tcPr>
+          <w:p>
+            <w:pPr>
+              <w:spacing w:before="0" w:after="0" w:line="276" w:lineRule="auto"/>
+              <w:jc w:val="left"/>
+            </w:pPr>
+            <w:r>
+              <w:rPr>
+                <w:rFonts w:ascii="宋体" w:hAnsi="宋体" w:eastAsia="宋体"/>
+                <w:b w:val="0"/>
+                <w:sz w:val="18"/>
+              </w:rPr>
+              <w:t>9.84 ± 1.24</w:t>
+            </w:r>
+          </w:p>
+        </w:tc>
+        <w:tc>
+          <w:tcPr>
+            <w:tcW w:type="dxa" w:w="2381"/>
+            <w:tcMar>
+              <w:top w:w="100" w:type="dxa"/>
+              <w:start w:w="120" w:type="dxa"/>
+              <w:bottom w:w="100" w:type="dxa"/>
+              <w:end w:w="120" w:type="dxa"/>
+            </w:tcMar>
+            <w:vAlign w:val="center"/>
+          </w:tcPr>
+          <w:p>
+            <w:pPr>
+              <w:spacing w:before="0" w:after="0" w:line="276" w:lineRule="auto"/>
+              <w:jc w:val="left"/>
+            </w:pPr>
+            <w:r>
+              <w:rPr>
+                <w:rFonts w:ascii="宋体" w:hAnsi="宋体" w:eastAsia="宋体"/>
+                <w:b w:val="0"/>
+                <w:sz w:val="18"/>
+              </w:rPr>
+              <w:t>11.55 ± 0.66</w:t>
+            </w:r>
+          </w:p>
+        </w:tc>
+      </w:tr>
+      <w:tr>
+        <w:tc>
+          <w:tcPr>
+            <w:tcW w:type="dxa" w:w="2097"/>
+            <w:tcMar>
+              <w:top w:w="100" w:type="dxa"/>
+              <w:start w:w="120" w:type="dxa"/>
+              <w:bottom w:w="100" w:type="dxa"/>
+              <w:end w:w="120" w:type="dxa"/>
+            </w:tcMar>
+            <w:vAlign w:val="center"/>
+          </w:tcPr>
+          <w:p>
+            <w:pPr>
+              <w:spacing w:before="0" w:after="0" w:line="276" w:lineRule="auto"/>
+              <w:jc w:val="center"/>
+            </w:pPr>
+            <w:r>
+              <w:rPr>
+                <w:rFonts w:ascii="宋体" w:hAnsi="宋体" w:eastAsia="宋体"/>
+                <w:b w:val="0"/>
+                <w:sz w:val="18"/>
+              </w:rPr>
+              <w:t>分层一致性 EfficientNet-B0</w:t>
+            </w:r>
+          </w:p>
+        </w:tc>
+        <w:tc>
+          <w:tcPr>
+            <w:tcW w:type="dxa" w:w="1530"/>
+            <w:tcMar>
+              <w:top w:w="100" w:type="dxa"/>
+              <w:start w:w="120" w:type="dxa"/>
+              <w:bottom w:w="100" w:type="dxa"/>
+              <w:end w:w="120" w:type="dxa"/>
+            </w:tcMar>
+            <w:vAlign w:val="center"/>
+          </w:tcPr>
+          <w:p>
+            <w:pPr>
+              <w:spacing w:before="0" w:after="0" w:line="276" w:lineRule="auto"/>
+              <w:jc w:val="left"/>
+            </w:pPr>
+            <w:r>
+              <w:rPr>
+                <w:rFonts w:ascii="宋体" w:hAnsi="宋体" w:eastAsia="宋体"/>
+                <w:b w:val="0"/>
+                <w:sz w:val="18"/>
+              </w:rPr>
+              <w:t>72.04 ± 2.05</w:t>
+            </w:r>
+          </w:p>
+        </w:tc>
+        <w:tc>
+          <w:tcPr>
+            <w:tcW w:type="dxa" w:w="1701"/>
+            <w:tcMar>
+              <w:top w:w="100" w:type="dxa"/>
+              <w:start w:w="120" w:type="dxa"/>
+              <w:bottom w:w="100" w:type="dxa"/>
+              <w:end w:w="120" w:type="dxa"/>
+            </w:tcMar>
+            <w:vAlign w:val="center"/>
+          </w:tcPr>
+          <w:p>
+            <w:pPr>
+              <w:spacing w:before="0" w:after="0" w:line="276" w:lineRule="auto"/>
+              <w:jc w:val="left"/>
+            </w:pPr>
+            <w:r>
+              <w:rPr>
+                <w:rFonts w:ascii="宋体" w:hAnsi="宋体" w:eastAsia="宋体"/>
+                <w:b w:val="0"/>
+                <w:sz w:val="18"/>
+              </w:rPr>
+              <w:t>22.44 ± 2.19</w:t>
+            </w:r>
+          </w:p>
+        </w:tc>
+        <w:tc>
+          <w:tcPr>
+            <w:tcW w:type="dxa" w:w="2154"/>
+            <w:tcMar>
+              <w:top w:w="100" w:type="dxa"/>
+              <w:start w:w="120" w:type="dxa"/>
+              <w:bottom w:w="100" w:type="dxa"/>
+              <w:end w:w="120" w:type="dxa"/>
+            </w:tcMar>
+            <w:vAlign w:val="center"/>
+          </w:tcPr>
+          <w:p>
+            <w:pPr>
+              <w:spacing w:before="0" w:after="0" w:line="276" w:lineRule="auto"/>
+              <w:jc w:val="left"/>
+            </w:pPr>
+            <w:r>
+              <w:rPr>
+                <w:rFonts w:ascii="宋体" w:hAnsi="宋体" w:eastAsia="宋体"/>
+                <w:b w:val="0"/>
+                <w:sz w:val="18"/>
+              </w:rPr>
+              <w:t>10.93 ± 3.37</w:t>
+            </w:r>
+          </w:p>
+        </w:tc>
+        <w:tc>
+          <w:tcPr>
+            <w:tcW w:type="dxa" w:w="2381"/>
+            <w:tcMar>
+              <w:top w:w="100" w:type="dxa"/>
+              <w:start w:w="120" w:type="dxa"/>
+              <w:bottom w:w="100" w:type="dxa"/>
+              <w:end w:w="120" w:type="dxa"/>
+            </w:tcMar>
+            <w:vAlign w:val="center"/>
+          </w:tcPr>
+          <w:p>
+            <w:pPr>
+              <w:spacing w:before="0" w:after="0" w:line="276" w:lineRule="auto"/>
+              <w:jc w:val="left"/>
+            </w:pPr>
+            <w:r>
+              <w:rPr>
+                <w:rFonts w:ascii="宋体" w:hAnsi="宋体" w:eastAsia="宋体"/>
+                <w:b w:val="0"/>
+                <w:sz w:val="18"/>
+              </w:rPr>
+              <w:t>14.39 ± 2.92</w:t>
+            </w:r>
+          </w:p>
+        </w:tc>
+      </w:tr>
+    </w:tbl>
+    <w:p>
+      <w:pPr>
+        <w:spacing w:after="60"/>
+      </w:pPr>
+    </w:p>
+    <w:p>
+      <w:pPr>
+        <w:spacing w:before="0" w:after="100" w:line="360" w:lineRule="auto"/>
+        <w:ind w:firstLine="420"/>
+        <w:jc w:val="both"/>
+      </w:pPr>
+      <w:r>
+        <w:rPr>
+          <w:rFonts w:ascii="宋体" w:hAnsi="宋体" w:eastAsia="宋体"/>
+          <w:b w:val="0"/>
+          <w:sz w:val="24"/>
+        </w:rPr>
+        <w:t>分层模型在 17 类矿物种类头上的平均测试 Accuracy 为 56.80%±2.23%，而角色主任务的 Macro F1 为 73.41%±2.40%。这符合该数据的任务特点：网页主题矿物、伴生矿物与基质可能共存，细粒度种类标签更难由单张宏观图片稳定确定；但种类概率聚合后的角色信息仍可为粗粒度识别提供辅助。相较普通 EfficientNet-B0，分层模型把目标漏选率降低 5.58 个百分点、目标代理 F1 提高 1.59 个百分点，却使含钛干扰和金属光泽干扰误入目标的比例分别增加 1.09 和 2.84 个百分点。因此，本阶段结果只能支持“分层监督能改善目标类召回、但尚未满足困难负样本风险控制”的结论。下一步应进行种类损失、层级一致性损失、二分类辅助损失和困难负样本约束的组件消融，并在目标召回约束下优化困难干扰误入率。</w:t>
       </w:r>
     </w:p>
     <w:p>
@@ -6299,6 +7106,86 @@
                 <w:sz w:val="20"/>
               </w:rPr>
               <w:t>在四分类主任务外增加目标代理辅助任务，并仅对目标—含钛干扰、目标—金属光泽干扰施加表示约束，以风险指标验证其取舍。</w:t>
+            </w:r>
+          </w:p>
+        </w:tc>
+      </w:tr>
+      <w:tr>
+        <w:tc>
+          <w:tcPr>
+            <w:tcW w:type="dxa" w:w="567"/>
+            <w:tcMar>
+              <w:top w:w="100" w:type="dxa"/>
+              <w:start w:w="120" w:type="dxa"/>
+              <w:bottom w:w="100" w:type="dxa"/>
+              <w:end w:w="120" w:type="dxa"/>
+            </w:tcMar>
+            <w:vAlign w:val="center"/>
+          </w:tcPr>
+          <w:p>
+            <w:pPr>
+              <w:spacing w:before="0" w:after="0" w:line="276" w:lineRule="auto"/>
+              <w:jc w:val="center"/>
+            </w:pPr>
+            <w:r>
+              <w:rPr>
+                <w:rFonts w:ascii="宋体" w:hAnsi="宋体" w:eastAsia="宋体"/>
+                <w:b w:val="0"/>
+                <w:sz w:val="20"/>
+              </w:rPr>
+              <w:t>5</w:t>
+            </w:r>
+          </w:p>
+        </w:tc>
+        <w:tc>
+          <w:tcPr>
+            <w:tcW w:type="dxa" w:w="2835"/>
+            <w:tcMar>
+              <w:top w:w="100" w:type="dxa"/>
+              <w:start w:w="120" w:type="dxa"/>
+              <w:bottom w:w="100" w:type="dxa"/>
+              <w:end w:w="120" w:type="dxa"/>
+            </w:tcMar>
+            <w:vAlign w:val="center"/>
+          </w:tcPr>
+          <w:p>
+            <w:pPr>
+              <w:spacing w:before="0" w:after="0" w:line="276" w:lineRule="auto"/>
+              <w:jc w:val="left"/>
+            </w:pPr>
+            <w:r>
+              <w:rPr>
+                <w:rFonts w:ascii="宋体" w:hAnsi="宋体" w:eastAsia="宋体"/>
+                <w:b w:val="0"/>
+                <w:sz w:val="20"/>
+              </w:rPr>
+              <w:t>矿物种类—选矿角色分层一致性原型</w:t>
+            </w:r>
+          </w:p>
+        </w:tc>
+        <w:tc>
+          <w:tcPr>
+            <w:tcW w:type="dxa" w:w="5556"/>
+            <w:tcMar>
+              <w:top w:w="100" w:type="dxa"/>
+              <w:start w:w="120" w:type="dxa"/>
+              <w:bottom w:w="100" w:type="dxa"/>
+              <w:end w:w="120" w:type="dxa"/>
+            </w:tcMar>
+            <w:vAlign w:val="center"/>
+          </w:tcPr>
+          <w:p>
+            <w:pPr>
+              <w:spacing w:before="0" w:after="0" w:line="276" w:lineRule="auto"/>
+              <w:jc w:val="left"/>
+            </w:pPr>
+            <w:r>
+              <w:rPr>
+                <w:rFonts w:ascii="宋体" w:hAnsi="宋体" w:eastAsia="宋体"/>
+                <w:b w:val="0"/>
+                <w:sz w:val="20"/>
+              </w:rPr>
+              <w:t>利用已保留的 17 类种类标签与四类角色映射，在共享视觉表征上联合种类、角色和目标代理任务；结果揭示了目标召回改善与困难负样本风险上升的可量化取舍。</w:t>
             </w:r>
           </w:p>
         </w:tc>
@@ -6815,7 +7702,7 @@
                 <w:b w:val="0"/>
                 <w:sz w:val="19"/>
               </w:rPr>
-              <w:t>角色感知模型总体收益有限</w:t>
+              <w:t>改进模型的总体收益有限</w:t>
             </w:r>
           </w:p>
         </w:tc>
@@ -6841,7 +7728,7 @@
                 <w:b w:val="0"/>
                 <w:sz w:val="19"/>
               </w:rPr>
-              <w:t>Macro F1 的提升小于种子间波动，目标漏选增加</w:t>
+              <w:t>角色感知和分层模型的均值提升均小于或接近种子间波动；分层模型还提高困难干扰误入目标率</w:t>
             </w:r>
           </w:p>
         </w:tc>
@@ -6867,7 +7754,7 @@
                 <w:b w:val="0"/>
                 <w:sz w:val="19"/>
               </w:rPr>
-              <w:t>定位为风险取舍原型，后续调节损失权重并结合专家阈值优化</w:t>
+              <w:t>报告取舍而非宣称稳定领先，补做组件消融与受约束风险优化</w:t>
             </w:r>
           </w:p>
         </w:tc>
@@ -6905,7 +7792,7 @@
           <w:b w:val="0"/>
           <w:sz w:val="24"/>
         </w:rPr>
-        <w:t>第一，优先补充经过审核的钛磁铁矿样本，或采集少量由专家/化验确认的真实钒钛矿颗粒图像，用于建立外部测试集。第二，回填可获得的产地、摄影者、收藏机构或页面来源信息，构建按来源留出的严格泛化评价。第三，围绕角色感知困难负样本学习继续调节辅助损失权重，并由选矿专家明确可接受的目标漏选与干扰误入阈值，寻找更适宜的风险运行点。第四，结合 XRF、磁性或化验信息，形成 RGB 初筛与成分确认相结合的多模态工作流。</w:t>
+        <w:t>第一，优先补充经过审核的钛磁铁矿样本，或采集少量由专家/化验确认的真实钒钛矿颗粒图像，用于建立外部测试集。第二，回填可获得的产地、摄影者、收藏机构或页面来源信息，构建按来源留出的严格泛化评价。第三，围绕分层模型开展组件消融：分别移除种类交叉熵、层级一致性、目标代理辅助头和困难负样本约束，并在目标召回率达到预设下限时最小化含钛、金属光泽干扰误入目标率。第四，建立独立未知矿物图像集，开展最大 Softmax 概率、能量分数等开放集拒识评价。第五，结合 XRF、磁性或化验信息，形成 RGB 初筛与成分确认相结合的多模态工作流。</w:t>
       </w:r>
     </w:p>
     <w:tbl>
@@ -6949,7 +7836,7 @@
                 <w:color w:val="1F4E78"/>
                 <w:sz w:val="22"/>
               </w:rPr>
-              <w:t>建议的论文改进方向：</w:t>
+              <w:t>第一篇论文的建议主线：</w:t>
             </w:r>
             <w:r>
               <w:rPr>
@@ -6957,7 +7844,7 @@
                 <w:b w:val="0"/>
                 <w:sz w:val="22"/>
               </w:rPr>
-              <w:t>以本报告的角色感知困难负样本学习为论文方法原型，明确其降低两类高风险误入错误、但提高目标漏选的边界；进一步增加来源外测试和少量真实矿石外部验证，而不是继续堆叠常规模型。</w:t>
+              <w:t>以“面向钒钛矿相关矿物识别的分层角色一致性与困难负样本学习”为主线，严谨报告其对目标召回和困难干扰风险的取舍，并以组件消融、来源外测试与开放集评价支撑结论。阶段条件化选矿决策图需要真实流程、品位、回收率和专家确认的矿物—阶段—动作映射，当前仅作为后续研究方向，不写入本阶段方法效果结论。</w:t>
             </w:r>
           </w:p>
         </w:tc>
@@ -7106,6 +7993,27 @@
           <w:b w:val="0"/>
           <w:sz w:val="24"/>
         </w:rPr>
+        <w:t>矿物种类—选矿角色分层一致性模型将种类概率与角色概率联合约束，目标类召回提高，但困难干扰误入目标率也上升；当前应将其视为可量化的召回—风险取舍原型，而非已被证明的稳定性能改进。</w:t>
+      </w:r>
+    </w:p>
+    <w:p>
+      <w:pPr>
+        <w:spacing w:before="0" w:after="100" w:line="360" w:lineRule="auto"/>
+      </w:pPr>
+      <w:r>
+        <w:rPr>
+          <w:rFonts w:ascii="黑体" w:hAnsi="黑体" w:eastAsia="黑体"/>
+          <w:b/>
+          <w:sz w:val="24"/>
+        </w:rPr>
+        <w:t xml:space="preserve">7. </w:t>
+      </w:r>
+      <w:r>
+        <w:rPr>
+          <w:rFonts w:ascii="宋体" w:hAnsi="宋体" w:eastAsia="宋体"/>
+          <w:b w:val="0"/>
+          <w:sz w:val="24"/>
+        </w:rPr>
         <w:t>当前结果证明公开矿物标本图像可支撑钒钛矿相关组分矿物的视觉识别基线研究，但不等同于工业现场分选、精矿品位预测或回收率验证。</w:t>
       </w:r>
     </w:p>
@@ -7226,6 +8134,19 @@
           <w:sz w:val="21"/>
         </w:rPr>
         <w:t>[8] Mindat.org. The mineral and locality database[EB/OL]. https://www.mindat.org/.</w:t>
+      </w:r>
+    </w:p>
+    <w:p>
+      <w:pPr>
+        <w:spacing w:before="0" w:after="60" w:line="312" w:lineRule="auto"/>
+      </w:pPr>
+      <w:r>
+        <w:rPr>
+          <w:rFonts w:ascii="宋体" w:hAnsi="宋体" w:eastAsia="宋体"/>
+          <w:b w:val="0"/>
+          <w:sz w:val="21"/>
+        </w:rPr>
+        <w:t>[9] Iron Ore Image Recognition Through Multi-View Evolutionary Deep Fusion Method[J]. Future Internet, 2025, 17(12): 553. doi:10.3390/fi17120553.</w:t>
       </w:r>
     </w:p>
     <w:p>

</xml_diff>

<commit_message>
feat: add hierarchical component ablations
</commit_message>
<xml_diff>
--- a/结题/基于深度学习的钒钛矿相关矿物图像识别方法研究_技术报告（初稿）.docx
+++ b/结题/基于深度学习的钒钛矿相关矿物图像识别方法研究_技术报告（初稿）.docx
@@ -330,7 +330,7 @@
           <w:b w:val="0"/>
           <w:sz w:val="24"/>
         </w:rPr>
-        <w:t>在 8,529 张图像上，采用 ImageNet 预训练的 ResNet50 和 EfficientNet-B0 进行三随机种子重复训练。实验表明，EfficientNet-B0 的平均 Macro F1 为 72.87%±1.21%，ResNet50 为 72.06%±0.92%。脉石/废石类别最易识别，金属光泽干扰和含钛干扰是主要难点。三随机种子 Focal Loss 消融的平均 Macro F1 为 73.22%±0.83%，但其目标代理 F1 与金属光泽干扰误入目标指标未同时改善。进一步提出角色感知困难负样本学习：其平均 Macro F1 为 73.02%±1.09%，可降低含钛干扰和金属光泽干扰误入目标的比例，但伴随目标类漏选上升。基于已有 17 种细粒度矿物标签与四类选矿角色标签，进一步构建矿物种类—选矿角色分层一致性模型；其平均 Macro F1 为 73.41%±2.40%，目标代理召回率提高到 77.56%±2.19%，但两类困难干扰误入目标的比例同时上升，表明分层监督存在明确的召回—风险取舍，尚不能宣称其稳定优于基线。研究构建了可复现的公开标本图像源域验证流程，为后续采集真实钒钛矿颗粒图像、结合 XRF 或化验标签开展多模态识别与工业场景迁移奠定了基础。</w:t>
+        <w:t>在 8,529 张图像上，采用 ImageNet 预训练的 ResNet50 和 EfficientNet-B0 进行三随机种子重复训练。实验表明，EfficientNet-B0 的平均 Macro F1 为 72.87%±1.21%，ResNet50 为 72.06%±0.92%。脉石/废石类别最易识别，金属光泽干扰和含钛干扰是主要难点。三随机种子 Focal Loss 消融的平均 Macro F1 为 73.22%±0.83%，但其目标代理 F1 与金属光泽干扰误入目标指标未同时改善。进一步提出角色感知困难负样本学习：其平均 Macro F1 为 73.02%±1.09%，可降低含钛干扰和金属光泽干扰误入目标的比例，但伴随目标类漏选上升。基于已有 17 种细粒度矿物标签与四类选矿角色标签，进一步构建矿物种类—选矿角色分层一致性模型；其平均 Macro F1 为 73.41%±2.40%。针对该模型，分别去除困难负样本约束和层级一致性约束进行三随机种子组件消融：两种删减配置的总体 Macro F1 与完整模型接近，但完整模型的目标代理 F1 更高，并呈现较低的含钛干扰和金属光泽干扰误入目标比例。由于均值差仍与种子间波动相近，本报告将其作为风险改善趋势而非显著性能结论。研究构建了可复现的公开标本图像源域验证流程，为后续采集真实钒钛矿颗粒图像、结合 XRF 或化验标签开展多模态识别与工业场景迁移奠定了基础。</w:t>
       </w:r>
     </w:p>
     <w:p>
@@ -1072,7 +1072,7 @@
                 <w:b w:val="0"/>
                 <w:sz w:val="21"/>
               </w:rPr>
-              <w:t>混淆矩阵、错分对统计、三随机种子 Focal Loss 消融与角色感知困难负样本学习</w:t>
+              <w:t>混淆矩阵、错分对统计、三随机种子 Focal Loss 消融、角色感知学习和分层模型组件消融</w:t>
             </w:r>
           </w:p>
         </w:tc>
@@ -6654,7 +6654,704 @@
           <w:b w:val="0"/>
           <w:sz w:val="24"/>
         </w:rPr>
-        <w:t>分层模型在 17 类矿物种类头上的平均测试 Accuracy 为 56.80%±2.23%，而角色主任务的 Macro F1 为 73.41%±2.40%。这符合该数据的任务特点：网页主题矿物、伴生矿物与基质可能共存，细粒度种类标签更难由单张宏观图片稳定确定；但种类概率聚合后的角色信息仍可为粗粒度识别提供辅助。相较普通 EfficientNet-B0，分层模型把目标漏选率降低 5.58 个百分点、目标代理 F1 提高 1.59 个百分点，却使含钛干扰和金属光泽干扰误入目标的比例分别增加 1.09 和 2.84 个百分点。因此，本阶段结果只能支持“分层监督能改善目标类召回、但尚未满足困难负样本风险控制”的结论。下一步应进行种类损失、层级一致性损失、二分类辅助损失和困难负样本约束的组件消融，并在目标召回约束下优化困难干扰误入率。</w:t>
+        <w:t>分层模型在 17 类矿物种类头上的平均测试 Accuracy 为 56.80%±2.23%，而角色主任务的 Macro F1 为 73.41%±2.40%。这符合该数据的任务特点：网页主题矿物、伴生矿物与基质可能共存，细粒度种类标签更难由单张宏观图片稳定确定；但种类概率聚合后的角色信息仍可为粗粒度识别提供辅助。相较普通 EfficientNet-B0，分层模型把目标漏选率降低 5.58 个百分点、目标代理 F1 提高 1.59 个百分点，却使含钛干扰和金属光泽干扰误入目标的比例分别增加 1.09 和 2.84 个百分点。因此，本阶段结果只能支持“分层监督能改善目标类召回、但尚未满足困难负样本风险控制”的结论。为区分不同损失项的影响，进一步进行了层级一致性项与困难负样本约束项的三随机种子组件消融。</w:t>
+      </w:r>
+    </w:p>
+    <w:p>
+      <w:pPr>
+        <w:spacing w:before="240" w:after="120" w:line="288" w:lineRule="auto"/>
+        <w:keepNext/>
+      </w:pPr>
+      <w:r>
+        <w:rPr>
+          <w:rFonts w:ascii="黑体" w:hAnsi="黑体" w:eastAsia="黑体"/>
+          <w:b/>
+          <w:color w:val="1F4E78"/>
+          <w:sz w:val="28"/>
+        </w:rPr>
+        <w:t>5.8 分层模型组件消融</w:t>
+      </w:r>
+    </w:p>
+    <w:tbl>
+      <w:tblPr>
+        <w:tblW w:type="auto" w:w="0"/>
+        <w:jc w:val="center"/>
+        <w:tblLook w:firstColumn="1" w:firstRow="1" w:lastColumn="0" w:lastRow="0" w:noHBand="0" w:noVBand="1" w:val="04A0"/>
+        <w:tblLayout w:type="fixed"/>
+        <w:tblBorders>
+          <w:top w:val="single" w:sz="6" w:space="0" w:color="808080"/>
+          <w:left w:val="single" w:sz="6" w:space="0" w:color="808080"/>
+          <w:bottom w:val="single" w:sz="6" w:space="0" w:color="808080"/>
+          <w:right w:val="single" w:sz="6" w:space="0" w:color="808080"/>
+          <w:insideH w:val="single" w:sz="6" w:space="0" w:color="808080"/>
+          <w:insideV w:val="single" w:sz="6" w:space="0" w:color="808080"/>
+        </w:tblBorders>
+      </w:tblPr>
+      <w:tblGrid>
+        <w:gridCol w:w="1474"/>
+        <w:gridCol w:w="1474"/>
+        <w:gridCol w:w="1474"/>
+        <w:gridCol w:w="1474"/>
+        <w:gridCol w:w="1474"/>
+        <w:gridCol w:w="1474"/>
+      </w:tblGrid>
+      <w:tr>
+        <w:tc>
+          <w:tcPr>
+            <w:tcW w:type="dxa" w:w="1587"/>
+            <w:tcMar>
+              <w:top w:w="100" w:type="dxa"/>
+              <w:start w:w="120" w:type="dxa"/>
+              <w:bottom w:w="100" w:type="dxa"/>
+              <w:end w:w="120" w:type="dxa"/>
+            </w:tcMar>
+            <w:shd w:fill="E8EEF5"/>
+            <w:vAlign w:val="center"/>
+          </w:tcPr>
+          <w:p>
+            <w:pPr>
+              <w:spacing w:before="0" w:after="0" w:line="276" w:lineRule="auto"/>
+              <w:jc w:val="center"/>
+            </w:pPr>
+            <w:r>
+              <w:rPr>
+                <w:rFonts w:ascii="黑体" w:hAnsi="黑体" w:eastAsia="黑体"/>
+                <w:b/>
+                <w:sz w:val="17"/>
+              </w:rPr>
+              <w:t>设置</w:t>
+            </w:r>
+          </w:p>
+        </w:tc>
+        <w:tc>
+          <w:tcPr>
+            <w:tcW w:type="dxa" w:w="1360"/>
+            <w:tcMar>
+              <w:top w:w="100" w:type="dxa"/>
+              <w:start w:w="120" w:type="dxa"/>
+              <w:bottom w:w="100" w:type="dxa"/>
+              <w:end w:w="120" w:type="dxa"/>
+            </w:tcMar>
+            <w:shd w:fill="E8EEF5"/>
+            <w:vAlign w:val="center"/>
+          </w:tcPr>
+          <w:p>
+            <w:pPr>
+              <w:spacing w:before="0" w:after="0" w:line="276" w:lineRule="auto"/>
+              <w:jc w:val="center"/>
+            </w:pPr>
+            <w:r>
+              <w:rPr>
+                <w:rFonts w:ascii="黑体" w:hAnsi="黑体" w:eastAsia="黑体"/>
+                <w:b/>
+                <w:sz w:val="17"/>
+              </w:rPr>
+              <w:t>Macro F1（%）</w:t>
+            </w:r>
+          </w:p>
+        </w:tc>
+        <w:tc>
+          <w:tcPr>
+            <w:tcW w:type="dxa" w:w="1530"/>
+            <w:tcMar>
+              <w:top w:w="100" w:type="dxa"/>
+              <w:start w:w="120" w:type="dxa"/>
+              <w:bottom w:w="100" w:type="dxa"/>
+              <w:end w:w="120" w:type="dxa"/>
+            </w:tcMar>
+            <w:shd w:fill="E8EEF5"/>
+            <w:vAlign w:val="center"/>
+          </w:tcPr>
+          <w:p>
+            <w:pPr>
+              <w:spacing w:before="0" w:after="0" w:line="276" w:lineRule="auto"/>
+              <w:jc w:val="center"/>
+            </w:pPr>
+            <w:r>
+              <w:rPr>
+                <w:rFonts w:ascii="黑体" w:hAnsi="黑体" w:eastAsia="黑体"/>
+                <w:b/>
+                <w:sz w:val="17"/>
+              </w:rPr>
+              <w:t>目标代理 F1（%）</w:t>
+            </w:r>
+          </w:p>
+        </w:tc>
+        <w:tc>
+          <w:tcPr>
+            <w:tcW w:type="dxa" w:w="1474"/>
+            <w:tcMar>
+              <w:top w:w="100" w:type="dxa"/>
+              <w:start w:w="120" w:type="dxa"/>
+              <w:bottom w:w="100" w:type="dxa"/>
+              <w:end w:w="120" w:type="dxa"/>
+            </w:tcMar>
+            <w:shd w:fill="E8EEF5"/>
+            <w:vAlign w:val="center"/>
+          </w:tcPr>
+          <w:p>
+            <w:pPr>
+              <w:spacing w:before="0" w:after="0" w:line="276" w:lineRule="auto"/>
+              <w:jc w:val="center"/>
+            </w:pPr>
+            <w:r>
+              <w:rPr>
+                <w:rFonts w:ascii="黑体" w:hAnsi="黑体" w:eastAsia="黑体"/>
+                <w:b/>
+                <w:sz w:val="17"/>
+              </w:rPr>
+              <w:t>目标漏选率（%）</w:t>
+            </w:r>
+          </w:p>
+        </w:tc>
+        <w:tc>
+          <w:tcPr>
+            <w:tcW w:type="dxa" w:w="1871"/>
+            <w:tcMar>
+              <w:top w:w="100" w:type="dxa"/>
+              <w:start w:w="120" w:type="dxa"/>
+              <w:bottom w:w="100" w:type="dxa"/>
+              <w:end w:w="120" w:type="dxa"/>
+            </w:tcMar>
+            <w:shd w:fill="E8EEF5"/>
+            <w:vAlign w:val="center"/>
+          </w:tcPr>
+          <w:p>
+            <w:pPr>
+              <w:spacing w:before="0" w:after="0" w:line="276" w:lineRule="auto"/>
+              <w:jc w:val="center"/>
+            </w:pPr>
+            <w:r>
+              <w:rPr>
+                <w:rFonts w:ascii="黑体" w:hAnsi="黑体" w:eastAsia="黑体"/>
+                <w:b/>
+                <w:sz w:val="17"/>
+              </w:rPr>
+              <w:t>含钛干扰误入目标（%）</w:t>
+            </w:r>
+          </w:p>
+        </w:tc>
+        <w:tc>
+          <w:tcPr>
+            <w:tcW w:type="dxa" w:w="1984"/>
+            <w:tcMar>
+              <w:top w:w="100" w:type="dxa"/>
+              <w:start w:w="120" w:type="dxa"/>
+              <w:bottom w:w="100" w:type="dxa"/>
+              <w:end w:w="120" w:type="dxa"/>
+            </w:tcMar>
+            <w:shd w:fill="E8EEF5"/>
+            <w:vAlign w:val="center"/>
+          </w:tcPr>
+          <w:p>
+            <w:pPr>
+              <w:spacing w:before="0" w:after="0" w:line="276" w:lineRule="auto"/>
+              <w:jc w:val="center"/>
+            </w:pPr>
+            <w:r>
+              <w:rPr>
+                <w:rFonts w:ascii="黑体" w:hAnsi="黑体" w:eastAsia="黑体"/>
+                <w:b/>
+                <w:sz w:val="17"/>
+              </w:rPr>
+              <w:t>金属光泽干扰误入目标（%）</w:t>
+            </w:r>
+          </w:p>
+        </w:tc>
+      </w:tr>
+      <w:tr>
+        <w:tc>
+          <w:tcPr>
+            <w:tcW w:type="dxa" w:w="1587"/>
+            <w:tcMar>
+              <w:top w:w="100" w:type="dxa"/>
+              <w:start w:w="120" w:type="dxa"/>
+              <w:bottom w:w="100" w:type="dxa"/>
+              <w:end w:w="120" w:type="dxa"/>
+            </w:tcMar>
+            <w:vAlign w:val="center"/>
+          </w:tcPr>
+          <w:p>
+            <w:pPr>
+              <w:spacing w:before="0" w:after="0" w:line="276" w:lineRule="auto"/>
+              <w:jc w:val="center"/>
+            </w:pPr>
+            <w:r>
+              <w:rPr>
+                <w:rFonts w:ascii="宋体" w:hAnsi="宋体" w:eastAsia="宋体"/>
+                <w:b w:val="0"/>
+                <w:sz w:val="17"/>
+              </w:rPr>
+              <w:t>完整分层模型</w:t>
+            </w:r>
+          </w:p>
+        </w:tc>
+        <w:tc>
+          <w:tcPr>
+            <w:tcW w:type="dxa" w:w="1360"/>
+            <w:tcMar>
+              <w:top w:w="100" w:type="dxa"/>
+              <w:start w:w="120" w:type="dxa"/>
+              <w:bottom w:w="100" w:type="dxa"/>
+              <w:end w:w="120" w:type="dxa"/>
+            </w:tcMar>
+            <w:vAlign w:val="center"/>
+          </w:tcPr>
+          <w:p>
+            <w:pPr>
+              <w:spacing w:before="0" w:after="0" w:line="276" w:lineRule="auto"/>
+              <w:jc w:val="left"/>
+            </w:pPr>
+            <w:r>
+              <w:rPr>
+                <w:rFonts w:ascii="宋体" w:hAnsi="宋体" w:eastAsia="宋体"/>
+                <w:b w:val="0"/>
+                <w:sz w:val="17"/>
+              </w:rPr>
+              <w:t>73.41 ± 2.40</w:t>
+            </w:r>
+          </w:p>
+        </w:tc>
+        <w:tc>
+          <w:tcPr>
+            <w:tcW w:type="dxa" w:w="1530"/>
+            <w:tcMar>
+              <w:top w:w="100" w:type="dxa"/>
+              <w:start w:w="120" w:type="dxa"/>
+              <w:bottom w:w="100" w:type="dxa"/>
+              <w:end w:w="120" w:type="dxa"/>
+            </w:tcMar>
+            <w:vAlign w:val="center"/>
+          </w:tcPr>
+          <w:p>
+            <w:pPr>
+              <w:spacing w:before="0" w:after="0" w:line="276" w:lineRule="auto"/>
+              <w:jc w:val="left"/>
+            </w:pPr>
+            <w:r>
+              <w:rPr>
+                <w:rFonts w:ascii="宋体" w:hAnsi="宋体" w:eastAsia="宋体"/>
+                <w:b w:val="0"/>
+                <w:sz w:val="17"/>
+              </w:rPr>
+              <w:t>72.04 ± 2.05</w:t>
+            </w:r>
+          </w:p>
+        </w:tc>
+        <w:tc>
+          <w:tcPr>
+            <w:tcW w:type="dxa" w:w="1474"/>
+            <w:tcMar>
+              <w:top w:w="100" w:type="dxa"/>
+              <w:start w:w="120" w:type="dxa"/>
+              <w:bottom w:w="100" w:type="dxa"/>
+              <w:end w:w="120" w:type="dxa"/>
+            </w:tcMar>
+            <w:vAlign w:val="center"/>
+          </w:tcPr>
+          <w:p>
+            <w:pPr>
+              <w:spacing w:before="0" w:after="0" w:line="276" w:lineRule="auto"/>
+              <w:jc w:val="left"/>
+            </w:pPr>
+            <w:r>
+              <w:rPr>
+                <w:rFonts w:ascii="宋体" w:hAnsi="宋体" w:eastAsia="宋体"/>
+                <w:b w:val="0"/>
+                <w:sz w:val="17"/>
+              </w:rPr>
+              <w:t>22.44 ± 2.19</w:t>
+            </w:r>
+          </w:p>
+        </w:tc>
+        <w:tc>
+          <w:tcPr>
+            <w:tcW w:type="dxa" w:w="1871"/>
+            <w:tcMar>
+              <w:top w:w="100" w:type="dxa"/>
+              <w:start w:w="120" w:type="dxa"/>
+              <w:bottom w:w="100" w:type="dxa"/>
+              <w:end w:w="120" w:type="dxa"/>
+            </w:tcMar>
+            <w:vAlign w:val="center"/>
+          </w:tcPr>
+          <w:p>
+            <w:pPr>
+              <w:spacing w:before="0" w:after="0" w:line="276" w:lineRule="auto"/>
+              <w:jc w:val="left"/>
+            </w:pPr>
+            <w:r>
+              <w:rPr>
+                <w:rFonts w:ascii="宋体" w:hAnsi="宋体" w:eastAsia="宋体"/>
+                <w:b w:val="0"/>
+                <w:sz w:val="17"/>
+              </w:rPr>
+              <w:t>10.93 ± 3.37</w:t>
+            </w:r>
+          </w:p>
+        </w:tc>
+        <w:tc>
+          <w:tcPr>
+            <w:tcW w:type="dxa" w:w="1984"/>
+            <w:tcMar>
+              <w:top w:w="100" w:type="dxa"/>
+              <w:start w:w="120" w:type="dxa"/>
+              <w:bottom w:w="100" w:type="dxa"/>
+              <w:end w:w="120" w:type="dxa"/>
+            </w:tcMar>
+            <w:vAlign w:val="center"/>
+          </w:tcPr>
+          <w:p>
+            <w:pPr>
+              <w:spacing w:before="0" w:after="0" w:line="276" w:lineRule="auto"/>
+              <w:jc w:val="left"/>
+            </w:pPr>
+            <w:r>
+              <w:rPr>
+                <w:rFonts w:ascii="宋体" w:hAnsi="宋体" w:eastAsia="宋体"/>
+                <w:b w:val="0"/>
+                <w:sz w:val="17"/>
+              </w:rPr>
+              <w:t>14.39 ± 2.92</w:t>
+            </w:r>
+          </w:p>
+        </w:tc>
+      </w:tr>
+      <w:tr>
+        <w:tc>
+          <w:tcPr>
+            <w:tcW w:type="dxa" w:w="1587"/>
+            <w:tcMar>
+              <w:top w:w="100" w:type="dxa"/>
+              <w:start w:w="120" w:type="dxa"/>
+              <w:bottom w:w="100" w:type="dxa"/>
+              <w:end w:w="120" w:type="dxa"/>
+            </w:tcMar>
+            <w:vAlign w:val="center"/>
+          </w:tcPr>
+          <w:p>
+            <w:pPr>
+              <w:spacing w:before="0" w:after="0" w:line="276" w:lineRule="auto"/>
+              <w:jc w:val="center"/>
+            </w:pPr>
+            <w:r>
+              <w:rPr>
+                <w:rFonts w:ascii="宋体" w:hAnsi="宋体" w:eastAsia="宋体"/>
+                <w:b w:val="0"/>
+                <w:sz w:val="17"/>
+              </w:rPr>
+              <w:t>去除困难负样本约束</w:t>
+            </w:r>
+          </w:p>
+        </w:tc>
+        <w:tc>
+          <w:tcPr>
+            <w:tcW w:type="dxa" w:w="1360"/>
+            <w:tcMar>
+              <w:top w:w="100" w:type="dxa"/>
+              <w:start w:w="120" w:type="dxa"/>
+              <w:bottom w:w="100" w:type="dxa"/>
+              <w:end w:w="120" w:type="dxa"/>
+            </w:tcMar>
+            <w:vAlign w:val="center"/>
+          </w:tcPr>
+          <w:p>
+            <w:pPr>
+              <w:spacing w:before="0" w:after="0" w:line="276" w:lineRule="auto"/>
+              <w:jc w:val="left"/>
+            </w:pPr>
+            <w:r>
+              <w:rPr>
+                <w:rFonts w:ascii="宋体" w:hAnsi="宋体" w:eastAsia="宋体"/>
+                <w:b w:val="0"/>
+                <w:sz w:val="17"/>
+              </w:rPr>
+              <w:t>73.63 ± 2.08</w:t>
+            </w:r>
+          </w:p>
+        </w:tc>
+        <w:tc>
+          <w:tcPr>
+            <w:tcW w:type="dxa" w:w="1530"/>
+            <w:tcMar>
+              <w:top w:w="100" w:type="dxa"/>
+              <w:start w:w="120" w:type="dxa"/>
+              <w:bottom w:w="100" w:type="dxa"/>
+              <w:end w:w="120" w:type="dxa"/>
+            </w:tcMar>
+            <w:vAlign w:val="center"/>
+          </w:tcPr>
+          <w:p>
+            <w:pPr>
+              <w:spacing w:before="0" w:after="0" w:line="276" w:lineRule="auto"/>
+              <w:jc w:val="left"/>
+            </w:pPr>
+            <w:r>
+              <w:rPr>
+                <w:rFonts w:ascii="宋体" w:hAnsi="宋体" w:eastAsia="宋体"/>
+                <w:b w:val="0"/>
+                <w:sz w:val="17"/>
+              </w:rPr>
+              <w:t>71.62 ± 1.63</w:t>
+            </w:r>
+          </w:p>
+        </w:tc>
+        <w:tc>
+          <w:tcPr>
+            <w:tcW w:type="dxa" w:w="1474"/>
+            <w:tcMar>
+              <w:top w:w="100" w:type="dxa"/>
+              <w:start w:w="120" w:type="dxa"/>
+              <w:bottom w:w="100" w:type="dxa"/>
+              <w:end w:w="120" w:type="dxa"/>
+            </w:tcMar>
+            <w:vAlign w:val="center"/>
+          </w:tcPr>
+          <w:p>
+            <w:pPr>
+              <w:spacing w:before="0" w:after="0" w:line="276" w:lineRule="auto"/>
+              <w:jc w:val="left"/>
+            </w:pPr>
+            <w:r>
+              <w:rPr>
+                <w:rFonts w:ascii="宋体" w:hAnsi="宋体" w:eastAsia="宋体"/>
+                <w:b w:val="0"/>
+                <w:sz w:val="17"/>
+              </w:rPr>
+              <w:t>22.44 ± 2.40</w:t>
+            </w:r>
+          </w:p>
+        </w:tc>
+        <w:tc>
+          <w:tcPr>
+            <w:tcW w:type="dxa" w:w="1871"/>
+            <w:tcMar>
+              <w:top w:w="100" w:type="dxa"/>
+              <w:start w:w="120" w:type="dxa"/>
+              <w:bottom w:w="100" w:type="dxa"/>
+              <w:end w:w="120" w:type="dxa"/>
+            </w:tcMar>
+            <w:vAlign w:val="center"/>
+          </w:tcPr>
+          <w:p>
+            <w:pPr>
+              <w:spacing w:before="0" w:after="0" w:line="276" w:lineRule="auto"/>
+              <w:jc w:val="left"/>
+            </w:pPr>
+            <w:r>
+              <w:rPr>
+                <w:rFonts w:ascii="宋体" w:hAnsi="宋体" w:eastAsia="宋体"/>
+                <w:b w:val="0"/>
+                <w:sz w:val="17"/>
+              </w:rPr>
+              <w:t>11.47 ± 2.59</w:t>
+            </w:r>
+          </w:p>
+        </w:tc>
+        <w:tc>
+          <w:tcPr>
+            <w:tcW w:type="dxa" w:w="1984"/>
+            <w:tcMar>
+              <w:top w:w="100" w:type="dxa"/>
+              <w:start w:w="120" w:type="dxa"/>
+              <w:bottom w:w="100" w:type="dxa"/>
+              <w:end w:w="120" w:type="dxa"/>
+            </w:tcMar>
+            <w:vAlign w:val="center"/>
+          </w:tcPr>
+          <w:p>
+            <w:pPr>
+              <w:spacing w:before="0" w:after="0" w:line="276" w:lineRule="auto"/>
+              <w:jc w:val="left"/>
+            </w:pPr>
+            <w:r>
+              <w:rPr>
+                <w:rFonts w:ascii="宋体" w:hAnsi="宋体" w:eastAsia="宋体"/>
+                <w:b w:val="0"/>
+                <w:sz w:val="17"/>
+              </w:rPr>
+              <w:t>14.96 ± 2.56</w:t>
+            </w:r>
+          </w:p>
+        </w:tc>
+      </w:tr>
+      <w:tr>
+        <w:tc>
+          <w:tcPr>
+            <w:tcW w:type="dxa" w:w="1587"/>
+            <w:tcMar>
+              <w:top w:w="100" w:type="dxa"/>
+              <w:start w:w="120" w:type="dxa"/>
+              <w:bottom w:w="100" w:type="dxa"/>
+              <w:end w:w="120" w:type="dxa"/>
+            </w:tcMar>
+            <w:vAlign w:val="center"/>
+          </w:tcPr>
+          <w:p>
+            <w:pPr>
+              <w:spacing w:before="0" w:after="0" w:line="276" w:lineRule="auto"/>
+              <w:jc w:val="center"/>
+            </w:pPr>
+            <w:r>
+              <w:rPr>
+                <w:rFonts w:ascii="宋体" w:hAnsi="宋体" w:eastAsia="宋体"/>
+                <w:b w:val="0"/>
+                <w:sz w:val="17"/>
+              </w:rPr>
+              <w:t>去除层级一致性约束</w:t>
+            </w:r>
+          </w:p>
+        </w:tc>
+        <w:tc>
+          <w:tcPr>
+            <w:tcW w:type="dxa" w:w="1360"/>
+            <w:tcMar>
+              <w:top w:w="100" w:type="dxa"/>
+              <w:start w:w="120" w:type="dxa"/>
+              <w:bottom w:w="100" w:type="dxa"/>
+              <w:end w:w="120" w:type="dxa"/>
+            </w:tcMar>
+            <w:vAlign w:val="center"/>
+          </w:tcPr>
+          <w:p>
+            <w:pPr>
+              <w:spacing w:before="0" w:after="0" w:line="276" w:lineRule="auto"/>
+              <w:jc w:val="left"/>
+            </w:pPr>
+            <w:r>
+              <w:rPr>
+                <w:rFonts w:ascii="宋体" w:hAnsi="宋体" w:eastAsia="宋体"/>
+                <w:b w:val="0"/>
+                <w:sz w:val="17"/>
+              </w:rPr>
+              <w:t>73.40 ± 2.34</w:t>
+            </w:r>
+          </w:p>
+        </w:tc>
+        <w:tc>
+          <w:tcPr>
+            <w:tcW w:type="dxa" w:w="1530"/>
+            <w:tcMar>
+              <w:top w:w="100" w:type="dxa"/>
+              <w:start w:w="120" w:type="dxa"/>
+              <w:bottom w:w="100" w:type="dxa"/>
+              <w:end w:w="120" w:type="dxa"/>
+            </w:tcMar>
+            <w:vAlign w:val="center"/>
+          </w:tcPr>
+          <w:p>
+            <w:pPr>
+              <w:spacing w:before="0" w:after="0" w:line="276" w:lineRule="auto"/>
+              <w:jc w:val="left"/>
+            </w:pPr>
+            <w:r>
+              <w:rPr>
+                <w:rFonts w:ascii="宋体" w:hAnsi="宋体" w:eastAsia="宋体"/>
+                <w:b w:val="0"/>
+                <w:sz w:val="17"/>
+              </w:rPr>
+              <w:t>70.92 ± 0.60</w:t>
+            </w:r>
+          </w:p>
+        </w:tc>
+        <w:tc>
+          <w:tcPr>
+            <w:tcW w:type="dxa" w:w="1474"/>
+            <w:tcMar>
+              <w:top w:w="100" w:type="dxa"/>
+              <w:start w:w="120" w:type="dxa"/>
+              <w:bottom w:w="100" w:type="dxa"/>
+              <w:end w:w="120" w:type="dxa"/>
+            </w:tcMar>
+            <w:vAlign w:val="center"/>
+          </w:tcPr>
+          <w:p>
+            <w:pPr>
+              <w:spacing w:before="0" w:after="0" w:line="276" w:lineRule="auto"/>
+              <w:jc w:val="left"/>
+            </w:pPr>
+            <w:r>
+              <w:rPr>
+                <w:rFonts w:ascii="宋体" w:hAnsi="宋体" w:eastAsia="宋体"/>
+                <w:b w:val="0"/>
+                <w:sz w:val="17"/>
+              </w:rPr>
+              <w:t>22.84 ± 3.70</w:t>
+            </w:r>
+          </w:p>
+        </w:tc>
+        <w:tc>
+          <w:tcPr>
+            <w:tcW w:type="dxa" w:w="1871"/>
+            <w:tcMar>
+              <w:top w:w="100" w:type="dxa"/>
+              <w:start w:w="120" w:type="dxa"/>
+              <w:bottom w:w="100" w:type="dxa"/>
+              <w:end w:w="120" w:type="dxa"/>
+            </w:tcMar>
+            <w:vAlign w:val="center"/>
+          </w:tcPr>
+          <w:p>
+            <w:pPr>
+              <w:spacing w:before="0" w:after="0" w:line="276" w:lineRule="auto"/>
+              <w:jc w:val="left"/>
+            </w:pPr>
+            <w:r>
+              <w:rPr>
+                <w:rFonts w:ascii="宋体" w:hAnsi="宋体" w:eastAsia="宋体"/>
+                <w:b w:val="0"/>
+                <w:sz w:val="17"/>
+              </w:rPr>
+              <w:t>12.02 ± 2.16</w:t>
+            </w:r>
+          </w:p>
+        </w:tc>
+        <w:tc>
+          <w:tcPr>
+            <w:tcW w:type="dxa" w:w="1984"/>
+            <w:tcMar>
+              <w:top w:w="100" w:type="dxa"/>
+              <w:start w:w="120" w:type="dxa"/>
+              <w:bottom w:w="100" w:type="dxa"/>
+              <w:end w:w="120" w:type="dxa"/>
+            </w:tcMar>
+            <w:vAlign w:val="center"/>
+          </w:tcPr>
+          <w:p>
+            <w:pPr>
+              <w:spacing w:before="0" w:after="0" w:line="276" w:lineRule="auto"/>
+              <w:jc w:val="left"/>
+            </w:pPr>
+            <w:r>
+              <w:rPr>
+                <w:rFonts w:ascii="宋体" w:hAnsi="宋体" w:eastAsia="宋体"/>
+                <w:b w:val="0"/>
+                <w:sz w:val="17"/>
+              </w:rPr>
+              <w:t>14.77 ± 3.41</w:t>
+            </w:r>
+          </w:p>
+        </w:tc>
+      </w:tr>
+    </w:tbl>
+    <w:p>
+      <w:pPr>
+        <w:spacing w:after="60"/>
+      </w:pPr>
+    </w:p>
+    <w:p>
+      <w:pPr>
+        <w:spacing w:before="0" w:after="100" w:line="360" w:lineRule="auto"/>
+        <w:ind w:firstLine="420"/>
+        <w:jc w:val="both"/>
+      </w:pPr>
+      <w:r>
+        <w:rPr>
+          <w:rFonts w:ascii="宋体" w:hAnsi="宋体" w:eastAsia="宋体"/>
+          <w:b w:val="0"/>
+          <w:sz w:val="24"/>
+        </w:rPr>
+        <w:t>组件消融表明，移除困难负样本约束后，Macro F1 的均值反而上升 0.21 个百分点，但目标代理 F1 下降 0.41 个百分点，含钛干扰和金属光泽干扰误入目标比例分别上升 0.54 和 0.57 个百分点；这说明该约束更可能作用于关键负样本风险，而非提升总体平均分。移除层级一致性约束后，Macro F1 基本不变，但目标代理 F1 下降 1.12 个百分点，目标漏选率、含钛干扰误入目标率和金属光泽干扰误入目标率均上升。由于每组仅含三个随机种子、均值差与样本标准差仍同量级，以上结果只能支持风险指标上的一致方向趋势，不得表述为统计显著或稳定领先。</w:t>
       </w:r>
     </w:p>
     <w:p>
@@ -7185,7 +7882,7 @@
                 <w:b w:val="0"/>
                 <w:sz w:val="20"/>
               </w:rPr>
-              <w:t>利用已保留的 17 类种类标签与四类角色映射，在共享视觉表征上联合种类、角色和目标代理任务；结果揭示了目标召回改善与困难负样本风险上升的可量化取舍。</w:t>
+              <w:t>利用已保留的 17 类种类标签与四类角色映射，在共享视觉表征上联合种类、角色和目标代理任务；并通过两项三随机种子组件消融，报告其总体分数与关键风险指标的可量化取舍。</w:t>
             </w:r>
           </w:p>
         </w:tc>
@@ -7728,7 +8425,7 @@
                 <w:b w:val="0"/>
                 <w:sz w:val="19"/>
               </w:rPr>
-              <w:t>角色感知和分层模型的均值提升均小于或接近种子间波动；分层模型还提高困难干扰误入目标率</w:t>
+              <w:t>分层模型的两项组件消融显示关键风险指标存在改善方向，但总体分数差异仍小于或接近种子间波动</w:t>
             </w:r>
           </w:p>
         </w:tc>
@@ -7754,7 +8451,7 @@
                 <w:b w:val="0"/>
                 <w:sz w:val="19"/>
               </w:rPr>
-              <w:t>报告取舍而非宣称稳定领先，补做组件消融与受约束风险优化</w:t>
+              <w:t>报告取舍而非宣称稳定领先，后续在目标召回约束下做风险优化和来源外验证</w:t>
             </w:r>
           </w:p>
         </w:tc>
@@ -7792,7 +8489,7 @@
           <w:b w:val="0"/>
           <w:sz w:val="24"/>
         </w:rPr>
-        <w:t>第一，优先补充经过审核的钛磁铁矿样本，或采集少量由专家/化验确认的真实钒钛矿颗粒图像，用于建立外部测试集。第二，回填可获得的产地、摄影者、收藏机构或页面来源信息，构建按来源留出的严格泛化评价。第三，围绕分层模型开展组件消融：分别移除种类交叉熵、层级一致性、目标代理辅助头和困难负样本约束，并在目标召回率达到预设下限时最小化含钛、金属光泽干扰误入目标率。第四，建立独立未知矿物图像集，开展最大 Softmax 概率、能量分数等开放集拒识评价。第五，结合 XRF、磁性或化验信息，形成 RGB 初筛与成分确认相结合的多模态工作流。</w:t>
+        <w:t>第一，优先补充经过审核的钛磁铁矿样本，或采集少量由专家/化验确认的真实钒钛矿颗粒图像，用于建立外部测试集。第二，回填可获得的产地、摄影者、收藏机构或页面来源信息，构建按来源留出的严格泛化评价。第三，在已完成的一致性项和困难负样本项消融基础上，继续考察种类交叉熵、目标代理辅助头的影响，并在目标召回率达到预设下限时最小化含钛、金属光泽干扰误入目标率。第四，建立独立未知矿物图像集，开展最大 Softmax 概率、能量分数等开放集拒识评价。第五，结合 XRF、磁性或化验信息，形成 RGB 初筛与成分确认相结合的多模态工作流。</w:t>
       </w:r>
     </w:p>
     <w:tbl>
@@ -7993,7 +8690,7 @@
           <w:b w:val="0"/>
           <w:sz w:val="24"/>
         </w:rPr>
-        <w:t>矿物种类—选矿角色分层一致性模型将种类概率与角色概率联合约束，目标类召回提高，但困难干扰误入目标率也上升；当前应将其视为可量化的召回—风险取舍原型，而非已被证明的稳定性能改进。</w:t>
+        <w:t>矿物种类—选矿角色分层一致性模型将种类概率与角色概率联合约束。两项三随机种子组件消融显示：去除一致性或困难负样本约束后，完整模型在目标代理 F1 和两类关键干扰误入目标风险上均呈更优方向，但总体 Macro F1 差异仍与种子间波动相近；当前应将其视为可量化的风险改善趋势，而非已被证明的稳定性能改进。</w:t>
       </w:r>
     </w:p>
     <w:p>

</xml_diff>

<commit_message>
docs: add theory validation to technical report
</commit_message>
<xml_diff>
--- a/结题/基于深度学习的钒钛矿相关矿物图像识别方法研究_技术报告（初稿）.docx
+++ b/结题/基于深度学习的钒钛矿相关矿物图像识别方法研究_技术报告（初稿）.docx
@@ -330,7 +330,7 @@
           <w:b w:val="0"/>
           <w:sz w:val="24"/>
         </w:rPr>
-        <w:t>在 8,529 张图像上，采用 ImageNet 预训练的 ResNet50 和 EfficientNet-B0 进行三随机种子重复训练。实验表明，EfficientNet-B0 的平均 Macro F1 为 72.87%±1.21%，ResNet50 为 72.06%±0.92%。脉石/废石类别最易识别，金属光泽干扰和含钛干扰是主要难点。三随机种子 Focal Loss 消融的平均 Macro F1 为 73.22%±0.83%，但其目标代理 F1 与金属光泽干扰误入目标指标未同时改善。进一步提出角色感知困难负样本学习：其平均 Macro F1 为 73.02%±1.09%，可降低含钛干扰和金属光泽干扰误入目标的比例，但伴随目标类漏选上升。基于已有 17 种细粒度矿物标签与四类选矿角色标签，进一步构建矿物种类—选矿角色分层一致性模型；其平均 Macro F1 为 73.41%±2.40%。针对该模型，分别去除困难负样本约束和层级一致性约束进行三随机种子组件消融：两种删减配置的总体 Macro F1 与完整模型接近，但完整模型的目标代理 F1 更高，并呈现较低的含钛干扰和金属光泽干扰误入目标比例。由于均值差仍与种子间波动相近，本报告将其作为风险改善趋势而非显著性能结论。研究构建了可复现的公开标本图像源域验证流程，为后续采集真实钒钛矿颗粒图像、结合 XRF 或化验标签开展多模态识别与工业场景迁移奠定了基础。</w:t>
+        <w:t>在 8,529 张图像上，采用 ImageNet 预训练的 ResNet50 和 EfficientNet-B0 进行三随机种子重复训练。实验表明，EfficientNet-B0 的平均 Macro F1 为 72.87%±1.21%，ResNet50 为 72.06%±0.92%。进一步以 17 类矿物种类和四类选矿角色的固定映射为基础，对共享视觉特征上的角色头、种类头、目标代理头和投影头进行理论化分层建模，并使用种类概率到角色概率的聚合与 KL 一致性约束。受控逻辑条件验证中，48 个角色一致候选集的角色唯一可识别率为 100.00%，51 个角色冲突候选集为 0.00%；该实验不使用图像标签推断或模型预测。固定测试划分上的选择性识别结果显示，阈值 0.90 时三随机种子平均覆盖率为 60.88%，保留样本错误率为 11.71%。这些结果仅支持理论形式化、受控逻辑验证和固定划分上的覆盖率—风险取舍，不构成工业分选、品位/回收率、真实 XRF 成本最优、外部验证或统计显著性结论。</w:t>
       </w:r>
     </w:p>
     <w:p>
@@ -3151,7 +3151,7 @@
           <w:color w:val="1F4E78"/>
           <w:sz w:val="28"/>
         </w:rPr>
-        <w:t>4.5 矿物种类—选矿角色分层一致性模型</w:t>
+        <w:t>4.5 理论模型与符号定义</w:t>
       </w:r>
     </w:p>
     <w:p>
@@ -3166,7 +3166,7 @@
           <w:b w:val="0"/>
           <w:sz w:val="24"/>
         </w:rPr>
-        <w:t>在现有四分类角色标签之外，数据清单还保留了 17 类细粒度 mineral_label。基于这一已有事实标签，构建共享 EfficientNet-B0 主干的分层模型：一条分支输出四类选矿角色，另一条分支输出 17 类矿物种类，同时设置目标代理/非目标代理辅助头。将种类概率按预先定义的“种类—角色”映射聚合为角色概率，并以 Kullback-Leibler 散度约束其与角色头输出保持一致。训练总损失由角色加权交叉熵、种类交叉熵、目标代理二分类损失、分层一致性损失和困难负样本表示分离项构成。该模型研究的是公开图像标签层级能否改善视觉表征，不将其解释为矿物化学成分或实际分选动作预测。</w:t>
+        <w:t>在现有四分类角色标签之外，数据清单还保留了 17 类细粒度 mineral_label。理论感知分层模型以 EfficientNet-B0 产生共享视觉特征 h，并从同一特征并列导出角色头、种类头、目标代理二分类头和投影头；各输出头之间不存在串联依赖。种类—角色关系仅通过固定映射矩阵 A 对种类概率进行聚合，得到角色层概率，而不是把一个输出头直接作为另一个输出头的输入。</w:t>
       </w:r>
     </w:p>
     <w:p>
@@ -3177,7 +3177,7 @@
       <w:r>
         <w:drawing>
           <wp:inline xmlns:a="http://schemas.openxmlformats.org/drawingml/2006/main" xmlns:pic="http://schemas.openxmlformats.org/drawingml/2006/picture">
-            <wp:extent cx="5544000" cy="2740224"/>
+            <wp:extent cx="5544000" cy="3252894"/>
             <wp:docPr id="2" name="Picture 2"/>
             <wp:cNvGraphicFramePr>
               <a:graphicFrameLocks noChangeAspect="1"/>
@@ -3186,7 +3186,7 @@
               <a:graphicData uri="http://schemas.openxmlformats.org/drawingml/2006/picture">
                 <pic:pic>
                   <pic:nvPicPr>
-                    <pic:cNvPr id="0" name="fig8_hierarchical_architecture.png"/>
+                    <pic:cNvPr id="0" name="fig10_theory_aware_hierarchical_architecture_cn.png"/>
                     <pic:cNvPicPr/>
                   </pic:nvPicPr>
                   <pic:blipFill>
@@ -3198,7 +3198,7 @@
                   <pic:spPr>
                     <a:xfrm>
                       <a:off x="0" y="0"/>
-                      <a:ext cx="5544000" cy="2740224"/>
+                      <a:ext cx="5544000" cy="3252894"/>
                     </a:xfrm>
                     <a:prstGeom prst="rect"/>
                   </pic:spPr>
@@ -3220,7 +3220,910 @@
           <w:b w:val="0"/>
           <w:sz w:val="21"/>
         </w:rPr>
-        <w:t>图 2 矿物种类—选矿角色分层一致性模型结构</w:t>
+        <w:t>图 2 理论感知分层识别模型结构：共享视觉特征、四个并列输出头与种类到角色的概率聚合</w:t>
+      </w:r>
+    </w:p>
+    <w:tbl>
+      <w:tblPr>
+        <w:tblW w:type="auto" w:w="0"/>
+        <w:jc w:val="center"/>
+        <w:tblLook w:firstColumn="1" w:firstRow="1" w:lastColumn="0" w:lastRow="0" w:noHBand="0" w:noVBand="1" w:val="04A0"/>
+        <w:tblLayout w:type="fixed"/>
+        <w:tblBorders>
+          <w:top w:val="single" w:sz="6" w:space="0" w:color="808080"/>
+          <w:left w:val="single" w:sz="6" w:space="0" w:color="808080"/>
+          <w:bottom w:val="single" w:sz="6" w:space="0" w:color="808080"/>
+          <w:right w:val="single" w:sz="6" w:space="0" w:color="808080"/>
+          <w:insideH w:val="single" w:sz="6" w:space="0" w:color="808080"/>
+          <w:insideV w:val="single" w:sz="6" w:space="0" w:color="808080"/>
+        </w:tblBorders>
+      </w:tblPr>
+      <w:tblGrid>
+        <w:gridCol w:w="4422"/>
+        <w:gridCol w:w="4422"/>
+      </w:tblGrid>
+      <w:tr>
+        <w:tc>
+          <w:tcPr>
+            <w:tcW w:type="dxa" w:w="1701"/>
+            <w:tcMar>
+              <w:top w:w="100" w:type="dxa"/>
+              <w:start w:w="120" w:type="dxa"/>
+              <w:bottom w:w="100" w:type="dxa"/>
+              <w:end w:w="120" w:type="dxa"/>
+            </w:tcMar>
+            <w:shd w:fill="E8EEF5"/>
+            <w:vAlign w:val="center"/>
+          </w:tcPr>
+          <w:p>
+            <w:pPr>
+              <w:spacing w:before="0" w:after="0" w:line="276" w:lineRule="auto"/>
+              <w:jc w:val="center"/>
+            </w:pPr>
+            <w:r>
+              <w:rPr>
+                <w:rFonts w:ascii="黑体" w:hAnsi="黑体" w:eastAsia="黑体"/>
+                <w:b/>
+                <w:sz w:val="20"/>
+              </w:rPr>
+              <w:t>符号</w:t>
+            </w:r>
+          </w:p>
+        </w:tc>
+        <w:tc>
+          <w:tcPr>
+            <w:tcW w:type="dxa" w:w="6293"/>
+            <w:tcMar>
+              <w:top w:w="100" w:type="dxa"/>
+              <w:start w:w="120" w:type="dxa"/>
+              <w:bottom w:w="100" w:type="dxa"/>
+              <w:end w:w="120" w:type="dxa"/>
+            </w:tcMar>
+            <w:shd w:fill="E8EEF5"/>
+            <w:vAlign w:val="center"/>
+          </w:tcPr>
+          <w:p>
+            <w:pPr>
+              <w:spacing w:before="0" w:after="0" w:line="276" w:lineRule="auto"/>
+              <w:jc w:val="center"/>
+            </w:pPr>
+            <w:r>
+              <w:rPr>
+                <w:rFonts w:ascii="黑体" w:hAnsi="黑体" w:eastAsia="黑体"/>
+                <w:b/>
+                <w:sz w:val="20"/>
+              </w:rPr>
+              <w:t>定义</w:t>
+            </w:r>
+          </w:p>
+        </w:tc>
+      </w:tr>
+      <w:tr>
+        <w:tc>
+          <w:tcPr>
+            <w:tcW w:type="dxa" w:w="1701"/>
+            <w:tcMar>
+              <w:top w:w="100" w:type="dxa"/>
+              <w:start w:w="120" w:type="dxa"/>
+              <w:bottom w:w="100" w:type="dxa"/>
+              <w:end w:w="120" w:type="dxa"/>
+            </w:tcMar>
+            <w:vAlign w:val="center"/>
+          </w:tcPr>
+          <w:p>
+            <w:pPr>
+              <w:spacing w:before="0" w:after="0" w:line="276" w:lineRule="auto"/>
+              <w:jc w:val="center"/>
+            </w:pPr>
+            <w:r>
+              <w:rPr>
+                <w:rFonts w:ascii="宋体" w:hAnsi="宋体" w:eastAsia="宋体"/>
+                <w:b w:val="0"/>
+                <w:sz w:val="20"/>
+              </w:rPr>
+              <w:t>x</w:t>
+            </w:r>
+          </w:p>
+        </w:tc>
+        <w:tc>
+          <w:tcPr>
+            <w:tcW w:type="dxa" w:w="6293"/>
+            <w:tcMar>
+              <w:top w:w="100" w:type="dxa"/>
+              <w:start w:w="120" w:type="dxa"/>
+              <w:bottom w:w="100" w:type="dxa"/>
+              <w:end w:w="120" w:type="dxa"/>
+            </w:tcMar>
+            <w:vAlign w:val="center"/>
+          </w:tcPr>
+          <w:p>
+            <w:pPr>
+              <w:spacing w:before="0" w:after="0" w:line="276" w:lineRule="auto"/>
+              <w:jc w:val="left"/>
+            </w:pPr>
+            <w:r>
+              <w:rPr>
+                <w:rFonts w:ascii="宋体" w:hAnsi="宋体" w:eastAsia="宋体"/>
+                <w:b w:val="0"/>
+                <w:sz w:val="20"/>
+              </w:rPr>
+              <w:t>输入矿物图像</w:t>
+            </w:r>
+          </w:p>
+        </w:tc>
+      </w:tr>
+      <w:tr>
+        <w:tc>
+          <w:tcPr>
+            <w:tcW w:type="dxa" w:w="1701"/>
+            <w:tcMar>
+              <w:top w:w="100" w:type="dxa"/>
+              <w:start w:w="120" w:type="dxa"/>
+              <w:bottom w:w="100" w:type="dxa"/>
+              <w:end w:w="120" w:type="dxa"/>
+            </w:tcMar>
+            <w:vAlign w:val="center"/>
+          </w:tcPr>
+          <w:p>
+            <w:pPr>
+              <w:spacing w:before="0" w:after="0" w:line="276" w:lineRule="auto"/>
+              <w:jc w:val="center"/>
+            </w:pPr>
+            <w:r>
+              <w:rPr>
+                <w:rFonts w:ascii="宋体" w:hAnsi="宋体" w:eastAsia="宋体"/>
+                <w:b w:val="0"/>
+                <w:sz w:val="20"/>
+              </w:rPr>
+              <w:t>S</w:t>
+            </w:r>
+          </w:p>
+        </w:tc>
+        <w:tc>
+          <w:tcPr>
+            <w:tcW w:type="dxa" w:w="6293"/>
+            <w:tcMar>
+              <w:top w:w="100" w:type="dxa"/>
+              <w:start w:w="120" w:type="dxa"/>
+              <w:bottom w:w="100" w:type="dxa"/>
+              <w:end w:w="120" w:type="dxa"/>
+            </w:tcMar>
+            <w:vAlign w:val="center"/>
+          </w:tcPr>
+          <w:p>
+            <w:pPr>
+              <w:spacing w:before="0" w:after="0" w:line="276" w:lineRule="auto"/>
+              <w:jc w:val="left"/>
+            </w:pPr>
+            <w:r>
+              <w:rPr>
+                <w:rFonts w:ascii="宋体" w:hAnsi="宋体" w:eastAsia="宋体"/>
+                <w:b w:val="0"/>
+                <w:sz w:val="20"/>
+              </w:rPr>
+              <w:t>细粒度矿物种类集合，当前包含 17 类</w:t>
+            </w:r>
+          </w:p>
+        </w:tc>
+      </w:tr>
+      <w:tr>
+        <w:tc>
+          <w:tcPr>
+            <w:tcW w:type="dxa" w:w="1701"/>
+            <w:tcMar>
+              <w:top w:w="100" w:type="dxa"/>
+              <w:start w:w="120" w:type="dxa"/>
+              <w:bottom w:w="100" w:type="dxa"/>
+              <w:end w:w="120" w:type="dxa"/>
+            </w:tcMar>
+            <w:vAlign w:val="center"/>
+          </w:tcPr>
+          <w:p>
+            <w:pPr>
+              <w:spacing w:before="0" w:after="0" w:line="276" w:lineRule="auto"/>
+              <w:jc w:val="center"/>
+            </w:pPr>
+            <w:r>
+              <w:rPr>
+                <w:rFonts w:ascii="宋体" w:hAnsi="宋体" w:eastAsia="宋体"/>
+                <w:b w:val="0"/>
+                <w:sz w:val="20"/>
+              </w:rPr>
+              <w:t>R</w:t>
+            </w:r>
+          </w:p>
+        </w:tc>
+        <w:tc>
+          <w:tcPr>
+            <w:tcW w:type="dxa" w:w="6293"/>
+            <w:tcMar>
+              <w:top w:w="100" w:type="dxa"/>
+              <w:start w:w="120" w:type="dxa"/>
+              <w:bottom w:w="100" w:type="dxa"/>
+              <w:end w:w="120" w:type="dxa"/>
+            </w:tcMar>
+            <w:vAlign w:val="center"/>
+          </w:tcPr>
+          <w:p>
+            <w:pPr>
+              <w:spacing w:before="0" w:after="0" w:line="276" w:lineRule="auto"/>
+              <w:jc w:val="left"/>
+            </w:pPr>
+            <w:r>
+              <w:rPr>
+                <w:rFonts w:ascii="宋体" w:hAnsi="宋体" w:eastAsia="宋体"/>
+                <w:b w:val="0"/>
+                <w:sz w:val="20"/>
+              </w:rPr>
+              <w:t>选矿角色集合，当前包含目标、含钛干扰、脉石/废石和金属光泽干扰四类</w:t>
+            </w:r>
+          </w:p>
+        </w:tc>
+      </w:tr>
+      <w:tr>
+        <w:tc>
+          <w:tcPr>
+            <w:tcW w:type="dxa" w:w="1701"/>
+            <w:tcMar>
+              <w:top w:w="100" w:type="dxa"/>
+              <w:start w:w="120" w:type="dxa"/>
+              <w:bottom w:w="100" w:type="dxa"/>
+              <w:end w:w="120" w:type="dxa"/>
+            </w:tcMar>
+            <w:vAlign w:val="center"/>
+          </w:tcPr>
+          <w:p>
+            <w:pPr>
+              <w:spacing w:before="0" w:after="0" w:line="276" w:lineRule="auto"/>
+              <w:jc w:val="center"/>
+            </w:pPr>
+            <w:r>
+              <w:rPr>
+                <w:rFonts w:ascii="宋体" w:hAnsi="宋体" w:eastAsia="宋体"/>
+                <w:b w:val="0"/>
+                <w:sz w:val="20"/>
+              </w:rPr>
+              <w:t>A</w:t>
+            </w:r>
+          </w:p>
+        </w:tc>
+        <w:tc>
+          <w:tcPr>
+            <w:tcW w:type="dxa" w:w="6293"/>
+            <w:tcMar>
+              <w:top w:w="100" w:type="dxa"/>
+              <w:start w:w="120" w:type="dxa"/>
+              <w:bottom w:w="100" w:type="dxa"/>
+              <w:end w:w="120" w:type="dxa"/>
+            </w:tcMar>
+            <w:vAlign w:val="center"/>
+          </w:tcPr>
+          <w:p>
+            <w:pPr>
+              <w:spacing w:before="0" w:after="0" w:line="276" w:lineRule="auto"/>
+              <w:jc w:val="left"/>
+            </w:pPr>
+            <w:r>
+              <w:rPr>
+                <w:rFonts w:ascii="宋体" w:hAnsi="宋体" w:eastAsia="宋体"/>
+                <w:b w:val="0"/>
+                <w:sz w:val="20"/>
+              </w:rPr>
+              <w:t>固定的种类—角色映射矩阵，A 的每一列仅对应一个角色</w:t>
+            </w:r>
+          </w:p>
+        </w:tc>
+      </w:tr>
+      <w:tr>
+        <w:tc>
+          <w:tcPr>
+            <w:tcW w:type="dxa" w:w="1701"/>
+            <w:tcMar>
+              <w:top w:w="100" w:type="dxa"/>
+              <w:start w:w="120" w:type="dxa"/>
+              <w:bottom w:w="100" w:type="dxa"/>
+              <w:end w:w="120" w:type="dxa"/>
+            </w:tcMar>
+            <w:vAlign w:val="center"/>
+          </w:tcPr>
+          <w:p>
+            <w:pPr>
+              <w:spacing w:before="0" w:after="0" w:line="276" w:lineRule="auto"/>
+              <w:jc w:val="center"/>
+            </w:pPr>
+            <w:r>
+              <w:rPr>
+                <w:rFonts w:ascii="宋体" w:hAnsi="宋体" w:eastAsia="宋体"/>
+                <w:b w:val="0"/>
+                <w:sz w:val="20"/>
+              </w:rPr>
+              <w:t>p_s</w:t>
+            </w:r>
+          </w:p>
+        </w:tc>
+        <w:tc>
+          <w:tcPr>
+            <w:tcW w:type="dxa" w:w="6293"/>
+            <w:tcMar>
+              <w:top w:w="100" w:type="dxa"/>
+              <w:start w:w="120" w:type="dxa"/>
+              <w:bottom w:w="100" w:type="dxa"/>
+              <w:end w:w="120" w:type="dxa"/>
+            </w:tcMar>
+            <w:vAlign w:val="center"/>
+          </w:tcPr>
+          <w:p>
+            <w:pPr>
+              <w:spacing w:before="0" w:after="0" w:line="276" w:lineRule="auto"/>
+              <w:jc w:val="left"/>
+            </w:pPr>
+            <w:r>
+              <w:rPr>
+                <w:rFonts w:ascii="宋体" w:hAnsi="宋体" w:eastAsia="宋体"/>
+                <w:b w:val="0"/>
+                <w:sz w:val="20"/>
+              </w:rPr>
+              <w:t>种类头输出的种类概率向量</w:t>
+            </w:r>
+          </w:p>
+        </w:tc>
+      </w:tr>
+      <w:tr>
+        <w:tc>
+          <w:tcPr>
+            <w:tcW w:type="dxa" w:w="1701"/>
+            <w:tcMar>
+              <w:top w:w="100" w:type="dxa"/>
+              <w:start w:w="120" w:type="dxa"/>
+              <w:bottom w:w="100" w:type="dxa"/>
+              <w:end w:w="120" w:type="dxa"/>
+            </w:tcMar>
+            <w:vAlign w:val="center"/>
+          </w:tcPr>
+          <w:p>
+            <w:pPr>
+              <w:spacing w:before="0" w:after="0" w:line="276" w:lineRule="auto"/>
+              <w:jc w:val="center"/>
+            </w:pPr>
+            <w:r>
+              <w:rPr>
+                <w:rFonts w:ascii="宋体" w:hAnsi="宋体" w:eastAsia="宋体"/>
+                <w:b w:val="0"/>
+                <w:sz w:val="20"/>
+              </w:rPr>
+              <w:t>p_r</w:t>
+            </w:r>
+          </w:p>
+        </w:tc>
+        <w:tc>
+          <w:tcPr>
+            <w:tcW w:type="dxa" w:w="6293"/>
+            <w:tcMar>
+              <w:top w:w="100" w:type="dxa"/>
+              <w:start w:w="120" w:type="dxa"/>
+              <w:bottom w:w="100" w:type="dxa"/>
+              <w:end w:w="120" w:type="dxa"/>
+            </w:tcMar>
+            <w:vAlign w:val="center"/>
+          </w:tcPr>
+          <w:p>
+            <w:pPr>
+              <w:spacing w:before="0" w:after="0" w:line="276" w:lineRule="auto"/>
+              <w:jc w:val="left"/>
+            </w:pPr>
+            <w:r>
+              <w:rPr>
+                <w:rFonts w:ascii="宋体" w:hAnsi="宋体" w:eastAsia="宋体"/>
+                <w:b w:val="0"/>
+                <w:sz w:val="20"/>
+              </w:rPr>
+              <w:t>角色头直接输出的角色概率向量</w:t>
+            </w:r>
+          </w:p>
+        </w:tc>
+      </w:tr>
+      <w:tr>
+        <w:tc>
+          <w:tcPr>
+            <w:tcW w:type="dxa" w:w="1701"/>
+            <w:tcMar>
+              <w:top w:w="100" w:type="dxa"/>
+              <w:start w:w="120" w:type="dxa"/>
+              <w:bottom w:w="100" w:type="dxa"/>
+              <w:end w:w="120" w:type="dxa"/>
+            </w:tcMar>
+            <w:vAlign w:val="center"/>
+          </w:tcPr>
+          <w:p>
+            <w:pPr>
+              <w:spacing w:before="0" w:after="0" w:line="276" w:lineRule="auto"/>
+              <w:jc w:val="center"/>
+            </w:pPr>
+            <w:r>
+              <w:rPr>
+                <w:rFonts w:ascii="宋体" w:hAnsi="宋体" w:eastAsia="宋体"/>
+                <w:b w:val="0"/>
+                <w:sz w:val="20"/>
+              </w:rPr>
+              <w:t>p_tilde_r</w:t>
+            </w:r>
+          </w:p>
+        </w:tc>
+        <w:tc>
+          <w:tcPr>
+            <w:tcW w:type="dxa" w:w="6293"/>
+            <w:tcMar>
+              <w:top w:w="100" w:type="dxa"/>
+              <w:start w:w="120" w:type="dxa"/>
+              <w:bottom w:w="100" w:type="dxa"/>
+              <w:end w:w="120" w:type="dxa"/>
+            </w:tcMar>
+            <w:vAlign w:val="center"/>
+          </w:tcPr>
+          <w:p>
+            <w:pPr>
+              <w:spacing w:before="0" w:after="0" w:line="276" w:lineRule="auto"/>
+              <w:jc w:val="left"/>
+            </w:pPr>
+            <w:r>
+              <w:rPr>
+                <w:rFonts w:ascii="宋体" w:hAnsi="宋体" w:eastAsia="宋体"/>
+                <w:b w:val="0"/>
+                <w:sz w:val="20"/>
+              </w:rPr>
+              <w:t>由 A 对 p_s 聚合得到的角色概率向量</w:t>
+            </w:r>
+          </w:p>
+        </w:tc>
+      </w:tr>
+      <w:tr>
+        <w:tc>
+          <w:tcPr>
+            <w:tcW w:type="dxa" w:w="1701"/>
+            <w:tcMar>
+              <w:top w:w="100" w:type="dxa"/>
+              <w:start w:w="120" w:type="dxa"/>
+              <w:bottom w:w="100" w:type="dxa"/>
+              <w:end w:w="120" w:type="dxa"/>
+            </w:tcMar>
+            <w:vAlign w:val="center"/>
+          </w:tcPr>
+          <w:p>
+            <w:pPr>
+              <w:spacing w:before="0" w:after="0" w:line="276" w:lineRule="auto"/>
+              <w:jc w:val="center"/>
+            </w:pPr>
+            <w:r>
+              <w:rPr>
+                <w:rFonts w:ascii="宋体" w:hAnsi="宋体" w:eastAsia="宋体"/>
+                <w:b w:val="0"/>
+                <w:sz w:val="20"/>
+              </w:rPr>
+              <w:t>q(x)</w:t>
+            </w:r>
+          </w:p>
+        </w:tc>
+        <w:tc>
+          <w:tcPr>
+            <w:tcW w:type="dxa" w:w="6293"/>
+            <w:tcMar>
+              <w:top w:w="100" w:type="dxa"/>
+              <w:start w:w="120" w:type="dxa"/>
+              <w:bottom w:w="100" w:type="dxa"/>
+              <w:end w:w="120" w:type="dxa"/>
+            </w:tcMar>
+            <w:vAlign w:val="center"/>
+          </w:tcPr>
+          <w:p>
+            <w:pPr>
+              <w:spacing w:before="0" w:after="0" w:line="276" w:lineRule="auto"/>
+              <w:jc w:val="left"/>
+            </w:pPr>
+            <w:r>
+              <w:rPr>
+                <w:rFonts w:ascii="宋体" w:hAnsi="宋体" w:eastAsia="宋体"/>
+                <w:b w:val="0"/>
+                <w:sz w:val="20"/>
+              </w:rPr>
+              <w:t>角色预测的最大 Softmax 置信度，用于选择性识别</w:t>
+            </w:r>
+          </w:p>
+        </w:tc>
+      </w:tr>
+    </w:tbl>
+    <w:p>
+      <w:pPr>
+        <w:spacing w:after="60"/>
+      </w:pPr>
+    </w:p>
+    <w:p>
+      <w:pPr>
+        <w:spacing w:before="0" w:after="100" w:line="360" w:lineRule="auto"/>
+        <w:ind w:firstLine="420"/>
+        <w:jc w:val="both"/>
+      </w:pPr>
+      <w:r>
+        <w:rPr>
+          <w:rFonts w:ascii="宋体" w:hAnsi="宋体" w:eastAsia="宋体"/>
+          <w:b w:val="0"/>
+          <w:sz w:val="24"/>
+        </w:rPr>
+        <w:t>种类头产生的角色聚合概率定义为：</w:t>
+      </w:r>
+    </w:p>
+    <w:p>
+      <w:pPr>
+        <w:spacing w:before="40" w:after="100" w:line="240" w:lineRule="auto"/>
+        <w:jc w:val="center"/>
+      </w:pPr>
+      <w:r>
+        <w:drawing>
+          <wp:inline xmlns:a="http://schemas.openxmlformats.org/drawingml/2006/main" xmlns:pic="http://schemas.openxmlformats.org/drawingml/2006/picture">
+            <wp:extent cx="2520000" cy="977143"/>
+            <wp:docPr id="3" name="Picture 3"/>
+            <wp:cNvGraphicFramePr>
+              <a:graphicFrameLocks noChangeAspect="1"/>
+            </wp:cNvGraphicFramePr>
+            <a:graphic>
+              <a:graphicData uri="http://schemas.openxmlformats.org/drawingml/2006/picture">
+                <pic:pic>
+                  <pic:nvPicPr>
+                    <pic:cNvPr id="0" name="aggregation.png"/>
+                    <pic:cNvPicPr/>
+                  </pic:nvPicPr>
+                  <pic:blipFill>
+                    <a:blip r:embed="rId13"/>
+                    <a:stretch>
+                      <a:fillRect/>
+                    </a:stretch>
+                  </pic:blipFill>
+                  <pic:spPr>
+                    <a:xfrm>
+                      <a:off x="0" y="0"/>
+                      <a:ext cx="2520000" cy="977143"/>
+                    </a:xfrm>
+                    <a:prstGeom prst="rect"/>
+                  </pic:spPr>
+                </pic:pic>
+              </a:graphicData>
+            </a:graphic>
+          </wp:inline>
+        </w:drawing>
+      </w:r>
+    </w:p>
+    <w:p>
+      <w:pPr>
+        <w:spacing w:before="0" w:after="100" w:line="360" w:lineRule="auto"/>
+        <w:ind w:firstLine="420"/>
+        <w:jc w:val="both"/>
+      </w:pPr>
+      <w:r>
+        <w:rPr>
+          <w:rFonts w:ascii="宋体" w:hAnsi="宋体" w:eastAsia="宋体"/>
+          <w:b w:val="0"/>
+          <w:sz w:val="24"/>
+        </w:rPr>
+        <w:t>完整训练目标由角色分类、种类分类、层级一致性、目标代理二分类和困难负样本约束共同组成：</w:t>
+      </w:r>
+    </w:p>
+    <w:p>
+      <w:pPr>
+        <w:spacing w:before="40" w:after="100" w:line="240" w:lineRule="auto"/>
+        <w:jc w:val="center"/>
+      </w:pPr>
+      <w:r>
+        <w:drawing>
+          <wp:inline xmlns:a="http://schemas.openxmlformats.org/drawingml/2006/main" xmlns:pic="http://schemas.openxmlformats.org/drawingml/2006/picture">
+            <wp:extent cx="5400000" cy="459319"/>
+            <wp:docPr id="4" name="Picture 4"/>
+            <wp:cNvGraphicFramePr>
+              <a:graphicFrameLocks noChangeAspect="1"/>
+            </wp:cNvGraphicFramePr>
+            <a:graphic>
+              <a:graphicData uri="http://schemas.openxmlformats.org/drawingml/2006/picture">
+                <pic:pic>
+                  <pic:nvPicPr>
+                    <pic:cNvPr id="0" name="joint_loss.png"/>
+                    <pic:cNvPicPr/>
+                  </pic:nvPicPr>
+                  <pic:blipFill>
+                    <a:blip r:embed="rId14"/>
+                    <a:stretch>
+                      <a:fillRect/>
+                    </a:stretch>
+                  </pic:blipFill>
+                  <pic:spPr>
+                    <a:xfrm>
+                      <a:off x="0" y="0"/>
+                      <a:ext cx="5400000" cy="459319"/>
+                    </a:xfrm>
+                    <a:prstGeom prst="rect"/>
+                  </pic:spPr>
+                </pic:pic>
+              </a:graphicData>
+            </a:graphic>
+          </wp:inline>
+        </w:drawing>
+      </w:r>
+    </w:p>
+    <w:p>
+      <w:pPr>
+        <w:spacing w:before="0" w:after="100" w:line="360" w:lineRule="auto"/>
+        <w:ind w:firstLine="420"/>
+        <w:jc w:val="both"/>
+      </w:pPr>
+      <w:r>
+        <w:rPr>
+          <w:rFonts w:ascii="宋体" w:hAnsi="宋体" w:eastAsia="宋体"/>
+          <w:b w:val="0"/>
+          <w:sz w:val="24"/>
+        </w:rPr>
+        <w:t>其中 alpha=0.50、beta=0.10、gamma=0.25、eta=0.10；困难负样本项仅约束目标矿物—含钛干扰和目标矿物—金属光泽干扰两类预定义高风险关系。一致性损失严格采用角色头分布到种类聚合角色分布的 KL 方向：</w:t>
+      </w:r>
+    </w:p>
+    <w:p>
+      <w:pPr>
+        <w:spacing w:before="40" w:after="100" w:line="240" w:lineRule="auto"/>
+        <w:jc w:val="center"/>
+      </w:pPr>
+      <w:r>
+        <w:drawing>
+          <wp:inline xmlns:a="http://schemas.openxmlformats.org/drawingml/2006/main" xmlns:pic="http://schemas.openxmlformats.org/drawingml/2006/picture">
+            <wp:extent cx="3780000" cy="768128"/>
+            <wp:docPr id="5" name="Picture 5"/>
+            <wp:cNvGraphicFramePr>
+              <a:graphicFrameLocks noChangeAspect="1"/>
+            </wp:cNvGraphicFramePr>
+            <a:graphic>
+              <a:graphicData uri="http://schemas.openxmlformats.org/drawingml/2006/picture">
+                <pic:pic>
+                  <pic:nvPicPr>
+                    <pic:cNvPr id="0" name="consistency.png"/>
+                    <pic:cNvPicPr/>
+                  </pic:nvPicPr>
+                  <pic:blipFill>
+                    <a:blip r:embed="rId15"/>
+                    <a:stretch>
+                      <a:fillRect/>
+                    </a:stretch>
+                  </pic:blipFill>
+                  <pic:spPr>
+                    <a:xfrm>
+                      <a:off x="0" y="0"/>
+                      <a:ext cx="3780000" cy="768128"/>
+                    </a:xfrm>
+                    <a:prstGeom prst="rect"/>
+                  </pic:spPr>
+                </pic:pic>
+              </a:graphicData>
+            </a:graphic>
+          </wp:inline>
+        </w:drawing>
+      </w:r>
+    </w:p>
+    <w:p>
+      <w:pPr>
+        <w:spacing w:before="0" w:after="100" w:line="360" w:lineRule="auto"/>
+        <w:ind w:firstLine="420"/>
+        <w:jc w:val="both"/>
+      </w:pPr>
+      <w:r>
+        <w:rPr>
+          <w:rFonts w:ascii="宋体" w:hAnsi="宋体" w:eastAsia="宋体"/>
+          <w:b w:val="0"/>
+          <w:sz w:val="24"/>
+        </w:rPr>
+        <w:t>该形式化描述的是公开矿物图像标签层级及其视觉预测约束，不把角色输出解释为品位、回收率、流程阶段或工业处置动作。</w:t>
+      </w:r>
+    </w:p>
+    <w:p>
+      <w:pPr>
+        <w:spacing w:before="240" w:after="120" w:line="288" w:lineRule="auto"/>
+        <w:keepNext/>
+      </w:pPr>
+      <w:r>
+        <w:rPr>
+          <w:rFonts w:ascii="黑体" w:hAnsi="黑体" w:eastAsia="黑体"/>
+          <w:b/>
+          <w:color w:val="1F4E78"/>
+          <w:sz w:val="28"/>
+        </w:rPr>
+        <w:t>4.6 角色可识别性命题</w:t>
+      </w:r>
+    </w:p>
+    <w:p>
+      <w:pPr>
+        <w:spacing w:before="0" w:after="100" w:line="360" w:lineRule="auto"/>
+        <w:ind w:firstLine="420"/>
+        <w:jc w:val="both"/>
+      </w:pPr>
+      <w:r>
+        <w:rPr>
+          <w:rFonts w:ascii="宋体" w:hAnsi="宋体" w:eastAsia="宋体"/>
+          <w:b w:val="0"/>
+          <w:sz w:val="24"/>
+        </w:rPr>
+        <w:t>命题 1：对图像 x 的候选种类集合 S_i，若集合内任一种类 s 经固定映射 A 均对应同一角色 r，即对所有 s∈S_i 均有 A e_s=e_r，则角色 r 唯一确定，即使具体种类 s 仍不能唯一确定。</w:t>
+      </w:r>
+    </w:p>
+    <w:p>
+      <w:pPr>
+        <w:spacing w:before="0" w:after="100" w:line="360" w:lineRule="auto"/>
+        <w:ind w:firstLine="420"/>
+        <w:jc w:val="both"/>
+      </w:pPr>
+      <w:r>
+        <w:rPr>
+          <w:rFonts w:ascii="宋体" w:hAnsi="宋体" w:eastAsia="宋体"/>
+          <w:b w:val="0"/>
+          <w:sz w:val="24"/>
+        </w:rPr>
+        <w:t>证明要点：映射 A 将候选集合中的每个种类独热向量映射为同一角色独热向量，因此种类层的不确定性在角色层被消去。唯一识别种类足以确定角色；反过来，只要全部候选种类同属一角色，确定角色并不要求先确定具体种类。故在该固定映射下，角色可识别的条件弱于种类可识别的条件。该命题是针对当前领域问题的条件化形式化，不主张一般层级学习的新理论。</w:t>
+      </w:r>
+    </w:p>
+    <w:p>
+      <w:pPr>
+        <w:spacing w:before="240" w:after="120" w:line="288" w:lineRule="auto"/>
+        <w:keepNext/>
+      </w:pPr>
+      <w:r>
+        <w:rPr>
+          <w:rFonts w:ascii="黑体" w:hAnsi="黑体" w:eastAsia="黑体"/>
+          <w:b/>
+          <w:color w:val="1F4E78"/>
+          <w:sz w:val="28"/>
+        </w:rPr>
+        <w:t>4.7 选择性识别规则</w:t>
+      </w:r>
+    </w:p>
+    <w:p>
+      <w:pPr>
+        <w:spacing w:before="0" w:after="100" w:line="360" w:lineRule="auto"/>
+        <w:ind w:firstLine="420"/>
+        <w:jc w:val="both"/>
+      </w:pPr>
+      <w:r>
+        <w:rPr>
+          <w:rFonts w:ascii="宋体" w:hAnsi="宋体" w:eastAsia="宋体"/>
+          <w:b w:val="0"/>
+          <w:sz w:val="24"/>
+        </w:rPr>
+        <w:t>对角色头输出，以最大 Softmax 概率定义置信度：</w:t>
+      </w:r>
+    </w:p>
+    <w:p>
+      <w:pPr>
+        <w:spacing w:before="40" w:after="100" w:line="240" w:lineRule="auto"/>
+        <w:jc w:val="center"/>
+      </w:pPr>
+      <w:r>
+        <w:drawing>
+          <wp:inline xmlns:a="http://schemas.openxmlformats.org/drawingml/2006/main" xmlns:pic="http://schemas.openxmlformats.org/drawingml/2006/picture">
+            <wp:extent cx="2880000" cy="677070"/>
+            <wp:docPr id="6" name="Picture 6"/>
+            <wp:cNvGraphicFramePr>
+              <a:graphicFrameLocks noChangeAspect="1"/>
+            </wp:cNvGraphicFramePr>
+            <a:graphic>
+              <a:graphicData uri="http://schemas.openxmlformats.org/drawingml/2006/picture">
+                <pic:pic>
+                  <pic:nvPicPr>
+                    <pic:cNvPr id="0" name="confidence.png"/>
+                    <pic:cNvPicPr/>
+                  </pic:nvPicPr>
+                  <pic:blipFill>
+                    <a:blip r:embed="rId16"/>
+                    <a:stretch>
+                      <a:fillRect/>
+                    </a:stretch>
+                  </pic:blipFill>
+                  <pic:spPr>
+                    <a:xfrm>
+                      <a:off x="0" y="0"/>
+                      <a:ext cx="2880000" cy="677070"/>
+                    </a:xfrm>
+                    <a:prstGeom prst="rect"/>
+                  </pic:spPr>
+                </pic:pic>
+              </a:graphicData>
+            </a:graphic>
+          </wp:inline>
+        </w:drawing>
+      </w:r>
+    </w:p>
+    <w:p>
+      <w:pPr>
+        <w:spacing w:before="0" w:after="100" w:line="360" w:lineRule="auto"/>
+        <w:ind w:firstLine="420"/>
+        <w:jc w:val="both"/>
+      </w:pPr>
+      <w:r>
+        <w:rPr>
+          <w:rFonts w:ascii="宋体" w:hAnsi="宋体" w:eastAsia="宋体"/>
+          <w:b w:val="0"/>
+          <w:sz w:val="24"/>
+        </w:rPr>
+        <w:t>当 q(x) 不低于阈值 tau 时保留角色预测，否则将样本标记为 defer，含义仅为建议后续检查。覆盖率与保留样本错误率分别定义为：</w:t>
+      </w:r>
+    </w:p>
+    <w:p>
+      <w:pPr>
+        <w:spacing w:before="40" w:after="100" w:line="240" w:lineRule="auto"/>
+        <w:jc w:val="center"/>
+      </w:pPr>
+      <w:r>
+        <w:drawing>
+          <wp:inline xmlns:a="http://schemas.openxmlformats.org/drawingml/2006/main" xmlns:pic="http://schemas.openxmlformats.org/drawingml/2006/picture">
+            <wp:extent cx="3780000" cy="855388"/>
+            <wp:docPr id="7" name="Picture 7"/>
+            <wp:cNvGraphicFramePr>
+              <a:graphicFrameLocks noChangeAspect="1"/>
+            </wp:cNvGraphicFramePr>
+            <a:graphic>
+              <a:graphicData uri="http://schemas.openxmlformats.org/drawingml/2006/picture">
+                <pic:pic>
+                  <pic:nvPicPr>
+                    <pic:cNvPr id="0" name="coverage.png"/>
+                    <pic:cNvPicPr/>
+                  </pic:nvPicPr>
+                  <pic:blipFill>
+                    <a:blip r:embed="rId17"/>
+                    <a:stretch>
+                      <a:fillRect/>
+                    </a:stretch>
+                  </pic:blipFill>
+                  <pic:spPr>
+                    <a:xfrm>
+                      <a:off x="0" y="0"/>
+                      <a:ext cx="3780000" cy="855388"/>
+                    </a:xfrm>
+                    <a:prstGeom prst="rect"/>
+                  </pic:spPr>
+                </pic:pic>
+              </a:graphicData>
+            </a:graphic>
+          </wp:inline>
+        </w:drawing>
+      </w:r>
+    </w:p>
+    <w:p>
+      <w:pPr>
+        <w:spacing w:before="40" w:after="100" w:line="240" w:lineRule="auto"/>
+        <w:jc w:val="center"/>
+      </w:pPr>
+      <w:r>
+        <w:drawing>
+          <wp:inline xmlns:a="http://schemas.openxmlformats.org/drawingml/2006/main" xmlns:pic="http://schemas.openxmlformats.org/drawingml/2006/picture">
+            <wp:extent cx="4860000" cy="1432752"/>
+            <wp:docPr id="8" name="Picture 8"/>
+            <wp:cNvGraphicFramePr>
+              <a:graphicFrameLocks noChangeAspect="1"/>
+            </wp:cNvGraphicFramePr>
+            <a:graphic>
+              <a:graphicData uri="http://schemas.openxmlformats.org/drawingml/2006/picture">
+                <pic:pic>
+                  <pic:nvPicPr>
+                    <pic:cNvPr id="0" name="risk.png"/>
+                    <pic:cNvPicPr/>
+                  </pic:nvPicPr>
+                  <pic:blipFill>
+                    <a:blip r:embed="rId18"/>
+                    <a:stretch>
+                      <a:fillRect/>
+                    </a:stretch>
+                  </pic:blipFill>
+                  <pic:spPr>
+                    <a:xfrm>
+                      <a:off x="0" y="0"/>
+                      <a:ext cx="4860000" cy="1432752"/>
+                    </a:xfrm>
+                    <a:prstGeom prst="rect"/>
+                  </pic:spPr>
+                </pic:pic>
+              </a:graphicData>
+            </a:graphic>
+          </wp:inline>
+        </w:drawing>
       </w:r>
     </w:p>
     <w:p>
@@ -3970,7 +4873,7 @@
         <w:drawing>
           <wp:inline xmlns:a="http://schemas.openxmlformats.org/drawingml/2006/main" xmlns:pic="http://schemas.openxmlformats.org/drawingml/2006/picture">
             <wp:extent cx="5544000" cy="2056451"/>
-            <wp:docPr id="3" name="Picture 3"/>
+            <wp:docPr id="9" name="Picture 9"/>
             <wp:cNvGraphicFramePr>
               <a:graphicFrameLocks noChangeAspect="1"/>
             </wp:cNvGraphicFramePr>
@@ -3982,7 +4885,7 @@
                     <pic:cNvPicPr/>
                   </pic:nvPicPr>
                   <pic:blipFill>
-                    <a:blip r:embed="rId13"/>
+                    <a:blip r:embed="rId19"/>
                     <a:stretch>
                       <a:fillRect/>
                     </a:stretch>
@@ -4747,7 +5650,7 @@
         <w:drawing>
           <wp:inline xmlns:a="http://schemas.openxmlformats.org/drawingml/2006/main" xmlns:pic="http://schemas.openxmlformats.org/drawingml/2006/picture">
             <wp:extent cx="5544000" cy="2577579"/>
-            <wp:docPr id="4" name="Picture 4"/>
+            <wp:docPr id="10" name="Picture 10"/>
             <wp:cNvGraphicFramePr>
               <a:graphicFrameLocks noChangeAspect="1"/>
             </wp:cNvGraphicFramePr>
@@ -4759,7 +5662,7 @@
                     <pic:cNvPicPr/>
                   </pic:nvPicPr>
                   <pic:blipFill>
-                    <a:blip r:embed="rId14"/>
+                    <a:blip r:embed="rId20"/>
                     <a:stretch>
                       <a:fillRect/>
                     </a:stretch>
@@ -5392,7 +6295,7 @@
         <w:drawing>
           <wp:inline xmlns:a="http://schemas.openxmlformats.org/drawingml/2006/main" xmlns:pic="http://schemas.openxmlformats.org/drawingml/2006/picture">
             <wp:extent cx="5544000" cy="3459488"/>
-            <wp:docPr id="5" name="Picture 5"/>
+            <wp:docPr id="11" name="Picture 11"/>
             <wp:cNvGraphicFramePr>
               <a:graphicFrameLocks noChangeAspect="1"/>
             </wp:cNvGraphicFramePr>
@@ -5404,7 +6307,7 @@
                     <pic:cNvPicPr/>
                   </pic:nvPicPr>
                   <pic:blipFill>
-                    <a:blip r:embed="rId15"/>
+                    <a:blip r:embed="rId21"/>
                     <a:stretch>
                       <a:fillRect/>
                     </a:stretch>
@@ -5476,7 +6379,7 @@
         <w:drawing>
           <wp:inline xmlns:a="http://schemas.openxmlformats.org/drawingml/2006/main" xmlns:pic="http://schemas.openxmlformats.org/drawingml/2006/picture">
             <wp:extent cx="4860000" cy="4166454"/>
-            <wp:docPr id="6" name="Picture 6"/>
+            <wp:docPr id="12" name="Picture 12"/>
             <wp:cNvGraphicFramePr>
               <a:graphicFrameLocks noChangeAspect="1"/>
             </wp:cNvGraphicFramePr>
@@ -5488,7 +6391,7 @@
                     <pic:cNvPicPr/>
                   </pic:nvPicPr>
                   <pic:blipFill>
-                    <a:blip r:embed="rId16"/>
+                    <a:blip r:embed="rId22"/>
                     <a:stretch>
                       <a:fillRect/>
                     </a:stretch>
@@ -5530,7 +6433,7 @@
         <w:drawing>
           <wp:inline xmlns:a="http://schemas.openxmlformats.org/drawingml/2006/main" xmlns:pic="http://schemas.openxmlformats.org/drawingml/2006/picture">
             <wp:extent cx="5400000" cy="2432538"/>
-            <wp:docPr id="7" name="Picture 7"/>
+            <wp:docPr id="13" name="Picture 13"/>
             <wp:cNvGraphicFramePr>
               <a:graphicFrameLocks noChangeAspect="1"/>
             </wp:cNvGraphicFramePr>
@@ -5542,7 +6445,7 @@
                     <pic:cNvPicPr/>
                   </pic:nvPicPr>
                   <pic:blipFill>
-                    <a:blip r:embed="rId17"/>
+                    <a:blip r:embed="rId23"/>
                     <a:stretch>
                       <a:fillRect/>
                     </a:stretch>
@@ -6123,7 +7026,7 @@
         <w:drawing>
           <wp:inline xmlns:a="http://schemas.openxmlformats.org/drawingml/2006/main" xmlns:pic="http://schemas.openxmlformats.org/drawingml/2006/picture">
             <wp:extent cx="5400000" cy="2471584"/>
-            <wp:docPr id="8" name="Picture 8"/>
+            <wp:docPr id="14" name="Picture 14"/>
             <wp:cNvGraphicFramePr>
               <a:graphicFrameLocks noChangeAspect="1"/>
             </wp:cNvGraphicFramePr>
@@ -6135,7 +7038,7 @@
                     <pic:cNvPicPr/>
                   </pic:nvPicPr>
                   <pic:blipFill>
-                    <a:blip r:embed="rId18"/>
+                    <a:blip r:embed="rId24"/>
                     <a:stretch>
                       <a:fillRect/>
                     </a:stretch>
@@ -7356,6 +8259,1348 @@
     </w:p>
     <w:p>
       <w:pPr>
+        <w:spacing w:before="240" w:after="120" w:line="288" w:lineRule="auto"/>
+        <w:keepNext/>
+      </w:pPr>
+      <w:r>
+        <w:rPr>
+          <w:rFonts w:ascii="黑体" w:hAnsi="黑体" w:eastAsia="黑体"/>
+          <w:b/>
+          <w:color w:val="1F4E78"/>
+          <w:sz w:val="28"/>
+        </w:rPr>
+        <w:t>5.9 角色可识别性的受控逻辑条件验证</w:t>
+      </w:r>
+    </w:p>
+    <w:tbl>
+      <w:tblPr>
+        <w:tblW w:type="auto" w:w="0"/>
+        <w:jc w:val="center"/>
+        <w:tblLook w:firstColumn="1" w:firstRow="1" w:lastColumn="0" w:lastRow="0" w:noHBand="0" w:noVBand="1" w:val="04A0"/>
+        <w:tblLayout w:type="fixed"/>
+        <w:tblBorders>
+          <w:top w:val="single" w:sz="6" w:space="0" w:color="808080"/>
+          <w:left w:val="single" w:sz="6" w:space="0" w:color="808080"/>
+          <w:bottom w:val="single" w:sz="6" w:space="0" w:color="808080"/>
+          <w:right w:val="single" w:sz="6" w:space="0" w:color="808080"/>
+          <w:insideH w:val="single" w:sz="6" w:space="0" w:color="808080"/>
+          <w:insideV w:val="single" w:sz="6" w:space="0" w:color="808080"/>
+        </w:tblBorders>
+      </w:tblPr>
+      <w:tblGrid>
+        <w:gridCol w:w="2211"/>
+        <w:gridCol w:w="2211"/>
+        <w:gridCol w:w="2211"/>
+        <w:gridCol w:w="2211"/>
+      </w:tblGrid>
+      <w:tr>
+        <w:tc>
+          <w:tcPr>
+            <w:tcW w:type="dxa" w:w="1984"/>
+            <w:tcMar>
+              <w:top w:w="100" w:type="dxa"/>
+              <w:start w:w="120" w:type="dxa"/>
+              <w:bottom w:w="100" w:type="dxa"/>
+              <w:end w:w="120" w:type="dxa"/>
+            </w:tcMar>
+            <w:shd w:fill="E8EEF5"/>
+            <w:vAlign w:val="center"/>
+          </w:tcPr>
+          <w:p>
+            <w:pPr>
+              <w:spacing w:before="0" w:after="0" w:line="276" w:lineRule="auto"/>
+              <w:jc w:val="center"/>
+            </w:pPr>
+            <w:r>
+              <w:rPr>
+                <w:rFonts w:ascii="黑体" w:hAnsi="黑体" w:eastAsia="黑体"/>
+                <w:b/>
+                <w:sz w:val="19"/>
+              </w:rPr>
+              <w:t>候选集情形</w:t>
+            </w:r>
+          </w:p>
+        </w:tc>
+        <w:tc>
+          <w:tcPr>
+            <w:tcW w:type="dxa" w:w="1247"/>
+            <w:tcMar>
+              <w:top w:w="100" w:type="dxa"/>
+              <w:start w:w="120" w:type="dxa"/>
+              <w:bottom w:w="100" w:type="dxa"/>
+              <w:end w:w="120" w:type="dxa"/>
+            </w:tcMar>
+            <w:shd w:fill="E8EEF5"/>
+            <w:vAlign w:val="center"/>
+          </w:tcPr>
+          <w:p>
+            <w:pPr>
+              <w:spacing w:before="0" w:after="0" w:line="276" w:lineRule="auto"/>
+              <w:jc w:val="center"/>
+            </w:pPr>
+            <w:r>
+              <w:rPr>
+                <w:rFonts w:ascii="黑体" w:hAnsi="黑体" w:eastAsia="黑体"/>
+                <w:b/>
+                <w:sz w:val="19"/>
+              </w:rPr>
+              <w:t>候选集数</w:t>
+            </w:r>
+          </w:p>
+        </w:tc>
+        <w:tc>
+          <w:tcPr>
+            <w:tcW w:type="dxa" w:w="2381"/>
+            <w:tcMar>
+              <w:top w:w="100" w:type="dxa"/>
+              <w:start w:w="120" w:type="dxa"/>
+              <w:bottom w:w="100" w:type="dxa"/>
+              <w:end w:w="120" w:type="dxa"/>
+            </w:tcMar>
+            <w:shd w:fill="E8EEF5"/>
+            <w:vAlign w:val="center"/>
+          </w:tcPr>
+          <w:p>
+            <w:pPr>
+              <w:spacing w:before="0" w:after="0" w:line="276" w:lineRule="auto"/>
+              <w:jc w:val="center"/>
+            </w:pPr>
+            <w:r>
+              <w:rPr>
+                <w:rFonts w:ascii="黑体" w:hAnsi="黑体" w:eastAsia="黑体"/>
+                <w:b/>
+                <w:sz w:val="19"/>
+              </w:rPr>
+              <w:t>种类唯一可识别率（%）</w:t>
+            </w:r>
+          </w:p>
+        </w:tc>
+        <w:tc>
+          <w:tcPr>
+            <w:tcW w:type="dxa" w:w="2381"/>
+            <w:tcMar>
+              <w:top w:w="100" w:type="dxa"/>
+              <w:start w:w="120" w:type="dxa"/>
+              <w:bottom w:w="100" w:type="dxa"/>
+              <w:end w:w="120" w:type="dxa"/>
+            </w:tcMar>
+            <w:shd w:fill="E8EEF5"/>
+            <w:vAlign w:val="center"/>
+          </w:tcPr>
+          <w:p>
+            <w:pPr>
+              <w:spacing w:before="0" w:after="0" w:line="276" w:lineRule="auto"/>
+              <w:jc w:val="center"/>
+            </w:pPr>
+            <w:r>
+              <w:rPr>
+                <w:rFonts w:ascii="黑体" w:hAnsi="黑体" w:eastAsia="黑体"/>
+                <w:b/>
+                <w:sz w:val="19"/>
+              </w:rPr>
+              <w:t>角色唯一可识别率（%）</w:t>
+            </w:r>
+          </w:p>
+        </w:tc>
+      </w:tr>
+      <w:tr>
+        <w:tc>
+          <w:tcPr>
+            <w:tcW w:type="dxa" w:w="1984"/>
+            <w:tcMar>
+              <w:top w:w="100" w:type="dxa"/>
+              <w:start w:w="120" w:type="dxa"/>
+              <w:bottom w:w="100" w:type="dxa"/>
+              <w:end w:w="120" w:type="dxa"/>
+            </w:tcMar>
+            <w:vAlign w:val="center"/>
+          </w:tcPr>
+          <w:p>
+            <w:pPr>
+              <w:spacing w:before="0" w:after="0" w:line="276" w:lineRule="auto"/>
+              <w:jc w:val="center"/>
+            </w:pPr>
+            <w:r>
+              <w:rPr>
+                <w:rFonts w:ascii="宋体" w:hAnsi="宋体" w:eastAsia="宋体"/>
+                <w:b w:val="0"/>
+                <w:sz w:val="19"/>
+              </w:rPr>
+              <w:t>角色一致</w:t>
+            </w:r>
+          </w:p>
+        </w:tc>
+        <w:tc>
+          <w:tcPr>
+            <w:tcW w:type="dxa" w:w="1247"/>
+            <w:tcMar>
+              <w:top w:w="100" w:type="dxa"/>
+              <w:start w:w="120" w:type="dxa"/>
+              <w:bottom w:w="100" w:type="dxa"/>
+              <w:end w:w="120" w:type="dxa"/>
+            </w:tcMar>
+            <w:vAlign w:val="center"/>
+          </w:tcPr>
+          <w:p>
+            <w:pPr>
+              <w:spacing w:before="0" w:after="0" w:line="276" w:lineRule="auto"/>
+              <w:jc w:val="left"/>
+            </w:pPr>
+            <w:r>
+              <w:rPr>
+                <w:rFonts w:ascii="宋体" w:hAnsi="宋体" w:eastAsia="宋体"/>
+                <w:b w:val="0"/>
+                <w:sz w:val="19"/>
+              </w:rPr>
+              <w:t>48</w:t>
+            </w:r>
+          </w:p>
+        </w:tc>
+        <w:tc>
+          <w:tcPr>
+            <w:tcW w:type="dxa" w:w="2381"/>
+            <w:tcMar>
+              <w:top w:w="100" w:type="dxa"/>
+              <w:start w:w="120" w:type="dxa"/>
+              <w:bottom w:w="100" w:type="dxa"/>
+              <w:end w:w="120" w:type="dxa"/>
+            </w:tcMar>
+            <w:vAlign w:val="center"/>
+          </w:tcPr>
+          <w:p>
+            <w:pPr>
+              <w:spacing w:before="0" w:after="0" w:line="276" w:lineRule="auto"/>
+              <w:jc w:val="left"/>
+            </w:pPr>
+            <w:r>
+              <w:rPr>
+                <w:rFonts w:ascii="宋体" w:hAnsi="宋体" w:eastAsia="宋体"/>
+                <w:b w:val="0"/>
+                <w:sz w:val="19"/>
+              </w:rPr>
+              <w:t>0.00</w:t>
+            </w:r>
+          </w:p>
+        </w:tc>
+        <w:tc>
+          <w:tcPr>
+            <w:tcW w:type="dxa" w:w="2381"/>
+            <w:tcMar>
+              <w:top w:w="100" w:type="dxa"/>
+              <w:start w:w="120" w:type="dxa"/>
+              <w:bottom w:w="100" w:type="dxa"/>
+              <w:end w:w="120" w:type="dxa"/>
+            </w:tcMar>
+            <w:vAlign w:val="center"/>
+          </w:tcPr>
+          <w:p>
+            <w:pPr>
+              <w:spacing w:before="0" w:after="0" w:line="276" w:lineRule="auto"/>
+              <w:jc w:val="left"/>
+            </w:pPr>
+            <w:r>
+              <w:rPr>
+                <w:rFonts w:ascii="宋体" w:hAnsi="宋体" w:eastAsia="宋体"/>
+                <w:b w:val="0"/>
+                <w:sz w:val="19"/>
+              </w:rPr>
+              <w:t>100.00</w:t>
+            </w:r>
+          </w:p>
+        </w:tc>
+      </w:tr>
+      <w:tr>
+        <w:tc>
+          <w:tcPr>
+            <w:tcW w:type="dxa" w:w="1984"/>
+            <w:tcMar>
+              <w:top w:w="100" w:type="dxa"/>
+              <w:start w:w="120" w:type="dxa"/>
+              <w:bottom w:w="100" w:type="dxa"/>
+              <w:end w:w="120" w:type="dxa"/>
+            </w:tcMar>
+            <w:vAlign w:val="center"/>
+          </w:tcPr>
+          <w:p>
+            <w:pPr>
+              <w:spacing w:before="0" w:after="0" w:line="276" w:lineRule="auto"/>
+              <w:jc w:val="center"/>
+            </w:pPr>
+            <w:r>
+              <w:rPr>
+                <w:rFonts w:ascii="宋体" w:hAnsi="宋体" w:eastAsia="宋体"/>
+                <w:b w:val="0"/>
+                <w:sz w:val="19"/>
+              </w:rPr>
+              <w:t>角色冲突</w:t>
+            </w:r>
+          </w:p>
+        </w:tc>
+        <w:tc>
+          <w:tcPr>
+            <w:tcW w:type="dxa" w:w="1247"/>
+            <w:tcMar>
+              <w:top w:w="100" w:type="dxa"/>
+              <w:start w:w="120" w:type="dxa"/>
+              <w:bottom w:w="100" w:type="dxa"/>
+              <w:end w:w="120" w:type="dxa"/>
+            </w:tcMar>
+            <w:vAlign w:val="center"/>
+          </w:tcPr>
+          <w:p>
+            <w:pPr>
+              <w:spacing w:before="0" w:after="0" w:line="276" w:lineRule="auto"/>
+              <w:jc w:val="left"/>
+            </w:pPr>
+            <w:r>
+              <w:rPr>
+                <w:rFonts w:ascii="宋体" w:hAnsi="宋体" w:eastAsia="宋体"/>
+                <w:b w:val="0"/>
+                <w:sz w:val="19"/>
+              </w:rPr>
+              <w:t>51</w:t>
+            </w:r>
+          </w:p>
+        </w:tc>
+        <w:tc>
+          <w:tcPr>
+            <w:tcW w:type="dxa" w:w="2381"/>
+            <w:tcMar>
+              <w:top w:w="100" w:type="dxa"/>
+              <w:start w:w="120" w:type="dxa"/>
+              <w:bottom w:w="100" w:type="dxa"/>
+              <w:end w:w="120" w:type="dxa"/>
+            </w:tcMar>
+            <w:vAlign w:val="center"/>
+          </w:tcPr>
+          <w:p>
+            <w:pPr>
+              <w:spacing w:before="0" w:after="0" w:line="276" w:lineRule="auto"/>
+              <w:jc w:val="left"/>
+            </w:pPr>
+            <w:r>
+              <w:rPr>
+                <w:rFonts w:ascii="宋体" w:hAnsi="宋体" w:eastAsia="宋体"/>
+                <w:b w:val="0"/>
+                <w:sz w:val="19"/>
+              </w:rPr>
+              <w:t>0.00</w:t>
+            </w:r>
+          </w:p>
+        </w:tc>
+        <w:tc>
+          <w:tcPr>
+            <w:tcW w:type="dxa" w:w="2381"/>
+            <w:tcMar>
+              <w:top w:w="100" w:type="dxa"/>
+              <w:start w:w="120" w:type="dxa"/>
+              <w:bottom w:w="100" w:type="dxa"/>
+              <w:end w:w="120" w:type="dxa"/>
+            </w:tcMar>
+            <w:vAlign w:val="center"/>
+          </w:tcPr>
+          <w:p>
+            <w:pPr>
+              <w:spacing w:before="0" w:after="0" w:line="276" w:lineRule="auto"/>
+              <w:jc w:val="left"/>
+            </w:pPr>
+            <w:r>
+              <w:rPr>
+                <w:rFonts w:ascii="宋体" w:hAnsi="宋体" w:eastAsia="宋体"/>
+                <w:b w:val="0"/>
+                <w:sz w:val="19"/>
+              </w:rPr>
+              <w:t>0.00</w:t>
+            </w:r>
+          </w:p>
+        </w:tc>
+      </w:tr>
+      <w:tr>
+        <w:tc>
+          <w:tcPr>
+            <w:tcW w:type="dxa" w:w="1984"/>
+            <w:tcMar>
+              <w:top w:w="100" w:type="dxa"/>
+              <w:start w:w="120" w:type="dxa"/>
+              <w:bottom w:w="100" w:type="dxa"/>
+              <w:end w:w="120" w:type="dxa"/>
+            </w:tcMar>
+            <w:vAlign w:val="center"/>
+          </w:tcPr>
+          <w:p>
+            <w:pPr>
+              <w:spacing w:before="0" w:after="0" w:line="276" w:lineRule="auto"/>
+              <w:jc w:val="center"/>
+            </w:pPr>
+            <w:r>
+              <w:rPr>
+                <w:rFonts w:ascii="宋体" w:hAnsi="宋体" w:eastAsia="宋体"/>
+                <w:b w:val="0"/>
+                <w:sz w:val="19"/>
+              </w:rPr>
+              <w:t>合计</w:t>
+            </w:r>
+          </w:p>
+        </w:tc>
+        <w:tc>
+          <w:tcPr>
+            <w:tcW w:type="dxa" w:w="1247"/>
+            <w:tcMar>
+              <w:top w:w="100" w:type="dxa"/>
+              <w:start w:w="120" w:type="dxa"/>
+              <w:bottom w:w="100" w:type="dxa"/>
+              <w:end w:w="120" w:type="dxa"/>
+            </w:tcMar>
+            <w:vAlign w:val="center"/>
+          </w:tcPr>
+          <w:p>
+            <w:pPr>
+              <w:spacing w:before="0" w:after="0" w:line="276" w:lineRule="auto"/>
+              <w:jc w:val="left"/>
+            </w:pPr>
+            <w:r>
+              <w:rPr>
+                <w:rFonts w:ascii="宋体" w:hAnsi="宋体" w:eastAsia="宋体"/>
+                <w:b w:val="0"/>
+                <w:sz w:val="19"/>
+              </w:rPr>
+              <w:t>99</w:t>
+            </w:r>
+          </w:p>
+        </w:tc>
+        <w:tc>
+          <w:tcPr>
+            <w:tcW w:type="dxa" w:w="2381"/>
+            <w:tcMar>
+              <w:top w:w="100" w:type="dxa"/>
+              <w:start w:w="120" w:type="dxa"/>
+              <w:bottom w:w="100" w:type="dxa"/>
+              <w:end w:w="120" w:type="dxa"/>
+            </w:tcMar>
+            <w:vAlign w:val="center"/>
+          </w:tcPr>
+          <w:p>
+            <w:pPr>
+              <w:spacing w:before="0" w:after="0" w:line="276" w:lineRule="auto"/>
+              <w:jc w:val="left"/>
+            </w:pPr>
+            <w:r>
+              <w:rPr>
+                <w:rFonts w:ascii="宋体" w:hAnsi="宋体" w:eastAsia="宋体"/>
+                <w:b w:val="0"/>
+                <w:sz w:val="19"/>
+              </w:rPr>
+              <w:t>0.00</w:t>
+            </w:r>
+          </w:p>
+        </w:tc>
+        <w:tc>
+          <w:tcPr>
+            <w:tcW w:type="dxa" w:w="2381"/>
+            <w:tcMar>
+              <w:top w:w="100" w:type="dxa"/>
+              <w:start w:w="120" w:type="dxa"/>
+              <w:bottom w:w="100" w:type="dxa"/>
+              <w:end w:w="120" w:type="dxa"/>
+            </w:tcMar>
+            <w:vAlign w:val="center"/>
+          </w:tcPr>
+          <w:p>
+            <w:pPr>
+              <w:spacing w:before="0" w:after="0" w:line="276" w:lineRule="auto"/>
+              <w:jc w:val="left"/>
+            </w:pPr>
+            <w:r>
+              <w:rPr>
+                <w:rFonts w:ascii="宋体" w:hAnsi="宋体" w:eastAsia="宋体"/>
+                <w:b w:val="0"/>
+                <w:sz w:val="19"/>
+              </w:rPr>
+              <w:t>48.48</w:t>
+            </w:r>
+          </w:p>
+        </w:tc>
+      </w:tr>
+    </w:tbl>
+    <w:p>
+      <w:pPr>
+        <w:spacing w:after="60"/>
+      </w:pPr>
+    </w:p>
+    <w:p>
+      <w:pPr>
+        <w:spacing w:before="0" w:after="100" w:line="360" w:lineRule="auto"/>
+        <w:ind w:firstLine="420"/>
+        <w:jc w:val="both"/>
+      </w:pPr>
+      <w:r>
+        <w:rPr>
+          <w:rFonts w:ascii="宋体" w:hAnsi="宋体" w:eastAsia="宋体"/>
+          <w:b w:val="0"/>
+          <w:sz w:val="24"/>
+        </w:rPr>
+        <w:t>该验证使用固定随机种子 20260801，按候选规模 2、3、4 构造集合，并保持原训练、验证、测试划分计数不变。角色一致候选集共 48 个，角色唯一可识别率为 100.00%；角色冲突候选集共 51 个，角色唯一可识别率为 0.00%。结果只验证命题 1 的逻辑条件：候选种类同属一角色时，种类歧义不妨碍角色唯一确定。它不使用模型预测或原图视觉标签推断，也不替代真实多标签标注、外部测试或工业验证。</w:t>
+      </w:r>
+    </w:p>
+    <w:p>
+      <w:pPr>
+        <w:spacing w:before="240" w:after="120" w:line="288" w:lineRule="auto"/>
+        <w:keepNext/>
+      </w:pPr>
+      <w:r>
+        <w:rPr>
+          <w:rFonts w:ascii="黑体" w:hAnsi="黑体" w:eastAsia="黑体"/>
+          <w:b/>
+          <w:color w:val="1F4E78"/>
+          <w:sz w:val="28"/>
+        </w:rPr>
+        <w:t>5.10 固定测试划分上的选择性识别</w:t>
+      </w:r>
+    </w:p>
+    <w:tbl>
+      <w:tblPr>
+        <w:tblW w:type="auto" w:w="0"/>
+        <w:jc w:val="center"/>
+        <w:tblLook w:firstColumn="1" w:firstRow="1" w:lastColumn="0" w:lastRow="0" w:noHBand="0" w:noVBand="1" w:val="04A0"/>
+        <w:tblLayout w:type="fixed"/>
+        <w:tblBorders>
+          <w:top w:val="single" w:sz="6" w:space="0" w:color="808080"/>
+          <w:left w:val="single" w:sz="6" w:space="0" w:color="808080"/>
+          <w:bottom w:val="single" w:sz="6" w:space="0" w:color="808080"/>
+          <w:right w:val="single" w:sz="6" w:space="0" w:color="808080"/>
+          <w:insideH w:val="single" w:sz="6" w:space="0" w:color="808080"/>
+          <w:insideV w:val="single" w:sz="6" w:space="0" w:color="808080"/>
+        </w:tblBorders>
+      </w:tblPr>
+      <w:tblGrid>
+        <w:gridCol w:w="2211"/>
+        <w:gridCol w:w="2211"/>
+        <w:gridCol w:w="2211"/>
+        <w:gridCol w:w="2211"/>
+      </w:tblGrid>
+      <w:tr>
+        <w:tc>
+          <w:tcPr>
+            <w:tcW w:type="dxa" w:w="1701"/>
+            <w:tcMar>
+              <w:top w:w="100" w:type="dxa"/>
+              <w:start w:w="120" w:type="dxa"/>
+              <w:bottom w:w="100" w:type="dxa"/>
+              <w:end w:w="120" w:type="dxa"/>
+            </w:tcMar>
+            <w:shd w:fill="E8EEF5"/>
+            <w:vAlign w:val="center"/>
+          </w:tcPr>
+          <w:p>
+            <w:pPr>
+              <w:spacing w:before="0" w:after="0" w:line="276" w:lineRule="auto"/>
+              <w:jc w:val="center"/>
+            </w:pPr>
+            <w:r>
+              <w:rPr>
+                <w:rFonts w:ascii="黑体" w:hAnsi="黑体" w:eastAsia="黑体"/>
+                <w:b/>
+                <w:sz w:val="19"/>
+              </w:rPr>
+              <w:t>置信度阈值</w:t>
+            </w:r>
+          </w:p>
+        </w:tc>
+        <w:tc>
+          <w:tcPr>
+            <w:tcW w:type="dxa" w:w="2154"/>
+            <w:tcMar>
+              <w:top w:w="100" w:type="dxa"/>
+              <w:start w:w="120" w:type="dxa"/>
+              <w:bottom w:w="100" w:type="dxa"/>
+              <w:end w:w="120" w:type="dxa"/>
+            </w:tcMar>
+            <w:shd w:fill="E8EEF5"/>
+            <w:vAlign w:val="center"/>
+          </w:tcPr>
+          <w:p>
+            <w:pPr>
+              <w:spacing w:before="0" w:after="0" w:line="276" w:lineRule="auto"/>
+              <w:jc w:val="center"/>
+            </w:pPr>
+            <w:r>
+              <w:rPr>
+                <w:rFonts w:ascii="黑体" w:hAnsi="黑体" w:eastAsia="黑体"/>
+                <w:b/>
+                <w:sz w:val="19"/>
+              </w:rPr>
+              <w:t>平均保留样本数</w:t>
+            </w:r>
+          </w:p>
+        </w:tc>
+        <w:tc>
+          <w:tcPr>
+            <w:tcW w:type="dxa" w:w="2041"/>
+            <w:tcMar>
+              <w:top w:w="100" w:type="dxa"/>
+              <w:start w:w="120" w:type="dxa"/>
+              <w:bottom w:w="100" w:type="dxa"/>
+              <w:end w:w="120" w:type="dxa"/>
+            </w:tcMar>
+            <w:shd w:fill="E8EEF5"/>
+            <w:vAlign w:val="center"/>
+          </w:tcPr>
+          <w:p>
+            <w:pPr>
+              <w:spacing w:before="0" w:after="0" w:line="276" w:lineRule="auto"/>
+              <w:jc w:val="center"/>
+            </w:pPr>
+            <w:r>
+              <w:rPr>
+                <w:rFonts w:ascii="黑体" w:hAnsi="黑体" w:eastAsia="黑体"/>
+                <w:b/>
+                <w:sz w:val="19"/>
+              </w:rPr>
+              <w:t>覆盖率（%）</w:t>
+            </w:r>
+          </w:p>
+        </w:tc>
+        <w:tc>
+          <w:tcPr>
+            <w:tcW w:type="dxa" w:w="2381"/>
+            <w:tcMar>
+              <w:top w:w="100" w:type="dxa"/>
+              <w:start w:w="120" w:type="dxa"/>
+              <w:bottom w:w="100" w:type="dxa"/>
+              <w:end w:w="120" w:type="dxa"/>
+            </w:tcMar>
+            <w:shd w:fill="E8EEF5"/>
+            <w:vAlign w:val="center"/>
+          </w:tcPr>
+          <w:p>
+            <w:pPr>
+              <w:spacing w:before="0" w:after="0" w:line="276" w:lineRule="auto"/>
+              <w:jc w:val="center"/>
+            </w:pPr>
+            <w:r>
+              <w:rPr>
+                <w:rFonts w:ascii="黑体" w:hAnsi="黑体" w:eastAsia="黑体"/>
+                <w:b/>
+                <w:sz w:val="19"/>
+              </w:rPr>
+              <w:t>保留样本错误率（%）</w:t>
+            </w:r>
+          </w:p>
+        </w:tc>
+      </w:tr>
+      <w:tr>
+        <w:tc>
+          <w:tcPr>
+            <w:tcW w:type="dxa" w:w="1701"/>
+            <w:tcMar>
+              <w:top w:w="100" w:type="dxa"/>
+              <w:start w:w="120" w:type="dxa"/>
+              <w:bottom w:w="100" w:type="dxa"/>
+              <w:end w:w="120" w:type="dxa"/>
+            </w:tcMar>
+            <w:vAlign w:val="center"/>
+          </w:tcPr>
+          <w:p>
+            <w:pPr>
+              <w:spacing w:before="0" w:after="0" w:line="276" w:lineRule="auto"/>
+              <w:jc w:val="center"/>
+            </w:pPr>
+            <w:r>
+              <w:rPr>
+                <w:rFonts w:ascii="宋体" w:hAnsi="宋体" w:eastAsia="宋体"/>
+                <w:b w:val="0"/>
+                <w:sz w:val="19"/>
+              </w:rPr>
+              <w:t>0.00</w:t>
+            </w:r>
+          </w:p>
+        </w:tc>
+        <w:tc>
+          <w:tcPr>
+            <w:tcW w:type="dxa" w:w="2154"/>
+            <w:tcMar>
+              <w:top w:w="100" w:type="dxa"/>
+              <w:start w:w="120" w:type="dxa"/>
+              <w:bottom w:w="100" w:type="dxa"/>
+              <w:end w:w="120" w:type="dxa"/>
+            </w:tcMar>
+            <w:vAlign w:val="center"/>
+          </w:tcPr>
+          <w:p>
+            <w:pPr>
+              <w:spacing w:before="0" w:after="0" w:line="276" w:lineRule="auto"/>
+              <w:jc w:val="left"/>
+            </w:pPr>
+            <w:r>
+              <w:rPr>
+                <w:rFonts w:ascii="宋体" w:hAnsi="宋体" w:eastAsia="宋体"/>
+                <w:b w:val="0"/>
+                <w:sz w:val="19"/>
+              </w:rPr>
+              <w:t>1284.0 ± 0.0</w:t>
+            </w:r>
+          </w:p>
+        </w:tc>
+        <w:tc>
+          <w:tcPr>
+            <w:tcW w:type="dxa" w:w="2041"/>
+            <w:tcMar>
+              <w:top w:w="100" w:type="dxa"/>
+              <w:start w:w="120" w:type="dxa"/>
+              <w:bottom w:w="100" w:type="dxa"/>
+              <w:end w:w="120" w:type="dxa"/>
+            </w:tcMar>
+            <w:vAlign w:val="center"/>
+          </w:tcPr>
+          <w:p>
+            <w:pPr>
+              <w:spacing w:before="0" w:after="0" w:line="276" w:lineRule="auto"/>
+              <w:jc w:val="left"/>
+            </w:pPr>
+            <w:r>
+              <w:rPr>
+                <w:rFonts w:ascii="宋体" w:hAnsi="宋体" w:eastAsia="宋体"/>
+                <w:b w:val="0"/>
+                <w:sz w:val="19"/>
+              </w:rPr>
+              <w:t>100.00 ± 0.00</w:t>
+            </w:r>
+          </w:p>
+        </w:tc>
+        <w:tc>
+          <w:tcPr>
+            <w:tcW w:type="dxa" w:w="2381"/>
+            <w:tcMar>
+              <w:top w:w="100" w:type="dxa"/>
+              <w:start w:w="120" w:type="dxa"/>
+              <w:bottom w:w="100" w:type="dxa"/>
+              <w:end w:w="120" w:type="dxa"/>
+            </w:tcMar>
+            <w:vAlign w:val="center"/>
+          </w:tcPr>
+          <w:p>
+            <w:pPr>
+              <w:spacing w:before="0" w:after="0" w:line="276" w:lineRule="auto"/>
+              <w:jc w:val="left"/>
+            </w:pPr>
+            <w:r>
+              <w:rPr>
+                <w:rFonts w:ascii="宋体" w:hAnsi="宋体" w:eastAsia="宋体"/>
+                <w:b w:val="0"/>
+                <w:sz w:val="19"/>
+              </w:rPr>
+              <w:t>24.58 ± 2.59</w:t>
+            </w:r>
+          </w:p>
+        </w:tc>
+      </w:tr>
+      <w:tr>
+        <w:tc>
+          <w:tcPr>
+            <w:tcW w:type="dxa" w:w="1701"/>
+            <w:tcMar>
+              <w:top w:w="100" w:type="dxa"/>
+              <w:start w:w="120" w:type="dxa"/>
+              <w:bottom w:w="100" w:type="dxa"/>
+              <w:end w:w="120" w:type="dxa"/>
+            </w:tcMar>
+            <w:vAlign w:val="center"/>
+          </w:tcPr>
+          <w:p>
+            <w:pPr>
+              <w:spacing w:before="0" w:after="0" w:line="276" w:lineRule="auto"/>
+              <w:jc w:val="center"/>
+            </w:pPr>
+            <w:r>
+              <w:rPr>
+                <w:rFonts w:ascii="宋体" w:hAnsi="宋体" w:eastAsia="宋体"/>
+                <w:b w:val="0"/>
+                <w:sz w:val="19"/>
+              </w:rPr>
+              <w:t>0.50</w:t>
+            </w:r>
+          </w:p>
+        </w:tc>
+        <w:tc>
+          <w:tcPr>
+            <w:tcW w:type="dxa" w:w="2154"/>
+            <w:tcMar>
+              <w:top w:w="100" w:type="dxa"/>
+              <w:start w:w="120" w:type="dxa"/>
+              <w:bottom w:w="100" w:type="dxa"/>
+              <w:end w:w="120" w:type="dxa"/>
+            </w:tcMar>
+            <w:vAlign w:val="center"/>
+          </w:tcPr>
+          <w:p>
+            <w:pPr>
+              <w:spacing w:before="0" w:after="0" w:line="276" w:lineRule="auto"/>
+              <w:jc w:val="left"/>
+            </w:pPr>
+            <w:r>
+              <w:rPr>
+                <w:rFonts w:ascii="宋体" w:hAnsi="宋体" w:eastAsia="宋体"/>
+                <w:b w:val="0"/>
+                <w:sz w:val="19"/>
+              </w:rPr>
+              <w:t>1223.0 ± 37.2</w:t>
+            </w:r>
+          </w:p>
+        </w:tc>
+        <w:tc>
+          <w:tcPr>
+            <w:tcW w:type="dxa" w:w="2041"/>
+            <w:tcMar>
+              <w:top w:w="100" w:type="dxa"/>
+              <w:start w:w="120" w:type="dxa"/>
+              <w:bottom w:w="100" w:type="dxa"/>
+              <w:end w:w="120" w:type="dxa"/>
+            </w:tcMar>
+            <w:vAlign w:val="center"/>
+          </w:tcPr>
+          <w:p>
+            <w:pPr>
+              <w:spacing w:before="0" w:after="0" w:line="276" w:lineRule="auto"/>
+              <w:jc w:val="left"/>
+            </w:pPr>
+            <w:r>
+              <w:rPr>
+                <w:rFonts w:ascii="宋体" w:hAnsi="宋体" w:eastAsia="宋体"/>
+                <w:b w:val="0"/>
+                <w:sz w:val="19"/>
+              </w:rPr>
+              <w:t>95.25 ± 2.89</w:t>
+            </w:r>
+          </w:p>
+        </w:tc>
+        <w:tc>
+          <w:tcPr>
+            <w:tcW w:type="dxa" w:w="2381"/>
+            <w:tcMar>
+              <w:top w:w="100" w:type="dxa"/>
+              <w:start w:w="120" w:type="dxa"/>
+              <w:bottom w:w="100" w:type="dxa"/>
+              <w:end w:w="120" w:type="dxa"/>
+            </w:tcMar>
+            <w:vAlign w:val="center"/>
+          </w:tcPr>
+          <w:p>
+            <w:pPr>
+              <w:spacing w:before="0" w:after="0" w:line="276" w:lineRule="auto"/>
+              <w:jc w:val="left"/>
+            </w:pPr>
+            <w:r>
+              <w:rPr>
+                <w:rFonts w:ascii="宋体" w:hAnsi="宋体" w:eastAsia="宋体"/>
+                <w:b w:val="0"/>
+                <w:sz w:val="19"/>
+              </w:rPr>
+              <w:t>22.70 ± 1.94</w:t>
+            </w:r>
+          </w:p>
+        </w:tc>
+      </w:tr>
+      <w:tr>
+        <w:tc>
+          <w:tcPr>
+            <w:tcW w:type="dxa" w:w="1701"/>
+            <w:tcMar>
+              <w:top w:w="100" w:type="dxa"/>
+              <w:start w:w="120" w:type="dxa"/>
+              <w:bottom w:w="100" w:type="dxa"/>
+              <w:end w:w="120" w:type="dxa"/>
+            </w:tcMar>
+            <w:vAlign w:val="center"/>
+          </w:tcPr>
+          <w:p>
+            <w:pPr>
+              <w:spacing w:before="0" w:after="0" w:line="276" w:lineRule="auto"/>
+              <w:jc w:val="center"/>
+            </w:pPr>
+            <w:r>
+              <w:rPr>
+                <w:rFonts w:ascii="宋体" w:hAnsi="宋体" w:eastAsia="宋体"/>
+                <w:b w:val="0"/>
+                <w:sz w:val="19"/>
+              </w:rPr>
+              <w:t>0.70</w:t>
+            </w:r>
+          </w:p>
+        </w:tc>
+        <w:tc>
+          <w:tcPr>
+            <w:tcW w:type="dxa" w:w="2154"/>
+            <w:tcMar>
+              <w:top w:w="100" w:type="dxa"/>
+              <w:start w:w="120" w:type="dxa"/>
+              <w:bottom w:w="100" w:type="dxa"/>
+              <w:end w:w="120" w:type="dxa"/>
+            </w:tcMar>
+            <w:vAlign w:val="center"/>
+          </w:tcPr>
+          <w:p>
+            <w:pPr>
+              <w:spacing w:before="0" w:after="0" w:line="276" w:lineRule="auto"/>
+              <w:jc w:val="left"/>
+            </w:pPr>
+            <w:r>
+              <w:rPr>
+                <w:rFonts w:ascii="宋体" w:hAnsi="宋体" w:eastAsia="宋体"/>
+                <w:b w:val="0"/>
+                <w:sz w:val="19"/>
+              </w:rPr>
+              <w:t>1037.3 ± 89.5</w:t>
+            </w:r>
+          </w:p>
+        </w:tc>
+        <w:tc>
+          <w:tcPr>
+            <w:tcW w:type="dxa" w:w="2041"/>
+            <w:tcMar>
+              <w:top w:w="100" w:type="dxa"/>
+              <w:start w:w="120" w:type="dxa"/>
+              <w:bottom w:w="100" w:type="dxa"/>
+              <w:end w:w="120" w:type="dxa"/>
+            </w:tcMar>
+            <w:vAlign w:val="center"/>
+          </w:tcPr>
+          <w:p>
+            <w:pPr>
+              <w:spacing w:before="0" w:after="0" w:line="276" w:lineRule="auto"/>
+              <w:jc w:val="left"/>
+            </w:pPr>
+            <w:r>
+              <w:rPr>
+                <w:rFonts w:ascii="宋体" w:hAnsi="宋体" w:eastAsia="宋体"/>
+                <w:b w:val="0"/>
+                <w:sz w:val="19"/>
+              </w:rPr>
+              <w:t>80.79 ± 6.97</w:t>
+            </w:r>
+          </w:p>
+        </w:tc>
+        <w:tc>
+          <w:tcPr>
+            <w:tcW w:type="dxa" w:w="2381"/>
+            <w:tcMar>
+              <w:top w:w="100" w:type="dxa"/>
+              <w:start w:w="120" w:type="dxa"/>
+              <w:bottom w:w="100" w:type="dxa"/>
+              <w:end w:w="120" w:type="dxa"/>
+            </w:tcMar>
+            <w:vAlign w:val="center"/>
+          </w:tcPr>
+          <w:p>
+            <w:pPr>
+              <w:spacing w:before="0" w:after="0" w:line="276" w:lineRule="auto"/>
+              <w:jc w:val="left"/>
+            </w:pPr>
+            <w:r>
+              <w:rPr>
+                <w:rFonts w:ascii="宋体" w:hAnsi="宋体" w:eastAsia="宋体"/>
+                <w:b w:val="0"/>
+                <w:sz w:val="19"/>
+              </w:rPr>
+              <w:t>17.82 ± 0.86</w:t>
+            </w:r>
+          </w:p>
+        </w:tc>
+      </w:tr>
+      <w:tr>
+        <w:tc>
+          <w:tcPr>
+            <w:tcW w:type="dxa" w:w="1701"/>
+            <w:tcMar>
+              <w:top w:w="100" w:type="dxa"/>
+              <w:start w:w="120" w:type="dxa"/>
+              <w:bottom w:w="100" w:type="dxa"/>
+              <w:end w:w="120" w:type="dxa"/>
+            </w:tcMar>
+            <w:vAlign w:val="center"/>
+          </w:tcPr>
+          <w:p>
+            <w:pPr>
+              <w:spacing w:before="0" w:after="0" w:line="276" w:lineRule="auto"/>
+              <w:jc w:val="center"/>
+            </w:pPr>
+            <w:r>
+              <w:rPr>
+                <w:rFonts w:ascii="宋体" w:hAnsi="宋体" w:eastAsia="宋体"/>
+                <w:b w:val="0"/>
+                <w:sz w:val="19"/>
+              </w:rPr>
+              <w:t>0.80</w:t>
+            </w:r>
+          </w:p>
+        </w:tc>
+        <w:tc>
+          <w:tcPr>
+            <w:tcW w:type="dxa" w:w="2154"/>
+            <w:tcMar>
+              <w:top w:w="100" w:type="dxa"/>
+              <w:start w:w="120" w:type="dxa"/>
+              <w:bottom w:w="100" w:type="dxa"/>
+              <w:end w:w="120" w:type="dxa"/>
+            </w:tcMar>
+            <w:vAlign w:val="center"/>
+          </w:tcPr>
+          <w:p>
+            <w:pPr>
+              <w:spacing w:before="0" w:after="0" w:line="276" w:lineRule="auto"/>
+              <w:jc w:val="left"/>
+            </w:pPr>
+            <w:r>
+              <w:rPr>
+                <w:rFonts w:ascii="宋体" w:hAnsi="宋体" w:eastAsia="宋体"/>
+                <w:b w:val="0"/>
+                <w:sz w:val="19"/>
+              </w:rPr>
+              <w:t>934.3 ± 119.9</w:t>
+            </w:r>
+          </w:p>
+        </w:tc>
+        <w:tc>
+          <w:tcPr>
+            <w:tcW w:type="dxa" w:w="2041"/>
+            <w:tcMar>
+              <w:top w:w="100" w:type="dxa"/>
+              <w:start w:w="120" w:type="dxa"/>
+              <w:bottom w:w="100" w:type="dxa"/>
+              <w:end w:w="120" w:type="dxa"/>
+            </w:tcMar>
+            <w:vAlign w:val="center"/>
+          </w:tcPr>
+          <w:p>
+            <w:pPr>
+              <w:spacing w:before="0" w:after="0" w:line="276" w:lineRule="auto"/>
+              <w:jc w:val="left"/>
+            </w:pPr>
+            <w:r>
+              <w:rPr>
+                <w:rFonts w:ascii="宋体" w:hAnsi="宋体" w:eastAsia="宋体"/>
+                <w:b w:val="0"/>
+                <w:sz w:val="19"/>
+              </w:rPr>
+              <w:t>72.77 ± 9.34</w:t>
+            </w:r>
+          </w:p>
+        </w:tc>
+        <w:tc>
+          <w:tcPr>
+            <w:tcW w:type="dxa" w:w="2381"/>
+            <w:tcMar>
+              <w:top w:w="100" w:type="dxa"/>
+              <w:start w:w="120" w:type="dxa"/>
+              <w:bottom w:w="100" w:type="dxa"/>
+              <w:end w:w="120" w:type="dxa"/>
+            </w:tcMar>
+            <w:vAlign w:val="center"/>
+          </w:tcPr>
+          <w:p>
+            <w:pPr>
+              <w:spacing w:before="0" w:after="0" w:line="276" w:lineRule="auto"/>
+              <w:jc w:val="left"/>
+            </w:pPr>
+            <w:r>
+              <w:rPr>
+                <w:rFonts w:ascii="宋体" w:hAnsi="宋体" w:eastAsia="宋体"/>
+                <w:b w:val="0"/>
+                <w:sz w:val="19"/>
+              </w:rPr>
+              <w:t>15.51 ± 1.01</w:t>
+            </w:r>
+          </w:p>
+        </w:tc>
+      </w:tr>
+      <w:tr>
+        <w:tc>
+          <w:tcPr>
+            <w:tcW w:type="dxa" w:w="1701"/>
+            <w:tcMar>
+              <w:top w:w="100" w:type="dxa"/>
+              <w:start w:w="120" w:type="dxa"/>
+              <w:bottom w:w="100" w:type="dxa"/>
+              <w:end w:w="120" w:type="dxa"/>
+            </w:tcMar>
+            <w:vAlign w:val="center"/>
+          </w:tcPr>
+          <w:p>
+            <w:pPr>
+              <w:spacing w:before="0" w:after="0" w:line="276" w:lineRule="auto"/>
+              <w:jc w:val="center"/>
+            </w:pPr>
+            <w:r>
+              <w:rPr>
+                <w:rFonts w:ascii="宋体" w:hAnsi="宋体" w:eastAsia="宋体"/>
+                <w:b w:val="0"/>
+                <w:sz w:val="19"/>
+              </w:rPr>
+              <w:t>0.90</w:t>
+            </w:r>
+          </w:p>
+        </w:tc>
+        <w:tc>
+          <w:tcPr>
+            <w:tcW w:type="dxa" w:w="2154"/>
+            <w:tcMar>
+              <w:top w:w="100" w:type="dxa"/>
+              <w:start w:w="120" w:type="dxa"/>
+              <w:bottom w:w="100" w:type="dxa"/>
+              <w:end w:w="120" w:type="dxa"/>
+            </w:tcMar>
+            <w:vAlign w:val="center"/>
+          </w:tcPr>
+          <w:p>
+            <w:pPr>
+              <w:spacing w:before="0" w:after="0" w:line="276" w:lineRule="auto"/>
+              <w:jc w:val="left"/>
+            </w:pPr>
+            <w:r>
+              <w:rPr>
+                <w:rFonts w:ascii="宋体" w:hAnsi="宋体" w:eastAsia="宋体"/>
+                <w:b w:val="0"/>
+                <w:sz w:val="19"/>
+              </w:rPr>
+              <w:t>781.7 ± 144.1</w:t>
+            </w:r>
+          </w:p>
+        </w:tc>
+        <w:tc>
+          <w:tcPr>
+            <w:tcW w:type="dxa" w:w="2041"/>
+            <w:tcMar>
+              <w:top w:w="100" w:type="dxa"/>
+              <w:start w:w="120" w:type="dxa"/>
+              <w:bottom w:w="100" w:type="dxa"/>
+              <w:end w:w="120" w:type="dxa"/>
+            </w:tcMar>
+            <w:vAlign w:val="center"/>
+          </w:tcPr>
+          <w:p>
+            <w:pPr>
+              <w:spacing w:before="0" w:after="0" w:line="276" w:lineRule="auto"/>
+              <w:jc w:val="left"/>
+            </w:pPr>
+            <w:r>
+              <w:rPr>
+                <w:rFonts w:ascii="宋体" w:hAnsi="宋体" w:eastAsia="宋体"/>
+                <w:b w:val="0"/>
+                <w:sz w:val="19"/>
+              </w:rPr>
+              <w:t>60.88 ± 11.22</w:t>
+            </w:r>
+          </w:p>
+        </w:tc>
+        <w:tc>
+          <w:tcPr>
+            <w:tcW w:type="dxa" w:w="2381"/>
+            <w:tcMar>
+              <w:top w:w="100" w:type="dxa"/>
+              <w:start w:w="120" w:type="dxa"/>
+              <w:bottom w:w="100" w:type="dxa"/>
+              <w:end w:w="120" w:type="dxa"/>
+            </w:tcMar>
+            <w:vAlign w:val="center"/>
+          </w:tcPr>
+          <w:p>
+            <w:pPr>
+              <w:spacing w:before="0" w:after="0" w:line="276" w:lineRule="auto"/>
+              <w:jc w:val="left"/>
+            </w:pPr>
+            <w:r>
+              <w:rPr>
+                <w:rFonts w:ascii="宋体" w:hAnsi="宋体" w:eastAsia="宋体"/>
+                <w:b w:val="0"/>
+                <w:sz w:val="19"/>
+              </w:rPr>
+              <w:t>11.71 ± 1.99</w:t>
+            </w:r>
+          </w:p>
+        </w:tc>
+      </w:tr>
+      <w:tr>
+        <w:tc>
+          <w:tcPr>
+            <w:tcW w:type="dxa" w:w="1701"/>
+            <w:tcMar>
+              <w:top w:w="100" w:type="dxa"/>
+              <w:start w:w="120" w:type="dxa"/>
+              <w:bottom w:w="100" w:type="dxa"/>
+              <w:end w:w="120" w:type="dxa"/>
+            </w:tcMar>
+            <w:vAlign w:val="center"/>
+          </w:tcPr>
+          <w:p>
+            <w:pPr>
+              <w:spacing w:before="0" w:after="0" w:line="276" w:lineRule="auto"/>
+              <w:jc w:val="center"/>
+            </w:pPr>
+            <w:r>
+              <w:rPr>
+                <w:rFonts w:ascii="宋体" w:hAnsi="宋体" w:eastAsia="宋体"/>
+                <w:b w:val="0"/>
+                <w:sz w:val="19"/>
+              </w:rPr>
+              <w:t>0.95</w:t>
+            </w:r>
+          </w:p>
+        </w:tc>
+        <w:tc>
+          <w:tcPr>
+            <w:tcW w:type="dxa" w:w="2154"/>
+            <w:tcMar>
+              <w:top w:w="100" w:type="dxa"/>
+              <w:start w:w="120" w:type="dxa"/>
+              <w:bottom w:w="100" w:type="dxa"/>
+              <w:end w:w="120" w:type="dxa"/>
+            </w:tcMar>
+            <w:vAlign w:val="center"/>
+          </w:tcPr>
+          <w:p>
+            <w:pPr>
+              <w:spacing w:before="0" w:after="0" w:line="276" w:lineRule="auto"/>
+              <w:jc w:val="left"/>
+            </w:pPr>
+            <w:r>
+              <w:rPr>
+                <w:rFonts w:ascii="宋体" w:hAnsi="宋体" w:eastAsia="宋体"/>
+                <w:b w:val="0"/>
+                <w:sz w:val="19"/>
+              </w:rPr>
+              <w:t>662.7 ± 179.1</w:t>
+            </w:r>
+          </w:p>
+        </w:tc>
+        <w:tc>
+          <w:tcPr>
+            <w:tcW w:type="dxa" w:w="2041"/>
+            <w:tcMar>
+              <w:top w:w="100" w:type="dxa"/>
+              <w:start w:w="120" w:type="dxa"/>
+              <w:bottom w:w="100" w:type="dxa"/>
+              <w:end w:w="120" w:type="dxa"/>
+            </w:tcMar>
+            <w:vAlign w:val="center"/>
+          </w:tcPr>
+          <w:p>
+            <w:pPr>
+              <w:spacing w:before="0" w:after="0" w:line="276" w:lineRule="auto"/>
+              <w:jc w:val="left"/>
+            </w:pPr>
+            <w:r>
+              <w:rPr>
+                <w:rFonts w:ascii="宋体" w:hAnsi="宋体" w:eastAsia="宋体"/>
+                <w:b w:val="0"/>
+                <w:sz w:val="19"/>
+              </w:rPr>
+              <w:t>51.61 ± 13.95</w:t>
+            </w:r>
+          </w:p>
+        </w:tc>
+        <w:tc>
+          <w:tcPr>
+            <w:tcW w:type="dxa" w:w="2381"/>
+            <w:tcMar>
+              <w:top w:w="100" w:type="dxa"/>
+              <w:start w:w="120" w:type="dxa"/>
+              <w:bottom w:w="100" w:type="dxa"/>
+              <w:end w:w="120" w:type="dxa"/>
+            </w:tcMar>
+            <w:vAlign w:val="center"/>
+          </w:tcPr>
+          <w:p>
+            <w:pPr>
+              <w:spacing w:before="0" w:after="0" w:line="276" w:lineRule="auto"/>
+              <w:jc w:val="left"/>
+            </w:pPr>
+            <w:r>
+              <w:rPr>
+                <w:rFonts w:ascii="宋体" w:hAnsi="宋体" w:eastAsia="宋体"/>
+                <w:b w:val="0"/>
+                <w:sz w:val="19"/>
+              </w:rPr>
+              <w:t>9.92 ± 1.62</w:t>
+            </w:r>
+          </w:p>
+        </w:tc>
+      </w:tr>
+    </w:tbl>
+    <w:p>
+      <w:pPr>
+        <w:spacing w:after="60"/>
+      </w:pPr>
+    </w:p>
+    <w:p>
+      <w:pPr>
+        <w:spacing w:before="80" w:after="40" w:line="240" w:lineRule="auto"/>
+        <w:jc w:val="center"/>
+      </w:pPr>
+      <w:r>
+        <w:drawing>
+          <wp:inline xmlns:a="http://schemas.openxmlformats.org/drawingml/2006/main" xmlns:pic="http://schemas.openxmlformats.org/drawingml/2006/picture">
+            <wp:extent cx="5544000" cy="2217600"/>
+            <wp:docPr id="15" name="Picture 15"/>
+            <wp:cNvGraphicFramePr>
+              <a:graphicFrameLocks noChangeAspect="1"/>
+            </wp:cNvGraphicFramePr>
+            <a:graphic>
+              <a:graphicData uri="http://schemas.openxmlformats.org/drawingml/2006/picture">
+                <pic:pic>
+                  <pic:nvPicPr>
+                    <pic:cNvPr id="0" name="fig9_selective_recognition.png"/>
+                    <pic:cNvPicPr/>
+                  </pic:nvPicPr>
+                  <pic:blipFill>
+                    <a:blip r:embed="rId25"/>
+                    <a:stretch>
+                      <a:fillRect/>
+                    </a:stretch>
+                  </pic:blipFill>
+                  <pic:spPr>
+                    <a:xfrm>
+                      <a:off x="0" y="0"/>
+                      <a:ext cx="5544000" cy="2217600"/>
+                    </a:xfrm>
+                    <a:prstGeom prst="rect"/>
+                  </pic:spPr>
+                </pic:pic>
+              </a:graphicData>
+            </a:graphic>
+          </wp:inline>
+        </w:drawing>
+      </w:r>
+    </w:p>
+    <w:p>
+      <w:pPr>
+        <w:spacing w:before="80" w:after="160" w:line="276" w:lineRule="auto"/>
+        <w:jc w:val="center"/>
+      </w:pPr>
+      <w:r>
+        <w:rPr>
+          <w:rFonts w:ascii="宋体" w:hAnsi="宋体" w:eastAsia="宋体"/>
+          <w:b w:val="0"/>
+          <w:sz w:val="21"/>
+        </w:rPr>
+        <w:t>图 9 三随机种子在固定测试划分上的选择性识别覆盖率—风险关系</w:t>
+      </w:r>
+    </w:p>
+    <w:p>
+      <w:pPr>
+        <w:spacing w:before="0" w:after="100" w:line="360" w:lineRule="auto"/>
+        <w:ind w:firstLine="420"/>
+        <w:jc w:val="both"/>
+      </w:pPr>
+      <w:r>
+        <w:rPr>
+          <w:rFonts w:ascii="宋体" w:hAnsi="宋体" w:eastAsia="宋体"/>
+          <w:b w:val="0"/>
+          <w:sz w:val="24"/>
+        </w:rPr>
+        <w:t>阈值从 0.00 提高到 0.90 时，三随机种子的平均覆盖率由 100.00% 降至 60.88%，保留样本错误率由 24.58% 降至 11.71%。这体现了固定公开图像测试划分上的覆盖率—风险取舍：覆盖率越低，延后检查的样本越多。defer 仅表示建议送检、人工复核或后续传感确认；由于当前没有真实检查成本、动作代价和流程数据，不据此声称 XRF 成本最优、工业分选有效或统计显著。</w:t>
+      </w:r>
+    </w:p>
+    <w:p>
+      <w:pPr>
         <w:spacing w:before="320" w:after="160" w:line="288" w:lineRule="auto"/>
         <w:keepNext/>
       </w:pPr>
@@ -7382,6 +9627,21 @@
           <w:sz w:val="28"/>
         </w:rPr>
         <w:t>6.1 主要创新</w:t>
+      </w:r>
+    </w:p>
+    <w:p>
+      <w:pPr>
+        <w:spacing w:before="0" w:after="100" w:line="360" w:lineRule="auto"/>
+        <w:ind w:firstLine="420"/>
+        <w:jc w:val="both"/>
+      </w:pPr>
+      <w:r>
+        <w:rPr>
+          <w:rFonts w:ascii="宋体" w:hAnsi="宋体" w:eastAsia="宋体"/>
+          <w:b w:val="0"/>
+          <w:sz w:val="24"/>
+        </w:rPr>
+        <w:t>围绕理论感知分层识别主线，本阶段新增贡献严格限定为以下三项；数据整理、基线训练和组件消融作为可复现支撑材料，不扩展为工业效果声明。</w:t>
       </w:r>
     </w:p>
     <w:tbl>
@@ -7536,7 +9796,7 @@
                 <w:b w:val="0"/>
                 <w:sz w:val="20"/>
               </w:rPr>
-              <w:t>可追溯公开矿物图像数据构建流程</w:t>
+              <w:t>角色层可识别性的领域化形式化</w:t>
             </w:r>
           </w:p>
         </w:tc>
@@ -7562,7 +9822,7 @@
                 <w:b w:val="0"/>
                 <w:sz w:val="20"/>
               </w:rPr>
-              <w:t>保留矿物标签、图片编号、页面链接、原始文件名和筛选决策，形成可审计的数据来源链。</w:t>
+              <w:t>用固定种类—角色映射说明候选种类不唯一而角色仍可唯一确定的条件，并以受控候选集验证该逻辑条件。</w:t>
             </w:r>
           </w:p>
         </w:tc>
@@ -7616,7 +9876,7 @@
                 <w:b w:val="0"/>
                 <w:sz w:val="20"/>
               </w:rPr>
-              <w:t>面向分选风险的四分类任务设计</w:t>
+              <w:t>种类—角色一致性与困难负样本联合学习</w:t>
             </w:r>
           </w:p>
         </w:tc>
@@ -7642,7 +9902,7 @@
                 <w:b w:val="0"/>
                 <w:sz w:val="20"/>
               </w:rPr>
-              <w:t>将非目标样本拆分为含钛干扰、脉石/废石和金属光泽困难干扰，避免把所有石头简单归为同一负类。</w:t>
+              <w:t>在共享视觉特征上设置四个并列输出头，以 p_tilde_r=A p_s 和 KL(p_r || p_tilde_r)约束层级一致性，并保留两类预定义困难关系的表示约束。</w:t>
             </w:r>
           </w:p>
         </w:tc>
@@ -7696,7 +9956,7 @@
                 <w:b w:val="0"/>
                 <w:sz w:val="20"/>
               </w:rPr>
-              <w:t>强调数据质控与泄漏控制的实验协议</w:t>
+              <w:t>固定划分上的选择性识别评价</w:t>
             </w:r>
           </w:p>
         </w:tc>
@@ -7722,167 +9982,7 @@
                 <w:b w:val="0"/>
                 <w:sz w:val="20"/>
               </w:rPr>
-              <w:t>混合样本隔离、分层复核、重复/近重复审查、固定清单划分和三随机种子报告共同提高结果可信度。</w:t>
-            </w:r>
-          </w:p>
-        </w:tc>
-      </w:tr>
-      <w:tr>
-        <w:tc>
-          <w:tcPr>
-            <w:tcW w:type="dxa" w:w="567"/>
-            <w:tcMar>
-              <w:top w:w="100" w:type="dxa"/>
-              <w:start w:w="120" w:type="dxa"/>
-              <w:bottom w:w="100" w:type="dxa"/>
-              <w:end w:w="120" w:type="dxa"/>
-            </w:tcMar>
-            <w:vAlign w:val="center"/>
-          </w:tcPr>
-          <w:p>
-            <w:pPr>
-              <w:spacing w:before="0" w:after="0" w:line="276" w:lineRule="auto"/>
-              <w:jc w:val="center"/>
-            </w:pPr>
-            <w:r>
-              <w:rPr>
-                <w:rFonts w:ascii="宋体" w:hAnsi="宋体" w:eastAsia="宋体"/>
-                <w:b w:val="0"/>
-                <w:sz w:val="20"/>
-              </w:rPr>
-              <w:t>4</w:t>
-            </w:r>
-          </w:p>
-        </w:tc>
-        <w:tc>
-          <w:tcPr>
-            <w:tcW w:type="dxa" w:w="2835"/>
-            <w:tcMar>
-              <w:top w:w="100" w:type="dxa"/>
-              <w:start w:w="120" w:type="dxa"/>
-              <w:bottom w:w="100" w:type="dxa"/>
-              <w:end w:w="120" w:type="dxa"/>
-            </w:tcMar>
-            <w:vAlign w:val="center"/>
-          </w:tcPr>
-          <w:p>
-            <w:pPr>
-              <w:spacing w:before="0" w:after="0" w:line="276" w:lineRule="auto"/>
-              <w:jc w:val="left"/>
-            </w:pPr>
-            <w:r>
-              <w:rPr>
-                <w:rFonts w:ascii="宋体" w:hAnsi="宋体" w:eastAsia="宋体"/>
-                <w:b w:val="0"/>
-                <w:sz w:val="20"/>
-              </w:rPr>
-              <w:t>角色感知困难负样本学习原型</w:t>
-            </w:r>
-          </w:p>
-        </w:tc>
-        <w:tc>
-          <w:tcPr>
-            <w:tcW w:type="dxa" w:w="5556"/>
-            <w:tcMar>
-              <w:top w:w="100" w:type="dxa"/>
-              <w:start w:w="120" w:type="dxa"/>
-              <w:bottom w:w="100" w:type="dxa"/>
-              <w:end w:w="120" w:type="dxa"/>
-            </w:tcMar>
-            <w:vAlign w:val="center"/>
-          </w:tcPr>
-          <w:p>
-            <w:pPr>
-              <w:spacing w:before="0" w:after="0" w:line="276" w:lineRule="auto"/>
-              <w:jc w:val="left"/>
-            </w:pPr>
-            <w:r>
-              <w:rPr>
-                <w:rFonts w:ascii="宋体" w:hAnsi="宋体" w:eastAsia="宋体"/>
-                <w:b w:val="0"/>
-                <w:sz w:val="20"/>
-              </w:rPr>
-              <w:t>在四分类主任务外增加目标代理辅助任务，并仅对目标—含钛干扰、目标—金属光泽干扰施加表示约束，以风险指标验证其取舍。</w:t>
-            </w:r>
-          </w:p>
-        </w:tc>
-      </w:tr>
-      <w:tr>
-        <w:tc>
-          <w:tcPr>
-            <w:tcW w:type="dxa" w:w="567"/>
-            <w:tcMar>
-              <w:top w:w="100" w:type="dxa"/>
-              <w:start w:w="120" w:type="dxa"/>
-              <w:bottom w:w="100" w:type="dxa"/>
-              <w:end w:w="120" w:type="dxa"/>
-            </w:tcMar>
-            <w:vAlign w:val="center"/>
-          </w:tcPr>
-          <w:p>
-            <w:pPr>
-              <w:spacing w:before="0" w:after="0" w:line="276" w:lineRule="auto"/>
-              <w:jc w:val="center"/>
-            </w:pPr>
-            <w:r>
-              <w:rPr>
-                <w:rFonts w:ascii="宋体" w:hAnsi="宋体" w:eastAsia="宋体"/>
-                <w:b w:val="0"/>
-                <w:sz w:val="20"/>
-              </w:rPr>
-              <w:t>5</w:t>
-            </w:r>
-          </w:p>
-        </w:tc>
-        <w:tc>
-          <w:tcPr>
-            <w:tcW w:type="dxa" w:w="2835"/>
-            <w:tcMar>
-              <w:top w:w="100" w:type="dxa"/>
-              <w:start w:w="120" w:type="dxa"/>
-              <w:bottom w:w="100" w:type="dxa"/>
-              <w:end w:w="120" w:type="dxa"/>
-            </w:tcMar>
-            <w:vAlign w:val="center"/>
-          </w:tcPr>
-          <w:p>
-            <w:pPr>
-              <w:spacing w:before="0" w:after="0" w:line="276" w:lineRule="auto"/>
-              <w:jc w:val="left"/>
-            </w:pPr>
-            <w:r>
-              <w:rPr>
-                <w:rFonts w:ascii="宋体" w:hAnsi="宋体" w:eastAsia="宋体"/>
-                <w:b w:val="0"/>
-                <w:sz w:val="20"/>
-              </w:rPr>
-              <w:t>矿物种类—选矿角色分层一致性原型</w:t>
-            </w:r>
-          </w:p>
-        </w:tc>
-        <w:tc>
-          <w:tcPr>
-            <w:tcW w:type="dxa" w:w="5556"/>
-            <w:tcMar>
-              <w:top w:w="100" w:type="dxa"/>
-              <w:start w:w="120" w:type="dxa"/>
-              <w:bottom w:w="100" w:type="dxa"/>
-              <w:end w:w="120" w:type="dxa"/>
-            </w:tcMar>
-            <w:vAlign w:val="center"/>
-          </w:tcPr>
-          <w:p>
-            <w:pPr>
-              <w:spacing w:before="0" w:after="0" w:line="276" w:lineRule="auto"/>
-              <w:jc w:val="left"/>
-            </w:pPr>
-            <w:r>
-              <w:rPr>
-                <w:rFonts w:ascii="宋体" w:hAnsi="宋体" w:eastAsia="宋体"/>
-                <w:b w:val="0"/>
-                <w:sz w:val="20"/>
-              </w:rPr>
-              <w:t>利用已保留的 17 类种类标签与四类角色映射，在共享视觉表征上联合种类、角色和目标代理任务；并通过两项三随机种子组件消融，报告其总体分数与关键风险指标的可量化取舍。</w:t>
+              <w:t>从三个完整分层模型的测试预测中复现阈值—覆盖率—保留风险关系，将低置信度样本解释为延后检查而非已验证的处置决策。</w:t>
             </w:r>
           </w:p>
         </w:tc>
@@ -8489,7 +10589,7 @@
           <w:b w:val="0"/>
           <w:sz w:val="24"/>
         </w:rPr>
-        <w:t>第一，优先补充经过审核的钛磁铁矿样本，或采集少量由专家/化验确认的真实钒钛矿颗粒图像，用于建立外部测试集。第二，回填可获得的产地、摄影者、收藏机构或页面来源信息，构建按来源留出的严格泛化评价。第三，在已完成的一致性项和困难负样本项消融基础上，继续考察种类交叉熵、目标代理辅助头的影响，并在目标召回率达到预设下限时最小化含钛、金属光泽干扰误入目标率。第四，建立独立未知矿物图像集，开展最大 Softmax 概率、能量分数等开放集拒识评价。第五，结合 XRF、磁性或化验信息，形成 RGB 初筛与成分确认相结合的多模态工作流。</w:t>
+        <w:t>第一，采集由专家或化验确认的真实钒钛矿颗粒图像，建立独立外部测试集。第二，回填产地、摄影者、收藏机构或页面来源信息，构建严格的来源留出测试；上述外部验证和来源留出评价当前均未完成。第三，在已有组件消融基础上继续考察种类交叉熵和目标代理辅助头，并在专家给定的目标召回下限下研究风险运行点。第四，建立独立未知矿物图像集，比较最大 Softmax 概率、能量分数等开放集拒识方法。第五，仅在取得真实流程阶段、品位/回收率、动作代价和检查成本后，研究阶段条件化决策与真实成本矩阵；结合 XRF、磁性或化验信息的多模态确认也属于未来验证，不由当前选择性识别结果代替。</w:t>
       </w:r>
     </w:p>
     <w:tbl>
@@ -8711,7 +10811,49 @@
           <w:b w:val="0"/>
           <w:sz w:val="24"/>
         </w:rPr>
-        <w:t>当前结果证明公开矿物标本图像可支撑钒钛矿相关组分矿物的视觉识别基线研究，但不等同于工业现场分选、精矿品位预测或回收率验证。</w:t>
+        <w:t>角色可识别性命题得到受控逻辑条件验证：48 个角色一致候选集的角色唯一可识别率为 100.00%，51 个角色冲突候选集为 0.00%。该证据不使用视觉标签推断或模型预测。</w:t>
+      </w:r>
+    </w:p>
+    <w:p>
+      <w:pPr>
+        <w:spacing w:before="0" w:after="100" w:line="360" w:lineRule="auto"/>
+      </w:pPr>
+      <w:r>
+        <w:rPr>
+          <w:rFonts w:ascii="黑体" w:hAnsi="黑体" w:eastAsia="黑体"/>
+          <w:b/>
+          <w:sz w:val="24"/>
+        </w:rPr>
+        <w:t xml:space="preserve">8. </w:t>
+      </w:r>
+      <w:r>
+        <w:rPr>
+          <w:rFonts w:ascii="宋体" w:hAnsi="宋体" w:eastAsia="宋体"/>
+          <w:b w:val="0"/>
+          <w:sz w:val="24"/>
+        </w:rPr>
+        <w:t>固定测试划分上的选择性识别表明阈值提高会降低覆盖率并降低保留样本错误率；阈值 0.90 时平均覆盖率为 60.88%，保留样本错误率为 11.71%。这只是固定划分证据，不是检查成本或处置策略的最优性证明。</w:t>
+      </w:r>
+    </w:p>
+    <w:p>
+      <w:pPr>
+        <w:spacing w:before="0" w:after="100" w:line="360" w:lineRule="auto"/>
+      </w:pPr>
+      <w:r>
+        <w:rPr>
+          <w:rFonts w:ascii="黑体" w:hAnsi="黑体" w:eastAsia="黑体"/>
+          <w:b/>
+          <w:sz w:val="24"/>
+        </w:rPr>
+        <w:t xml:space="preserve">9. </w:t>
+      </w:r>
+      <w:r>
+        <w:rPr>
+          <w:rFonts w:ascii="宋体" w:hAnsi="宋体" w:eastAsia="宋体"/>
+          <w:b w:val="0"/>
+          <w:sz w:val="24"/>
+        </w:rPr>
+        <w:t>当前结果支持公开矿物标本图像上的理论形式化、受控逻辑验证与固定划分选择性识别评价，但不等同于工业现场分选、精矿品位/回收率、XRF 成本最优、外部验证或统计显著性结论。</w:t>
       </w:r>
     </w:p>
     <w:p>

</xml_diff>

<commit_message>
docs: trace theory validation provenance
</commit_message>
<xml_diff>
--- a/结题/基于深度学习的钒钛矿相关矿物图像识别方法研究_技术报告（初稿）.docx
+++ b/结题/基于深度学习的钒钛矿相关矿物图像识别方法研究_技术报告（初稿）.docx
@@ -10811,7 +10811,7 @@
           <w:b w:val="0"/>
           <w:sz w:val="24"/>
         </w:rPr>
-        <w:t>角色可识别性命题得到受控逻辑条件验证：48 个角色一致候选集的角色唯一可识别率为 100.00%，51 个角色冲突候选集为 0.00%。该证据不使用视觉标签推断或模型预测。</w:t>
+        <w:t>角色可识别性命题得到受控逻辑条件验证：48 个角色一致候选集的角色唯一可识别率为 100.00%，51 个角色冲突候选集为 0.00%。该证据不使用视觉标签推断或模型预测；可复现汇总见 outputs/theory_validation/role_identifiability/role_identifiability_summary.json，见§5.9。</w:t>
       </w:r>
     </w:p>
     <w:p>
@@ -10832,7 +10832,7 @@
           <w:b w:val="0"/>
           <w:sz w:val="24"/>
         </w:rPr>
-        <w:t>固定测试划分上的选择性识别表明阈值提高会降低覆盖率并降低保留样本错误率；阈值 0.90 时平均覆盖率为 60.88%，保留样本错误率为 11.71%。这只是固定划分证据，不是检查成本或处置策略的最优性证明。</w:t>
+        <w:t>固定测试划分上的选择性识别表明阈值提高会降低覆盖率并降低保留样本错误率；阈值 0.90 时平均覆盖率为 60.88%，保留样本错误率为 11.71%。这只是固定划分证据，不是检查成本或处置策略的最优性证明；可复现汇总见 outputs/theory_validation/selective_recognition/selective_recognition_summary.json，见图 9 和§5.10。</w:t>
       </w:r>
     </w:p>
     <w:p>
@@ -10853,7 +10853,7 @@
           <w:b w:val="0"/>
           <w:sz w:val="24"/>
         </w:rPr>
-        <w:t>当前结果支持公开矿物标本图像上的理论形式化、受控逻辑验证与固定划分选择性识别评价，但不等同于工业现场分选、精矿品位/回收率、XRF 成本最优、外部验证或统计显著性结论。</w:t>
+        <w:t>当前结果支持公开矿物标本图像上的理论形式化、受控逻辑验证与固定划分选择性识别评价，但不等同于工业现场分选、精矿品位/回收率、XRF 成本最优、外部验证或统计显著性结论。结论 7 的证据追溯至 outputs/theory_validation/role_identifiability/role_identifiability_summary.json（§5.9）；结论 8 的证据追溯至 outputs/theory_validation/selective_recognition/selective_recognition_summary.json 和 outputs/paper_figures_v1/fig9_selective_recognition.png（图 9、§5.10）。</w:t>
       </w:r>
     </w:p>
     <w:p>
@@ -11509,7 +11509,7 @@
           <w:b w:val="0"/>
           <w:sz w:val="24"/>
         </w:rPr>
-        <w:t>本项目保留数据清单、采集与筛选辅助脚本、数据质量审计记录、训练脚本、实验指标、混淆矩阵、逐图预测结果和图表源数据。正式复现时应以固定清单 dataset_split_manifest_v1_0.csv 为准，并保持图片编号分组、训练随机种子和评价指标定义一致。由于公开网页图片可能具有不同作者与许可，公开共享时应优先发布元数据、脚本、图表源数据和处理规则，而不应在未核实许可的情况下整体再分发原始图片。</w:t>
+        <w:t>本项目保留数据清单、采集与筛选辅助脚本、数据质量审计记录、训练脚本、实验指标、混淆矩阵、逐图预测结果和图表源数据。候选集受控逻辑条件验证的可复现汇总为 outputs/theory_validation/role_identifiability/role_identifiability_summary.json（§5.9）；固定测试划分选择性识别的可复现汇总为 outputs/theory_validation/selective_recognition/selective_recognition_summary.json，图表文件为 outputs/paper_figures_v1/fig9_selective_recognition.png（图 9、§5.10）。正式复现时应以固定清单 dataset_split_manifest_v1_0.csv 为准，并保持图片编号分组、训练随机种子和评价指标定义一致。由于公开网页图片可能具有不同作者与许可，公开共享时应优先发布元数据、脚本、图表源数据和处理规则，而不应在未核实许可的情况下整体再分发原始图片。</w:t>
       </w:r>
     </w:p>
     <w:p>

</xml_diff>